<commit_message>
Onboarding v1.2: apresentação e manual revistos, ISO/IEC 42001 e guias NIS2, ISO 27001 e ISO 42001
Rascunho à espera da verificação de factos.

Co-Authored-By: Claude Opus 5.5 <noreply@anthropic.com>
Claude-Session: https://claude.ai/code/session_011qfYtmLnj2mXUr5QojdZqn
</commit_message>
<xml_diff>
--- a/docs/onboarding/AnkoraOne-Manual-Onboarding.docx
+++ b/docs/onboarding/AnkoraOne-Manual-Onboarding.docx
@@ -103,7 +103,7 @@
           </w:p>
           <w:p>
             <w:pPr>
-              <w:spacing w:after="240" w:line="320"/>
+              <w:spacing w:after="240"/>
             </w:pPr>
             <w:r>
               <w:rPr>
@@ -128,7 +128,7 @@
                 <w:sz w:val="24"/>
                 <w:szCs w:val="24"/>
               </w:rPr>
-              <w:t xml:space="preserve">Para novos clientes que adotam o Regime Jurídico da Cibersegurança (NIS2) e a ISO/IEC 27001: criação da conta, navegação, uso diário e guia de cada referencial disponível na plataforma.</w:t>
+              <w:t xml:space="preserve">Para novos clientes que adotam o Regime Jurídico da Cibersegurança (NIS2), a ISO/IEC 27001 e a ISO/IEC 42001: criação da conta, navegação, uso diário e guia de cada referencial disponível na plataforma.</w:t>
             </w:r>
           </w:p>
           <w:p>
@@ -142,7 +142,7 @@
                 <w:sz w:val="20"/>
                 <w:szCs w:val="20"/>
               </w:rPr>
-              <w:t xml:space="preserve">Versão 1.1 · outubro de 2026</w:t>
+              <w:t xml:space="preserve">Versão 1.2 · outubro de 2026</w:t>
             </w:r>
           </w:p>
           <w:p>
@@ -366,7 +366,7 @@
         <w:rPr>
           <w:rFonts w:ascii="Calibri" w:cs="Calibri" w:eastAsia="Calibri" w:hAnsi="Calibri"/>
         </w:rPr>
-        <w:t xml:space="preserve">Guardar evidências e documentos de forma privada, com versões, validade e aprovação.</w:t>
+        <w:t xml:space="preserve">Guardar evidências e documentos de forma privada, com versões, validade e aprovação, no repositório que escolher.</w:t>
       </w:r>
     </w:p>
     <w:p>
@@ -382,7 +382,39 @@
         <w:rPr>
           <w:rFonts w:ascii="Calibri" w:cs="Calibri" w:eastAsia="Calibri" w:hAnsi="Calibri"/>
         </w:rPr>
-        <w:t xml:space="preserve">Medir a maturidade por referencial (NIS2, ISO/IEC 27001 e outros) e transformar as lacunas num plano de ação.</w:t>
+        <w:t xml:space="preserve">Carregar documentos que já tem e deixar a plataforma propor a que medida, tarefa ou controlo pertencem.</w:t>
+      </w:r>
+    </w:p>
+    <w:p>
+      <w:pPr>
+        <w:pStyle w:val="ListParagraph"/>
+        <w:numPr>
+          <w:ilvl w:val="0"/>
+          <w:numId w:val="2"/>
+        </w:numPr>
+        <w:spacing w:after="80" w:line="276"/>
+      </w:pPr>
+      <w:r>
+        <w:rPr>
+          <w:rFonts w:ascii="Calibri" w:cs="Calibri" w:eastAsia="Calibri" w:hAnsi="Calibri"/>
+        </w:rPr>
+        <w:t xml:space="preserve">Medir a maturidade por referencial (NIS2, ISO/IEC 27001, ISO/IEC 42001 e outros) e transformar as lacunas num plano de ação.</w:t>
+      </w:r>
+    </w:p>
+    <w:p>
+      <w:pPr>
+        <w:pStyle w:val="ListParagraph"/>
+        <w:numPr>
+          <w:ilvl w:val="0"/>
+          <w:numId w:val="2"/>
+        </w:numPr>
+        <w:spacing w:after="80" w:line="276"/>
+      </w:pPr>
+      <w:r>
+        <w:rPr>
+          <w:rFonts w:ascii="Calibri" w:cs="Calibri" w:eastAsia="Calibri" w:hAnsi="Calibri"/>
+        </w:rPr>
+        <w:t xml:space="preserve">Preparar a Declaração de Aplicabilidade e a análise de lacunas da ISO/IEC 27001 e da ISO/IEC 42001.</w:t>
       </w:r>
     </w:p>
     <w:p>
@@ -1432,7 +1464,7 @@
               <w:rPr>
                 <w:rFonts w:ascii="Calibri" w:cs="Calibri" w:eastAsia="Calibri" w:hAnsi="Calibri"/>
               </w:rPr>
-              <w:t xml:space="preserve">Referenciais a seguir (por exemplo NIS2 e ISO/IEC 27001)</w:t>
+              <w:t xml:space="preserve">Referenciais a seguir (por exemplo NIS2, ISO/IEC 27001 e, se a entidade desenvolve ou usa IA, ISO/IEC 42001)</w:t>
             </w:r>
           </w:p>
         </w:tc>
@@ -1461,6 +1493,67 @@
                 <w:rFonts w:ascii="Calibri" w:cs="Calibri" w:eastAsia="Calibri" w:hAnsi="Calibri"/>
               </w:rPr>
               <w:t xml:space="preserve">Referenciais permitidos e licença</w:t>
+            </w:r>
+          </w:p>
+        </w:tc>
+      </w:tr>
+      <w:tr>
+        <w:trPr>
+          <w:cantSplit/>
+        </w:trPr>
+        <w:tc>
+          <w:tcPr>
+            <w:tcW w:type="dxa" w:w="4565"/>
+            <w:tcBorders>
+              <w:top w:val="single" w:color="D9DEE7" w:sz="4"/>
+              <w:left w:val="single" w:color="D9DEE7" w:sz="4"/>
+              <w:bottom w:val="single" w:color="D9DEE7" w:sz="4"/>
+              <w:right w:val="single" w:color="D9DEE7" w:sz="4"/>
+            </w:tcBorders>
+            <w:tcMar>
+              <w:top w:type="dxa" w:w="80"/>
+              <w:left w:type="dxa" w:w="110"/>
+              <w:bottom w:type="dxa" w:w="80"/>
+              <w:right w:type="dxa" w:w="110"/>
+            </w:tcMar>
+          </w:tcPr>
+          <w:p>
+            <w:pPr>
+              <w:spacing w:after="40"/>
+            </w:pPr>
+            <w:r>
+              <w:rPr>
+                <w:rFonts w:ascii="Calibri" w:cs="Calibri" w:eastAsia="Calibri" w:hAnsi="Calibri"/>
+              </w:rPr>
+              <w:t xml:space="preserve">Se usa ou desenvolve sistemas de IA: lista dos sistemas e do papel da entidade em cada um (fornecedor, utilizador…)</w:t>
+            </w:r>
+          </w:p>
+        </w:tc>
+        <w:tc>
+          <w:tcPr>
+            <w:tcW w:type="dxa" w:w="5073"/>
+            <w:tcBorders>
+              <w:top w:val="single" w:color="D9DEE7" w:sz="4"/>
+              <w:left w:val="single" w:color="D9DEE7" w:sz="4"/>
+              <w:bottom w:val="single" w:color="D9DEE7" w:sz="4"/>
+              <w:right w:val="single" w:color="D9DEE7" w:sz="4"/>
+            </w:tcBorders>
+            <w:tcMar>
+              <w:top w:type="dxa" w:w="80"/>
+              <w:left w:type="dxa" w:w="110"/>
+              <w:bottom w:type="dxa" w:w="80"/>
+              <w:right w:type="dxa" w:w="110"/>
+            </w:tcMar>
+          </w:tcPr>
+          <w:p>
+            <w:pPr>
+              <w:spacing w:after="40"/>
+            </w:pPr>
+            <w:r>
+              <w:rPr>
+                <w:rFonts w:ascii="Calibri" w:cs="Calibri" w:eastAsia="Calibri" w:hAnsi="Calibri"/>
+              </w:rPr>
+              <w:t xml:space="preserve">Âmbito da ISO/IEC 42001</w:t>
             </w:r>
           </w:p>
         </w:tc>
@@ -2734,7 +2827,7 @@
         <w:rPr>
           <w:rFonts w:ascii="Calibri" w:cs="Calibri" w:eastAsia="Calibri" w:hAnsi="Calibri"/>
         </w:rPr>
-        <w:t xml:space="preserve">A licença define os módulos disponíveis, os referenciais e o número de utilizadores (mínimo de 5).</w:t>
+        <w:t xml:space="preserve">A licença define os módulos disponíveis, os referenciais (NIS2, QNRCS, ISO/IEC 27001, ISO/IEC 42001, DORA e outros) e o número de utilizadores (mínimo de 5).</w:t>
       </w:r>
     </w:p>
     <w:tbl>
@@ -3381,6 +3474,31 @@
         </w:tc>
       </w:tr>
     </w:tbl>
+    <w:p>
+      <w:pPr>
+        <w:spacing w:after="120" w:line="288"/>
+      </w:pPr>
+      <w:r>
+        <w:rPr>
+          <w:rFonts w:ascii="Calibri" w:cs="Calibri" w:eastAsia="Calibri" w:hAnsi="Calibri"/>
+        </w:rPr>
+        <w:t xml:space="preserve">Na ficha do cliente escolhe-se também a </w:t>
+      </w:r>
+      <w:r>
+        <w:rPr>
+          <w:rFonts w:ascii="Calibri" w:cs="Calibri" w:eastAsia="Calibri" w:hAnsi="Calibri"/>
+          <w:b/>
+          <w:bCs/>
+        </w:rPr>
+        <w:t xml:space="preserve">localização</w:t>
+      </w:r>
+      <w:r>
+        <w:rPr>
+          <w:rFonts w:ascii="Calibri" w:cs="Calibri" w:eastAsia="Calibri" w:hAnsi="Calibri"/>
+        </w:rPr>
+        <w:t xml:space="preserve"> (por omissão, AnkoraOne/&lt;nome da entidade&gt;). Dentro dela, a plataforma usa sempre as mesmas 13 pastas, de «00 Por classificar» a «99 Outros», para que a estrutura seja igual em todos os clientes. Mudar de repositório ou de localização só afeta os ficheiros novos.</w:t>
+      </w:r>
+    </w:p>
     <w:p>
       <w:pPr>
         <w:pStyle w:val="Heading1"/>
@@ -3898,7 +4016,7 @@
               <w:rPr>
                 <w:rFonts w:ascii="Calibri" w:cs="Calibri" w:eastAsia="Calibri" w:hAnsi="Calibri"/>
               </w:rPr>
-              <w:t xml:space="preserve">Documentos · Auditoria de Documentos · Cadeia de Abastecimento · Fornecedores</w:t>
+              <w:t xml:space="preserve">Documentos · Repositório documental · Auditoria de Documentos · Cadeia de Abastecimento · Fornecedores</w:t>
             </w:r>
           </w:p>
         </w:tc>
@@ -3926,7 +4044,7 @@
               <w:rPr>
                 <w:rFonts w:ascii="Calibri" w:cs="Calibri" w:eastAsia="Calibri" w:hAnsi="Calibri"/>
               </w:rPr>
-              <w:t xml:space="preserve">Políticas aprovadas e relação com terceiros</w:t>
+              <w:t xml:space="preserve">Políticas aprovadas, todos os ficheiros num sítio e relação com terceiros</w:t>
             </w:r>
           </w:p>
         </w:tc>
@@ -5733,7 +5851,7 @@
         <w:rPr>
           <w:rFonts w:ascii="Calibri" w:cs="Calibri" w:eastAsia="Calibri" w:hAnsi="Calibri"/>
         </w:rPr>
-        <w:t xml:space="preserve">5.5 Avaliações de maturidade</w:t>
+        <w:t xml:space="preserve">5.5 Repositório documental e documentos por classificar</w:t>
       </w:r>
     </w:p>
     <w:p>
@@ -5743,8 +5861,264 @@
       <w:r>
         <w:rPr>
           <w:rFonts w:ascii="Calibri" w:cs="Calibri" w:eastAsia="Calibri" w:hAnsi="Calibri"/>
-        </w:rPr>
-        <w:t xml:space="preserve">O consultor cria a avaliação com os referenciais escolhidos (por exemplo NIS2 e ISO/IEC 27001). A equipa responde a cada pergunta com a escala:</w:t>
+          <w:b/>
+          <w:bCs/>
+        </w:rPr>
+        <w:t xml:space="preserve">Governar › Repositório documental</w:t>
+      </w:r>
+      <w:r>
+        <w:rPr>
+          <w:rFonts w:ascii="Calibri" w:cs="Calibri" w:eastAsia="Calibri" w:hAnsi="Calibri"/>
+        </w:rPr>
+        <w:t xml:space="preserve"> mostra todos os ficheiros do cliente (evidências, documentos, relatórios) arrumados pelas 13 pastas, abertos sempre pela plataforma e com registo de cada abertura.</w:t>
+      </w:r>
+    </w:p>
+    <w:p>
+      <w:pPr>
+        <w:spacing w:after="120" w:line="288"/>
+      </w:pPr>
+      <w:r>
+        <w:rPr>
+          <w:rFonts w:ascii="Calibri" w:cs="Calibri" w:eastAsia="Calibri" w:hAnsi="Calibri"/>
+        </w:rPr>
+        <w:t xml:space="preserve">Na área </w:t>
+      </w:r>
+      <w:r>
+        <w:rPr>
+          <w:rFonts w:ascii="Calibri" w:cs="Calibri" w:eastAsia="Calibri" w:hAnsi="Calibri"/>
+          <w:b/>
+          <w:bCs/>
+        </w:rPr>
+        <w:t xml:space="preserve">Por classificar</w:t>
+      </w:r>
+      <w:r>
+        <w:rPr>
+          <w:rFonts w:ascii="Calibri" w:cs="Calibri" w:eastAsia="Calibri" w:hAnsi="Calibri"/>
+        </w:rPr>
+        <w:t xml:space="preserve"> (administradores) pode carregar documentos que já existem na organização, ou pô-los diretamente na pasta «00 Por classificar» do Google Drive, OneDrive ou NAS e carregar em </w:t>
+      </w:r>
+      <w:r>
+        <w:rPr>
+          <w:rFonts w:ascii="Calibri" w:cs="Calibri" w:eastAsia="Calibri" w:hAnsi="Calibri"/>
+          <w:b/>
+          <w:bCs/>
+        </w:rPr>
+        <w:t xml:space="preserve">Procurar na pasta</w:t>
+      </w:r>
+      <w:r>
+        <w:rPr>
+          <w:rFonts w:ascii="Calibri" w:cs="Calibri" w:eastAsia="Calibri" w:hAnsi="Calibri"/>
+        </w:rPr>
+        <w:t xml:space="preserve">. Depois:</w:t>
+      </w:r>
+    </w:p>
+    <w:p>
+      <w:pPr>
+        <w:pStyle w:val="ListParagraph"/>
+        <w:numPr>
+          <w:ilvl w:val="0"/>
+          <w:numId w:val="4"/>
+        </w:numPr>
+        <w:spacing w:after="80" w:line="276"/>
+      </w:pPr>
+      <w:r>
+        <w:rPr>
+          <w:rFonts w:ascii="Calibri" w:cs="Calibri" w:eastAsia="Calibri" w:hAnsi="Calibri"/>
+        </w:rPr>
+        <w:t xml:space="preserve">A plataforma pré-seleciona, sem IA, as medidas, tarefas da jornada e controlos ISO com texto parecido.</w:t>
+      </w:r>
+    </w:p>
+    <w:p>
+      <w:pPr>
+        <w:pStyle w:val="ListParagraph"/>
+        <w:numPr>
+          <w:ilvl w:val="0"/>
+          <w:numId w:val="4"/>
+        </w:numPr>
+        <w:spacing w:after="80" w:line="276"/>
+      </w:pPr>
+      <w:r>
+        <w:rPr>
+          <w:rFonts w:ascii="Calibri" w:cs="Calibri" w:eastAsia="Calibri" w:hAnsi="Calibri"/>
+        </w:rPr>
+        <w:t xml:space="preserve">Com o assistente de IA, </w:t>
+      </w:r>
+      <w:r>
+        <w:rPr>
+          <w:rFonts w:ascii="Calibri" w:cs="Calibri" w:eastAsia="Calibri" w:hAnsi="Calibri"/>
+          <w:b/>
+          <w:bCs/>
+        </w:rPr>
+        <w:t xml:space="preserve">Classificar</w:t>
+      </w:r>
+      <w:r>
+        <w:rPr>
+          <w:rFonts w:ascii="Calibri" w:cs="Calibri" w:eastAsia="Calibri" w:hAnsi="Calibri"/>
+        </w:rPr>
+        <w:t xml:space="preserve"> (ou </w:t>
+      </w:r>
+      <w:r>
+        <w:rPr>
+          <w:rFonts w:ascii="Calibri" w:cs="Calibri" w:eastAsia="Calibri" w:hAnsi="Calibri"/>
+          <w:b/>
+          <w:bCs/>
+        </w:rPr>
+        <w:t xml:space="preserve">Classificar todos</w:t>
+      </w:r>
+      <w:r>
+        <w:rPr>
+          <w:rFonts w:ascii="Calibri" w:cs="Calibri" w:eastAsia="Calibri" w:hAnsi="Calibri"/>
+        </w:rPr>
+        <w:t xml:space="preserve">, até 25 de cada vez) propõe o tipo de documento e até 8 ligações, cada uma com um excerto do documento que a justifica e uma confiança.</w:t>
+      </w:r>
+    </w:p>
+    <w:p>
+      <w:pPr>
+        <w:pStyle w:val="ListParagraph"/>
+        <w:numPr>
+          <w:ilvl w:val="0"/>
+          <w:numId w:val="4"/>
+        </w:numPr>
+        <w:spacing w:after="80" w:line="276"/>
+      </w:pPr>
+      <w:r>
+        <w:rPr>
+          <w:rFonts w:ascii="Calibri" w:cs="Calibri" w:eastAsia="Calibri" w:hAnsi="Calibri"/>
+        </w:rPr>
+        <w:t xml:space="preserve">Uma pessoa revê, marca as ligações certas e indexa. O documento passa a evidência </w:t>
+      </w:r>
+      <w:r>
+        <w:rPr>
+          <w:rFonts w:ascii="Calibri" w:cs="Calibri" w:eastAsia="Calibri" w:hAnsi="Calibri"/>
+          <w:b/>
+          <w:bCs/>
+        </w:rPr>
+        <w:t xml:space="preserve">Por rever</w:t>
+      </w:r>
+      <w:r>
+        <w:rPr>
+          <w:rFonts w:ascii="Calibri" w:cs="Calibri" w:eastAsia="Calibri" w:hAnsi="Calibri"/>
+        </w:rPr>
+        <w:t xml:space="preserve">; nenhuma medida ou tarefa muda de estado sozinha.</w:t>
+      </w:r>
+    </w:p>
+    <w:p>
+      <w:pPr>
+        <w:spacing w:after="120" w:line="288"/>
+      </w:pPr>
+      <w:r>
+        <w:rPr>
+          <w:rFonts w:ascii="Calibri" w:cs="Calibri" w:eastAsia="Calibri" w:hAnsi="Calibri"/>
+        </w:rPr>
+        <w:t xml:space="preserve">O painel </w:t>
+      </w:r>
+      <w:r>
+        <w:rPr>
+          <w:rFonts w:ascii="Calibri" w:cs="Calibri" w:eastAsia="Calibri" w:hAnsi="Calibri"/>
+          <w:b/>
+          <w:bCs/>
+        </w:rPr>
+        <w:t xml:space="preserve">Qualidade das propostas</w:t>
+      </w:r>
+      <w:r>
+        <w:rPr>
+          <w:rFonts w:ascii="Calibri" w:cs="Calibri" w:eastAsia="Calibri" w:hAnsi="Calibri"/>
+        </w:rPr>
+        <w:t xml:space="preserve"> mostra quantas ligações propostas as pessoas mantêm, por nível de confiança, para saber até que ponto pode confiar nas propostas.</w:t>
+      </w:r>
+    </w:p>
+    <w:tbl>
+      <w:tblPr>
+        <w:tblW w:type="dxa" w:w="9638"/>
+        <w:tblBorders>
+          <w:top w:val="single" w:color="auto" w:sz="4"/>
+          <w:left w:val="single" w:color="auto" w:sz="4"/>
+          <w:bottom w:val="single" w:color="auto" w:sz="4"/>
+          <w:right w:val="single" w:color="auto" w:sz="4"/>
+          <w:insideH w:val="single" w:color="auto" w:sz="4"/>
+          <w:insideV w:val="single" w:color="auto" w:sz="4"/>
+        </w:tblBorders>
+      </w:tblPr>
+      <w:tblGrid>
+        <w:gridCol w:w="9638"/>
+      </w:tblGrid>
+      <w:tr>
+        <w:tc>
+          <w:tcPr>
+            <w:tcW w:type="dxa" w:w="9638"/>
+            <w:tcBorders>
+              <w:top w:val="single" w:color="F4F1EA" w:sz="4"/>
+              <w:left w:val="single" w:color="F4F1EA" w:sz="4"/>
+              <w:bottom w:val="single" w:color="F4F1EA" w:sz="4"/>
+              <w:right w:val="single" w:color="F4F1EA" w:sz="4"/>
+            </w:tcBorders>
+            <w:shd w:fill="F4F1EA" w:color="auto" w:val="clear"/>
+            <w:tcMar>
+              <w:top w:type="dxa" w:w="140"/>
+              <w:left w:type="dxa" w:w="200"/>
+              <w:bottom w:type="dxa" w:w="140"/>
+              <w:right w:type="dxa" w:w="200"/>
+            </w:tcMar>
+          </w:tcPr>
+          <w:p>
+            <w:pPr>
+              <w:spacing w:after="80"/>
+            </w:pPr>
+            <w:r>
+              <w:rPr>
+                <w:rFonts w:ascii="Calibri" w:cs="Calibri" w:eastAsia="Calibri" w:hAnsi="Calibri"/>
+                <w:b/>
+                <w:bCs/>
+                <w:color w:val="8A6620"/>
+              </w:rPr>
+              <w:t xml:space="preserve">Limites</w:t>
+            </w:r>
+          </w:p>
+          <w:p>
+            <w:pPr>
+              <w:spacing w:after="60" w:line="276"/>
+            </w:pPr>
+            <w:r>
+              <w:rPr>
+                <w:rFonts w:ascii="Calibri" w:cs="Calibri" w:eastAsia="Calibri" w:hAnsi="Calibri"/>
+              </w:rPr>
+              <w:t xml:space="preserve">PDF e imagens seguem para o modelo como ficheiro; DOCX, XLSX, PPTX e texto seguem como texto extraído. Formatos antigos (.doc, .xls, .ppt) não são lidos.</w:t>
+            </w:r>
+          </w:p>
+          <w:p>
+            <w:pPr>
+              <w:spacing w:after="60" w:line="276"/>
+            </w:pPr>
+            <w:r>
+              <w:rPr>
+                <w:rFonts w:ascii="Calibri" w:cs="Calibri" w:eastAsia="Calibri" w:hAnsi="Calibri"/>
+              </w:rPr>
+              <w:t xml:space="preserve">Documentos com endereços de ativos expostos à Internet (lista do art. 32.º) nunca seguem para a IA.</w:t>
+            </w:r>
+          </w:p>
+        </w:tc>
+      </w:tr>
+    </w:tbl>
+    <w:p>
+      <w:pPr>
+        <w:pStyle w:val="Heading2"/>
+      </w:pPr>
+      <w:r>
+        <w:rPr>
+          <w:rFonts w:ascii="Calibri" w:cs="Calibri" w:eastAsia="Calibri" w:hAnsi="Calibri"/>
+        </w:rPr>
+        <w:t xml:space="preserve">5.6 Avaliações de maturidade</w:t>
+      </w:r>
+    </w:p>
+    <w:p>
+      <w:pPr>
+        <w:spacing w:after="120" w:line="288"/>
+      </w:pPr>
+      <w:r>
+        <w:rPr>
+          <w:rFonts w:ascii="Calibri" w:cs="Calibri" w:eastAsia="Calibri" w:hAnsi="Calibri"/>
+        </w:rPr>
+        <w:t xml:space="preserve">O consultor cria a avaliação com os referenciais escolhidos (por exemplo NIS2, ISO/IEC 27001 e ISO/IEC 42001). A equipa responde a cada pergunta com a escala:</w:t>
       </w:r>
     </w:p>
     <w:tbl>
@@ -6236,7 +6610,7 @@
         <w:rPr>
           <w:rFonts w:ascii="Calibri" w:cs="Calibri" w:eastAsia="Calibri" w:hAnsi="Calibri"/>
         </w:rPr>
-        <w:t xml:space="preserve">5.6 Riscos, incidentes e vulnerabilidades</w:t>
+        <w:t xml:space="preserve">5.7 Riscos, incidentes e vulnerabilidades</w:t>
       </w:r>
     </w:p>
     <w:p>
@@ -6319,7 +6693,7 @@
         <w:rPr>
           <w:rFonts w:ascii="Calibri" w:cs="Calibri" w:eastAsia="Calibri" w:hAnsi="Calibri"/>
         </w:rPr>
-        <w:t xml:space="preserve">5.7 Fornecedores e cadeia de abastecimento</w:t>
+        <w:t xml:space="preserve">5.8 Fornecedores e cadeia de abastecimento</w:t>
       </w:r>
     </w:p>
     <w:p>
@@ -6341,7 +6715,7 @@
         <w:rPr>
           <w:rFonts w:ascii="Calibri" w:cs="Calibri" w:eastAsia="Calibri" w:hAnsi="Calibri"/>
         </w:rPr>
-        <w:t xml:space="preserve">5.8 Ativos e lista do art. 32.º</w:t>
+        <w:t xml:space="preserve">5.9 Ativos e lista do art. 32.º</w:t>
       </w:r>
     </w:p>
     <w:p>
@@ -6391,7 +6765,7 @@
         <w:rPr>
           <w:rFonts w:ascii="Calibri" w:cs="Calibri" w:eastAsia="Calibri" w:hAnsi="Calibri"/>
         </w:rPr>
-        <w:t xml:space="preserve">5.9 Relatórios</w:t>
+        <w:t xml:space="preserve">5.10 Relatórios</w:t>
       </w:r>
     </w:p>
     <w:p>
@@ -6427,7 +6801,7 @@
         <w:rPr>
           <w:rFonts w:ascii="Calibri" w:cs="Calibri" w:eastAsia="Calibri" w:hAnsi="Calibri"/>
         </w:rPr>
-        <w:t xml:space="preserve">5.10 Assistente de IA</w:t>
+        <w:t xml:space="preserve">5.11 Assistente de IA</w:t>
       </w:r>
     </w:p>
     <w:p>
@@ -6502,7 +6876,23 @@
         <w:rPr>
           <w:rFonts w:ascii="Calibri" w:cs="Calibri" w:eastAsia="Calibri" w:hAnsi="Calibri"/>
         </w:rPr>
-        <w:t xml:space="preserve">questionários a fornecedores, leitura de respostas por email e recomendações de melhoria.</w:t>
+        <w:t xml:space="preserve">questionários a fornecedores, leitura de respostas por email e recomendações de melhoria;</w:t>
+      </w:r>
+    </w:p>
+    <w:p>
+      <w:pPr>
+        <w:pStyle w:val="ListParagraph"/>
+        <w:numPr>
+          <w:ilvl w:val="0"/>
+          <w:numId w:val="2"/>
+        </w:numPr>
+        <w:spacing w:after="80" w:line="276"/>
+      </w:pPr>
+      <w:r>
+        <w:rPr>
+          <w:rFonts w:ascii="Calibri" w:cs="Calibri" w:eastAsia="Calibri" w:hAnsi="Calibri"/>
+        </w:rPr>
+        <w:t xml:space="preserve">classificação de documentos carregados em «Por classificar».</w:t>
       </w:r>
     </w:p>
     <w:tbl>
@@ -6607,7 +6997,7 @@
               <w:rPr>
                 <w:rFonts w:ascii="Calibri" w:cs="Calibri" w:eastAsia="Calibri" w:hAnsi="Calibri"/>
               </w:rPr>
-              <w:t xml:space="preserve">Cada pedido fica no registo de auditoria e conta para a quota mensal.</w:t>
+              <w:t xml:space="preserve">Cada pedido fica no registo de auditoria e conta para a quota mensal; há um limite de 30 pedidos por minuto por utilizador.</w:t>
             </w:r>
           </w:p>
         </w:tc>
@@ -6633,7 +7023,21 @@
         <w:rPr>
           <w:rFonts w:ascii="Calibri" w:cs="Calibri" w:eastAsia="Calibri" w:hAnsi="Calibri"/>
         </w:rPr>
-        <w:t xml:space="preserve">A plataforma inclui os referenciais abaixo. Cada cliente usa os que estiverem na sua licença. As correspondências entre referenciais permitem reaproveitar a mesma evidência em vários.</w:t>
+        <w:t xml:space="preserve">A plataforma inclui os referenciais abaixo. Cada cliente usa os que estiverem na sua licença. As correspondências entre referenciais permitem reaproveitar a mesma evidência em vários. Para a NIS2, a ISO/IEC 27001 e a ISO/IEC 42001 há também um </w:t>
+      </w:r>
+      <w:r>
+        <w:rPr>
+          <w:rFonts w:ascii="Calibri" w:cs="Calibri" w:eastAsia="Calibri" w:hAnsi="Calibri"/>
+          <w:b/>
+          <w:bCs/>
+        </w:rPr>
+        <w:t xml:space="preserve">guia de implementação próprio</w:t>
+      </w:r>
+      <w:r>
+        <w:rPr>
+          <w:rFonts w:ascii="Calibri" w:cs="Calibri" w:eastAsia="Calibri" w:hAnsi="Calibri"/>
+        </w:rPr>
+        <w:t xml:space="preserve">, entregue com este manual.</w:t>
       </w:r>
     </w:p>
     <w:tbl>
@@ -7111,7 +7515,7 @@
               <w:rPr>
                 <w:rFonts w:ascii="Calibri" w:cs="Calibri" w:eastAsia="Calibri" w:hAnsi="Calibri"/>
               </w:rPr>
-              <w:t xml:space="preserve">Guia com as cláusulas 4 a 10 e os 93 controlos do Anexo A, Declaração de Aplicabilidade e ligações ao QNRCS</w:t>
+              <w:t xml:space="preserve">Guia com as cláusulas 4 a 10 e os 93 controlos do Anexo A, Declaração de Aplicabilidade, análise de lacunas e ligações ao QNRCS</w:t>
             </w:r>
           </w:p>
         </w:tc>
@@ -7144,7 +7548,7 @@
               <w:rPr>
                 <w:rFonts w:ascii="Calibri" w:cs="Calibri" w:eastAsia="Calibri" w:hAnsi="Calibri"/>
               </w:rPr>
-              <w:t xml:space="preserve">DORA</w:t>
+              <w:t xml:space="preserve">ISO/IEC 42001:2023</w:t>
             </w:r>
           </w:p>
         </w:tc>
@@ -7172,7 +7576,7 @@
               <w:rPr>
                 <w:rFonts w:ascii="Calibri" w:cs="Calibri" w:eastAsia="Calibri" w:hAnsi="Calibri"/>
               </w:rPr>
-              <w:t xml:space="preserve">Reg. (UE) 2022/2554 e atos delegados</w:t>
+              <w:t xml:space="preserve">Norma ISO (não reproduzida)</w:t>
             </w:r>
           </w:p>
         </w:tc>
@@ -7200,7 +7604,7 @@
               <w:rPr>
                 <w:rFonts w:ascii="Calibri" w:cs="Calibri" w:eastAsia="Calibri" w:hAnsi="Calibri"/>
               </w:rPr>
-              <w:t xml:space="preserve">111 obrigações e prazos de incidentes</w:t>
+              <w:t xml:space="preserve">Guia do sistema de gestão da IA: cláusulas 4 a 10, 38 controlos do Anexo A, objetivos e fontes de risco, ligações à ISO/IEC 27001</w:t>
             </w:r>
           </w:p>
         </w:tc>
@@ -7233,7 +7637,7 @@
               <w:rPr>
                 <w:rFonts w:ascii="Calibri" w:cs="Calibri" w:eastAsia="Calibri" w:hAnsi="Calibri"/>
               </w:rPr>
-              <w:t xml:space="preserve">TISAX</w:t>
+              <w:t xml:space="preserve">DORA</w:t>
             </w:r>
           </w:p>
         </w:tc>
@@ -7261,7 +7665,7 @@
               <w:rPr>
                 <w:rFonts w:ascii="Calibri" w:cs="Calibri" w:eastAsia="Calibri" w:hAnsi="Calibri"/>
               </w:rPr>
-              <w:t xml:space="preserve">VDA ISA 6.0.3 e 2027.1</w:t>
+              <w:t xml:space="preserve">Reg. (UE) 2022/2554 e atos delegados</w:t>
             </w:r>
           </w:p>
         </w:tc>
@@ -7289,7 +7693,7 @@
               <w:rPr>
                 <w:rFonts w:ascii="Calibri" w:cs="Calibri" w:eastAsia="Calibri" w:hAnsi="Calibri"/>
               </w:rPr>
-              <w:t xml:space="preserve">80 e 78 controlos, maturidade 0 a 5</w:t>
+              <w:t xml:space="preserve">111 obrigações e prazos de incidentes</w:t>
             </w:r>
           </w:p>
         </w:tc>
@@ -7322,7 +7726,7 @@
               <w:rPr>
                 <w:rFonts w:ascii="Calibri" w:cs="Calibri" w:eastAsia="Calibri" w:hAnsi="Calibri"/>
               </w:rPr>
-              <w:t xml:space="preserve">CIS Controls v8.1</w:t>
+              <w:t xml:space="preserve">TISAX</w:t>
             </w:r>
           </w:p>
         </w:tc>
@@ -7350,7 +7754,7 @@
               <w:rPr>
                 <w:rFonts w:ascii="Calibri" w:cs="Calibri" w:eastAsia="Calibri" w:hAnsi="Calibri"/>
               </w:rPr>
-              <w:t xml:space="preserve">CIS</w:t>
+              <w:t xml:space="preserve">VDA ISA 6.0.3 e 2027.1</w:t>
             </w:r>
           </w:p>
         </w:tc>
@@ -7378,7 +7782,7 @@
               <w:rPr>
                 <w:rFonts w:ascii="Calibri" w:cs="Calibri" w:eastAsia="Calibri" w:hAnsi="Calibri"/>
               </w:rPr>
-              <w:t xml:space="preserve">Identificadores (18 controlos, 153 salvaguardas); o texto entra se a entidade importar o ficheiro oficial</w:t>
+              <w:t xml:space="preserve">80 e 78 controlos, maturidade 0 a 5</w:t>
             </w:r>
           </w:p>
         </w:tc>
@@ -7411,7 +7815,7 @@
               <w:rPr>
                 <w:rFonts w:ascii="Calibri" w:cs="Calibri" w:eastAsia="Calibri" w:hAnsi="Calibri"/>
               </w:rPr>
-              <w:t xml:space="preserve">NIST CSF 2.0</w:t>
+              <w:t xml:space="preserve">CIS Controls v8.1</w:t>
             </w:r>
           </w:p>
         </w:tc>
@@ -7439,7 +7843,7 @@
               <w:rPr>
                 <w:rFonts w:ascii="Calibri" w:cs="Calibri" w:eastAsia="Calibri" w:hAnsi="Calibri"/>
               </w:rPr>
-              <w:t xml:space="preserve">NIST</w:t>
+              <w:t xml:space="preserve">CIS</w:t>
             </w:r>
           </w:p>
         </w:tc>
@@ -7467,7 +7871,7 @@
               <w:rPr>
                 <w:rFonts w:ascii="Calibri" w:cs="Calibri" w:eastAsia="Calibri" w:hAnsi="Calibri"/>
               </w:rPr>
-              <w:t xml:space="preserve">Correspondências a partir das referências oficiais do QNRCS</w:t>
+              <w:t xml:space="preserve">Identificadores (18 controlos, 153 salvaguardas); o texto entra se a entidade importar o ficheiro oficial</w:t>
             </w:r>
           </w:p>
         </w:tc>
@@ -7500,6 +7904,95 @@
               <w:rPr>
                 <w:rFonts w:ascii="Calibri" w:cs="Calibri" w:eastAsia="Calibri" w:hAnsi="Calibri"/>
               </w:rPr>
+              <w:t xml:space="preserve">NIST CSF 2.0</w:t>
+            </w:r>
+          </w:p>
+        </w:tc>
+        <w:tc>
+          <w:tcPr>
+            <w:tcW w:type="dxa" w:w="2891"/>
+            <w:tcBorders>
+              <w:top w:val="single" w:color="D9DEE7" w:sz="4"/>
+              <w:left w:val="single" w:color="D9DEE7" w:sz="4"/>
+              <w:bottom w:val="single" w:color="D9DEE7" w:sz="4"/>
+              <w:right w:val="single" w:color="D9DEE7" w:sz="4"/>
+            </w:tcBorders>
+            <w:tcMar>
+              <w:top w:type="dxa" w:w="80"/>
+              <w:left w:type="dxa" w:w="110"/>
+              <w:bottom w:type="dxa" w:w="80"/>
+              <w:right w:type="dxa" w:w="110"/>
+            </w:tcMar>
+          </w:tcPr>
+          <w:p>
+            <w:pPr>
+              <w:spacing w:after="40"/>
+            </w:pPr>
+            <w:r>
+              <w:rPr>
+                <w:rFonts w:ascii="Calibri" w:cs="Calibri" w:eastAsia="Calibri" w:hAnsi="Calibri"/>
+              </w:rPr>
+              <w:t xml:space="preserve">NIST</w:t>
+            </w:r>
+          </w:p>
+        </w:tc>
+        <w:tc>
+          <w:tcPr>
+            <w:tcW w:type="dxa" w:w="4434"/>
+            <w:tcBorders>
+              <w:top w:val="single" w:color="D9DEE7" w:sz="4"/>
+              <w:left w:val="single" w:color="D9DEE7" w:sz="4"/>
+              <w:bottom w:val="single" w:color="D9DEE7" w:sz="4"/>
+              <w:right w:val="single" w:color="D9DEE7" w:sz="4"/>
+            </w:tcBorders>
+            <w:tcMar>
+              <w:top w:type="dxa" w:w="80"/>
+              <w:left w:type="dxa" w:w="110"/>
+              <w:bottom w:type="dxa" w:w="80"/>
+              <w:right w:type="dxa" w:w="110"/>
+            </w:tcMar>
+          </w:tcPr>
+          <w:p>
+            <w:pPr>
+              <w:spacing w:after="40"/>
+            </w:pPr>
+            <w:r>
+              <w:rPr>
+                <w:rFonts w:ascii="Calibri" w:cs="Calibri" w:eastAsia="Calibri" w:hAnsi="Calibri"/>
+              </w:rPr>
+              <w:t xml:space="preserve">Correspondências a partir das referências oficiais do QNRCS</w:t>
+            </w:r>
+          </w:p>
+        </w:tc>
+      </w:tr>
+      <w:tr>
+        <w:trPr>
+          <w:cantSplit/>
+        </w:trPr>
+        <w:tc>
+          <w:tcPr>
+            <w:tcW w:type="dxa" w:w="2313"/>
+            <w:tcBorders>
+              <w:top w:val="single" w:color="D9DEE7" w:sz="4"/>
+              <w:left w:val="single" w:color="D9DEE7" w:sz="4"/>
+              <w:bottom w:val="single" w:color="D9DEE7" w:sz="4"/>
+              <w:right w:val="single" w:color="D9DEE7" w:sz="4"/>
+            </w:tcBorders>
+            <w:tcMar>
+              <w:top w:type="dxa" w:w="80"/>
+              <w:left w:type="dxa" w:w="110"/>
+              <w:bottom w:type="dxa" w:w="80"/>
+              <w:right w:type="dxa" w:w="110"/>
+            </w:tcMar>
+          </w:tcPr>
+          <w:p>
+            <w:pPr>
+              <w:spacing w:after="40"/>
+            </w:pPr>
+            <w:r>
+              <w:rPr>
+                <w:rFonts w:ascii="Calibri" w:cs="Calibri" w:eastAsia="Calibri" w:hAnsi="Calibri"/>
+              </w:rPr>
               <w:t xml:space="preserve">RGPD</w:t>
             </w:r>
           </w:p>
@@ -7628,7 +8121,7 @@
         <w:pStyle w:val="ListParagraph"/>
         <w:numPr>
           <w:ilvl w:val="0"/>
-          <w:numId w:val="4"/>
+          <w:numId w:val="5"/>
         </w:numPr>
         <w:spacing w:after="80" w:line="276"/>
       </w:pPr>
@@ -7644,7 +8137,7 @@
         <w:pStyle w:val="ListParagraph"/>
         <w:numPr>
           <w:ilvl w:val="0"/>
-          <w:numId w:val="4"/>
+          <w:numId w:val="5"/>
         </w:numPr>
         <w:spacing w:after="80" w:line="276"/>
       </w:pPr>
@@ -7660,7 +8153,7 @@
         <w:pStyle w:val="ListParagraph"/>
         <w:numPr>
           <w:ilvl w:val="0"/>
-          <w:numId w:val="4"/>
+          <w:numId w:val="5"/>
         </w:numPr>
         <w:spacing w:after="80" w:line="276"/>
       </w:pPr>
@@ -7676,7 +8169,7 @@
         <w:pStyle w:val="ListParagraph"/>
         <w:numPr>
           <w:ilvl w:val="0"/>
-          <w:numId w:val="4"/>
+          <w:numId w:val="5"/>
         </w:numPr>
         <w:spacing w:after="80" w:line="276"/>
       </w:pPr>
@@ -7692,7 +8185,7 @@
         <w:pStyle w:val="ListParagraph"/>
         <w:numPr>
           <w:ilvl w:val="0"/>
-          <w:numId w:val="4"/>
+          <w:numId w:val="5"/>
         </w:numPr>
         <w:spacing w:after="80" w:line="276"/>
       </w:pPr>
@@ -8923,7 +9416,7 @@
               <w:rPr>
                 <w:rFonts w:ascii="Calibri" w:cs="Calibri" w:eastAsia="Calibri" w:hAnsi="Calibri"/>
               </w:rPr>
-              <w:t xml:space="preserve">A plataforma organiza o trabalho e guarda as evidências; não substitui a norma nem a auditoria de certificação por uma entidade acreditada. A validação do guia com o texto oficial está em curso.</w:t>
+              <w:t xml:space="preserve">A estrutura (cláusulas 4 a 10 e os 93 controlos) foi conferida com o texto oficial em outubro de 2026. A plataforma organiza o trabalho e guarda as evidências; não substitui a norma, que a entidade deve adquirir, nem a auditoria de certificação por uma entidade acreditada.</w:t>
             </w:r>
           </w:p>
         </w:tc>
@@ -9256,7 +9749,7 @@
               <w:rPr>
                 <w:rFonts w:ascii="Calibri" w:cs="Calibri" w:eastAsia="Calibri" w:hAnsi="Calibri"/>
               </w:rPr>
-              <w:t xml:space="preserve">Aplicável ou não, justificação, estado, responsável e evidências. Estas escolhas formam a Declaração de Aplicabilidade.</w:t>
+              <w:t xml:space="preserve">Aplicável ou não, justificação, método de implementação, estado, responsável e evidências. Estas escolhas formam a Declaração de Aplicabilidade.</w:t>
             </w:r>
           </w:p>
         </w:tc>
@@ -9266,6 +9759,45 @@
       <w:pPr>
         <w:spacing w:after="60"/>
       </w:pPr>
+    </w:p>
+    <w:p>
+      <w:pPr>
+        <w:spacing w:after="120" w:line="288"/>
+      </w:pPr>
+      <w:r>
+        <w:rPr>
+          <w:rFonts w:ascii="Calibri" w:cs="Calibri" w:eastAsia="Calibri" w:hAnsi="Calibri"/>
+        </w:rPr>
+        <w:t xml:space="preserve">As cláusulas que exigem </w:t>
+      </w:r>
+      <w:r>
+        <w:rPr>
+          <w:rFonts w:ascii="Calibri" w:cs="Calibri" w:eastAsia="Calibri" w:hAnsi="Calibri"/>
+          <w:b/>
+          <w:bCs/>
+        </w:rPr>
+        <w:t xml:space="preserve">informação documentada</w:t>
+      </w:r>
+      <w:r>
+        <w:rPr>
+          <w:rFonts w:ascii="Calibri" w:cs="Calibri" w:eastAsia="Calibri" w:hAnsi="Calibri"/>
+        </w:rPr>
+        <w:t xml:space="preserve"> estão assinaladas e há um filtro para as ver todas. A </w:t>
+      </w:r>
+      <w:r>
+        <w:rPr>
+          <w:rFonts w:ascii="Calibri" w:cs="Calibri" w:eastAsia="Calibri" w:hAnsi="Calibri"/>
+          <w:b/>
+          <w:bCs/>
+        </w:rPr>
+        <w:t xml:space="preserve">análise de lacunas</w:t>
+      </w:r>
+      <w:r>
+        <w:rPr>
+          <w:rFonts w:ascii="Calibri" w:cs="Calibri" w:eastAsia="Calibri" w:hAnsi="Calibri"/>
+        </w:rPr>
+        <w:t xml:space="preserve"> mostra o sistema de gestão e os controlos em separado (conforme, parcialmente conforme, não conforme, não aplicável) e exporta-se em CSV.</w:t>
+      </w:r>
     </w:p>
     <w:p>
       <w:pPr>
@@ -9308,7 +9840,7 @@
         <w:pStyle w:val="ListParagraph"/>
         <w:numPr>
           <w:ilvl w:val="0"/>
-          <w:numId w:val="5"/>
+          <w:numId w:val="6"/>
         </w:numPr>
         <w:spacing w:after="80" w:line="276"/>
       </w:pPr>
@@ -9338,7 +9870,7 @@
         <w:pStyle w:val="ListParagraph"/>
         <w:numPr>
           <w:ilvl w:val="0"/>
-          <w:numId w:val="5"/>
+          <w:numId w:val="6"/>
         </w:numPr>
         <w:spacing w:after="80" w:line="276"/>
       </w:pPr>
@@ -9368,7 +9900,7 @@
         <w:pStyle w:val="ListParagraph"/>
         <w:numPr>
           <w:ilvl w:val="0"/>
-          <w:numId w:val="5"/>
+          <w:numId w:val="6"/>
         </w:numPr>
         <w:spacing w:after="80" w:line="276"/>
       </w:pPr>
@@ -9376,7 +9908,7 @@
         <w:rPr>
           <w:rFonts w:ascii="Calibri" w:cs="Calibri" w:eastAsia="Calibri" w:hAnsi="Calibri"/>
         </w:rPr>
-        <w:t xml:space="preserve">Percorra os 93 controlos do Anexo A: marque cada um como aplicável ou não aplicável e escreva a justificação.</w:t>
+        <w:t xml:space="preserve">Percorra os 93 controlos do Anexo A: marque cada um como aplicável ou não aplicável, escreva a justificação e, nos aplicáveis, o método de implementação.</w:t>
       </w:r>
     </w:p>
     <w:p>
@@ -9384,7 +9916,7 @@
         <w:pStyle w:val="ListParagraph"/>
         <w:numPr>
           <w:ilvl w:val="0"/>
-          <w:numId w:val="5"/>
+          <w:numId w:val="6"/>
         </w:numPr>
         <w:spacing w:after="80" w:line="276"/>
       </w:pPr>
@@ -9428,7 +9960,7 @@
         <w:pStyle w:val="ListParagraph"/>
         <w:numPr>
           <w:ilvl w:val="0"/>
-          <w:numId w:val="5"/>
+          <w:numId w:val="6"/>
         </w:numPr>
         <w:spacing w:after="80" w:line="276"/>
       </w:pPr>
@@ -9436,7 +9968,7 @@
         <w:rPr>
           <w:rFonts w:ascii="Calibri" w:cs="Calibri" w:eastAsia="Calibri" w:hAnsi="Calibri"/>
         </w:rPr>
-        <w:t xml:space="preserve">Ligue as evidências a cada controlo; as que já existem nos controlos QNRCS ligados aparecem indicadas.</w:t>
+        <w:t xml:space="preserve">Ligue as evidências a cada controlo; as que já existem nos controlos QNRCS ligados aparecem indicadas. Exporte a análise de lacunas para acompanhar o progresso.</w:t>
       </w:r>
     </w:p>
     <w:p>
@@ -9444,7 +9976,7 @@
         <w:pStyle w:val="ListParagraph"/>
         <w:numPr>
           <w:ilvl w:val="0"/>
-          <w:numId w:val="5"/>
+          <w:numId w:val="6"/>
         </w:numPr>
         <w:spacing w:after="80" w:line="276"/>
       </w:pPr>
@@ -9474,7 +10006,7 @@
         <w:pStyle w:val="ListParagraph"/>
         <w:numPr>
           <w:ilvl w:val="0"/>
-          <w:numId w:val="5"/>
+          <w:numId w:val="6"/>
         </w:numPr>
         <w:spacing w:after="80" w:line="276"/>
       </w:pPr>
@@ -10163,7 +10695,705 @@
         <w:rPr>
           <w:rFonts w:ascii="Calibri" w:cs="Calibri" w:eastAsia="Calibri" w:hAnsi="Calibri"/>
         </w:rPr>
-        <w:t xml:space="preserve">6.3 Outros referenciais disponíveis</w:t>
+        <w:t xml:space="preserve">6.3 ISO/IEC 42001:2023 — sistema de gestão da inteligência artificial</w:t>
+      </w:r>
+    </w:p>
+    <w:tbl>
+      <w:tblPr>
+        <w:tblW w:type="dxa" w:w="9638"/>
+        <w:tblBorders>
+          <w:top w:val="single" w:color="auto" w:sz="4"/>
+          <w:left w:val="single" w:color="auto" w:sz="4"/>
+          <w:bottom w:val="single" w:color="auto" w:sz="4"/>
+          <w:right w:val="single" w:color="auto" w:sz="4"/>
+          <w:insideH w:val="single" w:color="auto" w:sz="4"/>
+          <w:insideV w:val="single" w:color="auto" w:sz="4"/>
+        </w:tblBorders>
+      </w:tblPr>
+      <w:tblGrid>
+        <w:gridCol w:w="9638"/>
+      </w:tblGrid>
+      <w:tr>
+        <w:tc>
+          <w:tcPr>
+            <w:tcW w:type="dxa" w:w="9638"/>
+            <w:tcBorders>
+              <w:top w:val="single" w:color="F4F1EA" w:sz="4"/>
+              <w:left w:val="single" w:color="F4F1EA" w:sz="4"/>
+              <w:bottom w:val="single" w:color="F4F1EA" w:sz="4"/>
+              <w:right w:val="single" w:color="F4F1EA" w:sz="4"/>
+            </w:tcBorders>
+            <w:shd w:fill="F4F1EA" w:color="auto" w:val="clear"/>
+            <w:tcMar>
+              <w:top w:type="dxa" w:w="140"/>
+              <w:left w:type="dxa" w:w="200"/>
+              <w:bottom w:type="dxa" w:w="140"/>
+              <w:right w:type="dxa" w:w="200"/>
+            </w:tcMar>
+          </w:tcPr>
+          <w:p>
+            <w:pPr>
+              <w:spacing w:after="80"/>
+            </w:pPr>
+            <w:r>
+              <w:rPr>
+                <w:rFonts w:ascii="Calibri" w:cs="Calibri" w:eastAsia="Calibri" w:hAnsi="Calibri"/>
+                <w:b/>
+                <w:bCs/>
+                <w:color w:val="8A6620"/>
+              </w:rPr>
+              <w:t xml:space="preserve">Antes de começar</w:t>
+            </w:r>
+          </w:p>
+          <w:p>
+            <w:pPr>
+              <w:spacing w:after="60" w:line="276"/>
+            </w:pPr>
+            <w:r>
+              <w:rPr>
+                <w:rFonts w:ascii="Calibri" w:cs="Calibri" w:eastAsia="Calibri" w:hAnsi="Calibri"/>
+              </w:rPr>
+              <w:t xml:space="preserve">A ISO/IEC 42001 é a norma para gerir de forma responsável o desenvolvimento, o fornecimento ou a utilização de sistemas de IA. Tal como na 27001, a AnkoraOne inclui um </w:t>
+            </w:r>
+            <w:r>
+              <w:rPr>
+                <w:rFonts w:ascii="Calibri" w:cs="Calibri" w:eastAsia="Calibri" w:hAnsi="Calibri"/>
+                <w:b/>
+                <w:bCs/>
+              </w:rPr>
+              <w:t xml:space="preserve">guia de preparação</w:t>
+            </w:r>
+            <w:r>
+              <w:rPr>
+                <w:rFonts w:ascii="Calibri" w:cs="Calibri" w:eastAsia="Calibri" w:hAnsi="Calibri"/>
+              </w:rPr>
+              <w:t xml:space="preserve"> com textos próprios; a estrutura foi conferida com o texto oficial e a norma </w:t>
+            </w:r>
+            <w:r>
+              <w:rPr>
+                <w:rFonts w:ascii="Calibri" w:cs="Calibri" w:eastAsia="Calibri" w:hAnsi="Calibri"/>
+                <w:b/>
+                <w:bCs/>
+              </w:rPr>
+              <w:t xml:space="preserve">não está reproduzida</w:t>
+            </w:r>
+            <w:r>
+              <w:rPr>
+                <w:rFonts w:ascii="Calibri" w:cs="Calibri" w:eastAsia="Calibri" w:hAnsi="Calibri"/>
+              </w:rPr>
+              <w:t xml:space="preserve">.</w:t>
+            </w:r>
+          </w:p>
+          <w:p>
+            <w:pPr>
+              <w:spacing w:after="60" w:line="276"/>
+            </w:pPr>
+            <w:r>
+              <w:rPr>
+                <w:rFonts w:ascii="Calibri" w:cs="Calibri" w:eastAsia="Calibri" w:hAnsi="Calibri"/>
+              </w:rPr>
+              <w:t xml:space="preserve">Não substitui as obrigações do Regulamento (UE) 2024/1689 (Regulamento da IA), mas ajuda a organizá-las.</w:t>
+            </w:r>
+          </w:p>
+        </w:tc>
+      </w:tr>
+    </w:tbl>
+    <w:p>
+      <w:pPr>
+        <w:spacing w:after="60"/>
+      </w:pPr>
+    </w:p>
+    <w:p>
+      <w:pPr>
+        <w:spacing w:after="120" w:line="288"/>
+      </w:pPr>
+      <w:r>
+        <w:rPr>
+          <w:rFonts w:ascii="Calibri" w:cs="Calibri" w:eastAsia="Calibri" w:hAnsi="Calibri"/>
+        </w:rPr>
+        <w:t xml:space="preserve">O guia está em </w:t>
+      </w:r>
+      <w:r>
+        <w:rPr>
+          <w:rFonts w:ascii="Calibri" w:cs="Calibri" w:eastAsia="Calibri" w:hAnsi="Calibri"/>
+          <w:b/>
+          <w:bCs/>
+        </w:rPr>
+        <w:t xml:space="preserve">Biblioteca Legal › ISO/IEC 42001</w:t>
+      </w:r>
+      <w:r>
+        <w:rPr>
+          <w:rFonts w:ascii="Calibri" w:cs="Calibri" w:eastAsia="Calibri" w:hAnsi="Calibri"/>
+        </w:rPr>
+        <w:t xml:space="preserve">:</w:t>
+      </w:r>
+    </w:p>
+    <w:tbl>
+      <w:tblPr>
+        <w:tblW w:type="dxa" w:w="9638"/>
+        <w:tblBorders>
+          <w:top w:val="single" w:color="auto" w:sz="4"/>
+          <w:left w:val="single" w:color="auto" w:sz="4"/>
+          <w:bottom w:val="single" w:color="auto" w:sz="4"/>
+          <w:right w:val="single" w:color="auto" w:sz="4"/>
+          <w:insideH w:val="single" w:color="auto" w:sz="4"/>
+          <w:insideV w:val="single" w:color="auto" w:sz="4"/>
+        </w:tblBorders>
+      </w:tblPr>
+      <w:tblGrid>
+        <w:gridCol w:w="2313"/>
+        <w:gridCol w:w="4048"/>
+        <w:gridCol w:w="3277"/>
+      </w:tblGrid>
+      <w:tr>
+        <w:trPr>
+          <w:tblHeader/>
+        </w:trPr>
+        <w:tc>
+          <w:tcPr>
+            <w:tcW w:type="dxa" w:w="2313"/>
+            <w:tcBorders>
+              <w:top w:val="single" w:color="D9DEE7" w:sz="4"/>
+              <w:left w:val="single" w:color="D9DEE7" w:sz="4"/>
+              <w:bottom w:val="single" w:color="D9DEE7" w:sz="4"/>
+              <w:right w:val="single" w:color="D9DEE7" w:sz="4"/>
+            </w:tcBorders>
+            <w:shd w:fill="070A13" w:color="auto" w:val="clear"/>
+            <w:tcMar>
+              <w:top w:type="dxa" w:w="80"/>
+              <w:left w:type="dxa" w:w="110"/>
+              <w:bottom w:type="dxa" w:w="80"/>
+              <w:right w:type="dxa" w:w="110"/>
+            </w:tcMar>
+          </w:tcPr>
+          <w:p>
+            <w:pPr>
+              <w:spacing w:after="40"/>
+            </w:pPr>
+            <w:r>
+              <w:rPr>
+                <w:rFonts w:ascii="Calibri" w:cs="Calibri" w:eastAsia="Calibri" w:hAnsi="Calibri"/>
+                <w:b/>
+                <w:bCs/>
+                <w:color w:val="FFFFFF"/>
+                <w:sz w:val="19"/>
+                <w:szCs w:val="19"/>
+              </w:rPr>
+              <w:t xml:space="preserve">Parte</w:t>
+            </w:r>
+          </w:p>
+        </w:tc>
+        <w:tc>
+          <w:tcPr>
+            <w:tcW w:type="dxa" w:w="4048"/>
+            <w:tcBorders>
+              <w:top w:val="single" w:color="D9DEE7" w:sz="4"/>
+              <w:left w:val="single" w:color="D9DEE7" w:sz="4"/>
+              <w:bottom w:val="single" w:color="D9DEE7" w:sz="4"/>
+              <w:right w:val="single" w:color="D9DEE7" w:sz="4"/>
+            </w:tcBorders>
+            <w:shd w:fill="070A13" w:color="auto" w:val="clear"/>
+            <w:tcMar>
+              <w:top w:type="dxa" w:w="80"/>
+              <w:left w:type="dxa" w:w="110"/>
+              <w:bottom w:type="dxa" w:w="80"/>
+              <w:right w:type="dxa" w:w="110"/>
+            </w:tcMar>
+          </w:tcPr>
+          <w:p>
+            <w:pPr>
+              <w:spacing w:after="40"/>
+            </w:pPr>
+            <w:r>
+              <w:rPr>
+                <w:rFonts w:ascii="Calibri" w:cs="Calibri" w:eastAsia="Calibri" w:hAnsi="Calibri"/>
+                <w:b/>
+                <w:bCs/>
+                <w:color w:val="FFFFFF"/>
+                <w:sz w:val="19"/>
+                <w:szCs w:val="19"/>
+              </w:rPr>
+              <w:t xml:space="preserve">Conteúdo</w:t>
+            </w:r>
+          </w:p>
+        </w:tc>
+        <w:tc>
+          <w:tcPr>
+            <w:tcW w:type="dxa" w:w="3277"/>
+            <w:tcBorders>
+              <w:top w:val="single" w:color="D9DEE7" w:sz="4"/>
+              <w:left w:val="single" w:color="D9DEE7" w:sz="4"/>
+              <w:bottom w:val="single" w:color="D9DEE7" w:sz="4"/>
+              <w:right w:val="single" w:color="D9DEE7" w:sz="4"/>
+            </w:tcBorders>
+            <w:shd w:fill="070A13" w:color="auto" w:val="clear"/>
+            <w:tcMar>
+              <w:top w:type="dxa" w:w="80"/>
+              <w:left w:type="dxa" w:w="110"/>
+              <w:bottom w:type="dxa" w:w="80"/>
+              <w:right w:type="dxa" w:w="110"/>
+            </w:tcMar>
+          </w:tcPr>
+          <w:p>
+            <w:pPr>
+              <w:spacing w:after="40"/>
+            </w:pPr>
+            <w:r>
+              <w:rPr>
+                <w:rFonts w:ascii="Calibri" w:cs="Calibri" w:eastAsia="Calibri" w:hAnsi="Calibri"/>
+                <w:b/>
+                <w:bCs/>
+                <w:color w:val="FFFFFF"/>
+                <w:sz w:val="19"/>
+                <w:szCs w:val="19"/>
+              </w:rPr>
+              <w:t xml:space="preserve">Particularidade</w:t>
+            </w:r>
+          </w:p>
+        </w:tc>
+      </w:tr>
+      <w:tr>
+        <w:trPr>
+          <w:cantSplit/>
+        </w:trPr>
+        <w:tc>
+          <w:tcPr>
+            <w:tcW w:type="dxa" w:w="2313"/>
+            <w:tcBorders>
+              <w:top w:val="single" w:color="D9DEE7" w:sz="4"/>
+              <w:left w:val="single" w:color="D9DEE7" w:sz="4"/>
+              <w:bottom w:val="single" w:color="D9DEE7" w:sz="4"/>
+              <w:right w:val="single" w:color="D9DEE7" w:sz="4"/>
+            </w:tcBorders>
+            <w:tcMar>
+              <w:top w:type="dxa" w:w="80"/>
+              <w:left w:type="dxa" w:w="110"/>
+              <w:bottom w:type="dxa" w:w="80"/>
+              <w:right w:type="dxa" w:w="110"/>
+            </w:tcMar>
+          </w:tcPr>
+          <w:p>
+            <w:pPr>
+              <w:spacing w:after="40"/>
+            </w:pPr>
+            <w:r>
+              <w:rPr>
+                <w:rFonts w:ascii="Calibri" w:cs="Calibri" w:eastAsia="Calibri" w:hAnsi="Calibri"/>
+              </w:rPr>
+              <w:t xml:space="preserve">Requisitos do sistema de gestão</w:t>
+            </w:r>
+          </w:p>
+        </w:tc>
+        <w:tc>
+          <w:tcPr>
+            <w:tcW w:type="dxa" w:w="4048"/>
+            <w:tcBorders>
+              <w:top w:val="single" w:color="D9DEE7" w:sz="4"/>
+              <w:left w:val="single" w:color="D9DEE7" w:sz="4"/>
+              <w:bottom w:val="single" w:color="D9DEE7" w:sz="4"/>
+              <w:right w:val="single" w:color="D9DEE7" w:sz="4"/>
+            </w:tcBorders>
+            <w:tcMar>
+              <w:top w:type="dxa" w:w="80"/>
+              <w:left w:type="dxa" w:w="110"/>
+              <w:bottom w:type="dxa" w:w="80"/>
+              <w:right w:type="dxa" w:w="110"/>
+            </w:tcMar>
+          </w:tcPr>
+          <w:p>
+            <w:pPr>
+              <w:spacing w:after="40"/>
+            </w:pPr>
+            <w:r>
+              <w:rPr>
+                <w:rFonts w:ascii="Calibri" w:cs="Calibri" w:eastAsia="Calibri" w:hAnsi="Calibri"/>
+              </w:rPr>
+              <w:t xml:space="preserve">Cláusulas 4 a 10 (27 requisitos), com a mesma estrutura da 27001</w:t>
+            </w:r>
+          </w:p>
+        </w:tc>
+        <w:tc>
+          <w:tcPr>
+            <w:tcW w:type="dxa" w:w="3277"/>
+            <w:tcBorders>
+              <w:top w:val="single" w:color="D9DEE7" w:sz="4"/>
+              <w:left w:val="single" w:color="D9DEE7" w:sz="4"/>
+              <w:bottom w:val="single" w:color="D9DEE7" w:sz="4"/>
+              <w:right w:val="single" w:color="D9DEE7" w:sz="4"/>
+            </w:tcBorders>
+            <w:tcMar>
+              <w:top w:type="dxa" w:w="80"/>
+              <w:left w:type="dxa" w:w="110"/>
+              <w:bottom w:type="dxa" w:w="80"/>
+              <w:right w:type="dxa" w:w="110"/>
+            </w:tcMar>
+          </w:tcPr>
+          <w:p>
+            <w:pPr>
+              <w:spacing w:after="40"/>
+            </w:pPr>
+            <w:r>
+              <w:rPr>
+                <w:rFonts w:ascii="Calibri" w:cs="Calibri" w:eastAsia="Calibri" w:hAnsi="Calibri"/>
+              </w:rPr>
+              <w:t xml:space="preserve">Acrescenta a </w:t>
+            </w:r>
+            <w:r>
+              <w:rPr>
+                <w:rFonts w:ascii="Calibri" w:cs="Calibri" w:eastAsia="Calibri" w:hAnsi="Calibri"/>
+                <w:b/>
+                <w:bCs/>
+              </w:rPr>
+              <w:t xml:space="preserve">avaliação de impacto dos sistemas de IA</w:t>
+            </w:r>
+            <w:r>
+              <w:rPr>
+                <w:rFonts w:ascii="Calibri" w:cs="Calibri" w:eastAsia="Calibri" w:hAnsi="Calibri"/>
+              </w:rPr>
+              <w:t xml:space="preserve"> (6.1.4 e 8.4), sem equivalente na 27001</w:t>
+            </w:r>
+          </w:p>
+        </w:tc>
+      </w:tr>
+      <w:tr>
+        <w:trPr>
+          <w:cantSplit/>
+        </w:trPr>
+        <w:tc>
+          <w:tcPr>
+            <w:tcW w:type="dxa" w:w="2313"/>
+            <w:tcBorders>
+              <w:top w:val="single" w:color="D9DEE7" w:sz="4"/>
+              <w:left w:val="single" w:color="D9DEE7" w:sz="4"/>
+              <w:bottom w:val="single" w:color="D9DEE7" w:sz="4"/>
+              <w:right w:val="single" w:color="D9DEE7" w:sz="4"/>
+            </w:tcBorders>
+            <w:tcMar>
+              <w:top w:type="dxa" w:w="80"/>
+              <w:left w:type="dxa" w:w="110"/>
+              <w:bottom w:type="dxa" w:w="80"/>
+              <w:right w:type="dxa" w:w="110"/>
+            </w:tcMar>
+          </w:tcPr>
+          <w:p>
+            <w:pPr>
+              <w:spacing w:after="40"/>
+            </w:pPr>
+            <w:r>
+              <w:rPr>
+                <w:rFonts w:ascii="Calibri" w:cs="Calibri" w:eastAsia="Calibri" w:hAnsi="Calibri"/>
+              </w:rPr>
+              <w:t xml:space="preserve">Controlos do Anexo A</w:t>
+            </w:r>
+          </w:p>
+        </w:tc>
+        <w:tc>
+          <w:tcPr>
+            <w:tcW w:type="dxa" w:w="4048"/>
+            <w:tcBorders>
+              <w:top w:val="single" w:color="D9DEE7" w:sz="4"/>
+              <w:left w:val="single" w:color="D9DEE7" w:sz="4"/>
+              <w:bottom w:val="single" w:color="D9DEE7" w:sz="4"/>
+              <w:right w:val="single" w:color="D9DEE7" w:sz="4"/>
+            </w:tcBorders>
+            <w:tcMar>
+              <w:top w:type="dxa" w:w="80"/>
+              <w:left w:type="dxa" w:w="110"/>
+              <w:bottom w:type="dxa" w:w="80"/>
+              <w:right w:type="dxa" w:w="110"/>
+            </w:tcMar>
+          </w:tcPr>
+          <w:p>
+            <w:pPr>
+              <w:spacing w:after="40"/>
+            </w:pPr>
+            <w:r>
+              <w:rPr>
+                <w:rFonts w:ascii="Calibri" w:cs="Calibri" w:eastAsia="Calibri" w:hAnsi="Calibri"/>
+              </w:rPr>
+              <w:t xml:space="preserve">38 controlos em 9 domínios: políticas, organização, recursos, avaliação de impactos, ciclo de vida, dados, informação a partes interessadas, utilização e terceiros</w:t>
+            </w:r>
+          </w:p>
+        </w:tc>
+        <w:tc>
+          <w:tcPr>
+            <w:tcW w:type="dxa" w:w="3277"/>
+            <w:tcBorders>
+              <w:top w:val="single" w:color="D9DEE7" w:sz="4"/>
+              <w:left w:val="single" w:color="D9DEE7" w:sz="4"/>
+              <w:bottom w:val="single" w:color="D9DEE7" w:sz="4"/>
+              <w:right w:val="single" w:color="D9DEE7" w:sz="4"/>
+            </w:tcBorders>
+            <w:tcMar>
+              <w:top w:type="dxa" w:w="80"/>
+              <w:left w:type="dxa" w:w="110"/>
+              <w:bottom w:type="dxa" w:w="80"/>
+              <w:right w:type="dxa" w:w="110"/>
+            </w:tcMar>
+          </w:tcPr>
+          <w:p>
+            <w:pPr>
+              <w:spacing w:after="40"/>
+            </w:pPr>
+            <w:r>
+              <w:rPr>
+                <w:rFonts w:ascii="Calibri" w:cs="Calibri" w:eastAsia="Calibri" w:hAnsi="Calibri"/>
+              </w:rPr>
+              <w:t xml:space="preserve">33 apoiam-se em requisitos da 27001; 5 são próprios da IA</w:t>
+            </w:r>
+          </w:p>
+        </w:tc>
+      </w:tr>
+      <w:tr>
+        <w:trPr>
+          <w:cantSplit/>
+        </w:trPr>
+        <w:tc>
+          <w:tcPr>
+            <w:tcW w:type="dxa" w:w="2313"/>
+            <w:tcBorders>
+              <w:top w:val="single" w:color="D9DEE7" w:sz="4"/>
+              <w:left w:val="single" w:color="D9DEE7" w:sz="4"/>
+              <w:bottom w:val="single" w:color="D9DEE7" w:sz="4"/>
+              <w:right w:val="single" w:color="D9DEE7" w:sz="4"/>
+            </w:tcBorders>
+            <w:tcMar>
+              <w:top w:type="dxa" w:w="80"/>
+              <w:left w:type="dxa" w:w="110"/>
+              <w:bottom w:type="dxa" w:w="80"/>
+              <w:right w:type="dxa" w:w="110"/>
+            </w:tcMar>
+          </w:tcPr>
+          <w:p>
+            <w:pPr>
+              <w:spacing w:after="40"/>
+            </w:pPr>
+            <w:r>
+              <w:rPr>
+                <w:rFonts w:ascii="Calibri" w:cs="Calibri" w:eastAsia="Calibri" w:hAnsi="Calibri"/>
+              </w:rPr>
+              <w:t xml:space="preserve">Anexo C</w:t>
+            </w:r>
+          </w:p>
+        </w:tc>
+        <w:tc>
+          <w:tcPr>
+            <w:tcW w:type="dxa" w:w="4048"/>
+            <w:tcBorders>
+              <w:top w:val="single" w:color="D9DEE7" w:sz="4"/>
+              <w:left w:val="single" w:color="D9DEE7" w:sz="4"/>
+              <w:bottom w:val="single" w:color="D9DEE7" w:sz="4"/>
+              <w:right w:val="single" w:color="D9DEE7" w:sz="4"/>
+            </w:tcBorders>
+            <w:tcMar>
+              <w:top w:type="dxa" w:w="80"/>
+              <w:left w:type="dxa" w:w="110"/>
+              <w:bottom w:type="dxa" w:w="80"/>
+              <w:right w:type="dxa" w:w="110"/>
+            </w:tcMar>
+          </w:tcPr>
+          <w:p>
+            <w:pPr>
+              <w:spacing w:after="40"/>
+            </w:pPr>
+            <w:r>
+              <w:rPr>
+                <w:rFonts w:ascii="Calibri" w:cs="Calibri" w:eastAsia="Calibri" w:hAnsi="Calibri"/>
+              </w:rPr>
+              <w:t xml:space="preserve">11 objetivos e 7 fontes de risco de referência</w:t>
+            </w:r>
+          </w:p>
+        </w:tc>
+        <w:tc>
+          <w:tcPr>
+            <w:tcW w:type="dxa" w:w="3277"/>
+            <w:tcBorders>
+              <w:top w:val="single" w:color="D9DEE7" w:sz="4"/>
+              <w:left w:val="single" w:color="D9DEE7" w:sz="4"/>
+              <w:bottom w:val="single" w:color="D9DEE7" w:sz="4"/>
+              <w:right w:val="single" w:color="D9DEE7" w:sz="4"/>
+            </w:tcBorders>
+            <w:tcMar>
+              <w:top w:type="dxa" w:w="80"/>
+              <w:left w:type="dxa" w:w="110"/>
+              <w:bottom w:type="dxa" w:w="80"/>
+              <w:right w:type="dxa" w:w="110"/>
+            </w:tcMar>
+          </w:tcPr>
+          <w:p>
+            <w:pPr>
+              <w:spacing w:after="40"/>
+            </w:pPr>
+            <w:r>
+              <w:rPr>
+                <w:rFonts w:ascii="Calibri" w:cs="Calibri" w:eastAsia="Calibri" w:hAnsi="Calibri"/>
+              </w:rPr>
+              <w:t xml:space="preserve">Ajudam a definir objetivos (6.2) e a avaliar riscos (6.1.2)</w:t>
+            </w:r>
+          </w:p>
+        </w:tc>
+      </w:tr>
+    </w:tbl>
+    <w:p>
+      <w:pPr>
+        <w:spacing w:after="60"/>
+      </w:pPr>
+    </w:p>
+    <w:p>
+      <w:pPr>
+        <w:spacing w:after="120" w:line="288"/>
+      </w:pPr>
+      <w:r>
+        <w:rPr>
+          <w:rFonts w:ascii="Calibri" w:cs="Calibri" w:eastAsia="Calibri" w:hAnsi="Calibri"/>
+        </w:rPr>
+        <w:t xml:space="preserve">Se a entidade já segue a ISO/IEC 27001, trabalhe as duas como </w:t>
+      </w:r>
+      <w:r>
+        <w:rPr>
+          <w:rFonts w:ascii="Calibri" w:cs="Calibri" w:eastAsia="Calibri" w:hAnsi="Calibri"/>
+          <w:b/>
+          <w:bCs/>
+        </w:rPr>
+        <w:t xml:space="preserve">um só sistema de gestão</w:t>
+      </w:r>
+      <w:r>
+        <w:rPr>
+          <w:rFonts w:ascii="Calibri" w:cs="Calibri" w:eastAsia="Calibri" w:hAnsi="Calibri"/>
+        </w:rPr>
+        <w:t xml:space="preserve">: a mesma análise de contexto, o mesmo controlo documental, uma auditoria interna e uma revisão pela gestão. Cada controlo da 42001 mostra os requisitos da 27001 em que se apoia e conta as evidências que já lá estão. A </w:t>
+      </w:r>
+      <w:r>
+        <w:rPr>
+          <w:rFonts w:ascii="Calibri" w:cs="Calibri" w:eastAsia="Calibri" w:hAnsi="Calibri"/>
+          <w:b/>
+          <w:bCs/>
+        </w:rPr>
+        <w:t xml:space="preserve">Declaração de Aplicabilidade é separada</w:t>
+      </w:r>
+      <w:r>
+        <w:rPr>
+          <w:rFonts w:ascii="Calibri" w:cs="Calibri" w:eastAsia="Calibri" w:hAnsi="Calibri"/>
+        </w:rPr>
+        <w:t xml:space="preserve"> para cada norma.</w:t>
+      </w:r>
+    </w:p>
+    <w:p>
+      <w:pPr>
+        <w:pStyle w:val="Heading3"/>
+      </w:pPr>
+      <w:r>
+        <w:rPr>
+          <w:rFonts w:ascii="Calibri" w:cs="Calibri" w:eastAsia="Calibri" w:hAnsi="Calibri"/>
+        </w:rPr>
+        <w:t xml:space="preserve">Como trabalhar este referencial na AnkoraOne</w:t>
+      </w:r>
+    </w:p>
+    <w:p>
+      <w:pPr>
+        <w:pStyle w:val="ListParagraph"/>
+        <w:numPr>
+          <w:ilvl w:val="0"/>
+          <w:numId w:val="7"/>
+        </w:numPr>
+        <w:spacing w:after="80" w:line="276"/>
+      </w:pPr>
+      <w:r>
+        <w:rPr>
+          <w:rFonts w:ascii="Calibri" w:cs="Calibri" w:eastAsia="Calibri" w:hAnsi="Calibri"/>
+        </w:rPr>
+        <w:t xml:space="preserve">Faça o inventário dos sistemas de IA e defina o papel da entidade em cada um (cláusula 4).</w:t>
+      </w:r>
+    </w:p>
+    <w:p>
+      <w:pPr>
+        <w:pStyle w:val="ListParagraph"/>
+        <w:numPr>
+          <w:ilvl w:val="0"/>
+          <w:numId w:val="7"/>
+        </w:numPr>
+        <w:spacing w:after="80" w:line="276"/>
+      </w:pPr>
+      <w:r>
+        <w:rPr>
+          <w:rFonts w:ascii="Calibri" w:cs="Calibri" w:eastAsia="Calibri" w:hAnsi="Calibri"/>
+        </w:rPr>
+        <w:t xml:space="preserve">Aprove a política de IA e as responsabilidades (5.2 e 5.3).</w:t>
+      </w:r>
+    </w:p>
+    <w:p>
+      <w:pPr>
+        <w:pStyle w:val="ListParagraph"/>
+        <w:numPr>
+          <w:ilvl w:val="0"/>
+          <w:numId w:val="7"/>
+        </w:numPr>
+        <w:spacing w:after="80" w:line="276"/>
+      </w:pPr>
+      <w:r>
+        <w:rPr>
+          <w:rFonts w:ascii="Calibri" w:cs="Calibri" w:eastAsia="Calibri" w:hAnsi="Calibri"/>
+        </w:rPr>
+        <w:t xml:space="preserve">Avalie os riscos de IA e, para cada sistema, o impacto em pessoas e na sociedade (6.1.2 e 6.1.4).</w:t>
+      </w:r>
+    </w:p>
+    <w:p>
+      <w:pPr>
+        <w:pStyle w:val="ListParagraph"/>
+        <w:numPr>
+          <w:ilvl w:val="0"/>
+          <w:numId w:val="7"/>
+        </w:numPr>
+        <w:spacing w:after="80" w:line="276"/>
+      </w:pPr>
+      <w:r>
+        <w:rPr>
+          <w:rFonts w:ascii="Calibri" w:cs="Calibri" w:eastAsia="Calibri" w:hAnsi="Calibri"/>
+        </w:rPr>
+        <w:t xml:space="preserve">Percorra os 38 controlos: aplicabilidade, justificação e método de implementação; exporte a Declaração de Aplicabilidade.</w:t>
+      </w:r>
+    </w:p>
+    <w:p>
+      <w:pPr>
+        <w:pStyle w:val="ListParagraph"/>
+        <w:numPr>
+          <w:ilvl w:val="0"/>
+          <w:numId w:val="7"/>
+        </w:numPr>
+        <w:spacing w:after="80" w:line="276"/>
+      </w:pPr>
+      <w:r>
+        <w:rPr>
+          <w:rFonts w:ascii="Calibri" w:cs="Calibri" w:eastAsia="Calibri" w:hAnsi="Calibri"/>
+        </w:rPr>
+        <w:t xml:space="preserve">Ligue as evidências; nos controlos com base na 27001, reaproveite o que já existe e acrescente o que é próprio da IA.</w:t>
+      </w:r>
+    </w:p>
+    <w:p>
+      <w:pPr>
+        <w:pStyle w:val="ListParagraph"/>
+        <w:numPr>
+          <w:ilvl w:val="0"/>
+          <w:numId w:val="7"/>
+        </w:numPr>
+        <w:spacing w:after="80" w:line="276"/>
+      </w:pPr>
+      <w:r>
+        <w:rPr>
+          <w:rFonts w:ascii="Calibri" w:cs="Calibri" w:eastAsia="Calibri" w:hAnsi="Calibri"/>
+        </w:rPr>
+        <w:t xml:space="preserve">Inclua a IA na auditoria interna e na revisão pela gestão (9.2 e 9.3).</w:t>
+      </w:r>
+    </w:p>
+    <w:p>
+      <w:pPr>
+        <w:pStyle w:val="Heading2"/>
+      </w:pPr>
+      <w:r>
+        <w:rPr>
+          <w:rFonts w:ascii="Calibri" w:cs="Calibri" w:eastAsia="Calibri" w:hAnsi="Calibri"/>
+        </w:rPr>
+        <w:t xml:space="preserve">6.4 Outros referenciais disponíveis</w:t>
       </w:r>
     </w:p>
     <w:p>
@@ -10656,7 +11886,7 @@
               <w:rPr>
                 <w:rFonts w:ascii="Calibri" w:cs="Calibri" w:eastAsia="Calibri" w:hAnsi="Calibri"/>
               </w:rPr>
-              <w:t xml:space="preserve">Políticas base aprovadas; inventário de ativos; fornecedores críticos identificados; Declaração de Aplicabilidade ISO em rascunho</w:t>
+              <w:t xml:space="preserve">Políticas base aprovadas; inventário de ativos (e de sistemas de IA, se aplicável); fornecedores críticos identificados; Declarações de Aplicabilidade ISO em rascunho; documentos existentes carregados em Por classificar</w:t>
             </w:r>
           </w:p>
         </w:tc>
@@ -10684,7 +11914,7 @@
               <w:rPr>
                 <w:rFonts w:ascii="Calibri" w:cs="Calibri" w:eastAsia="Calibri" w:hAnsi="Calibri"/>
               </w:rPr>
-              <w:t xml:space="preserve">Documentos · Ativos e ferramentas · Fornecedores · Biblioteca Legal › ISO/IEC 27001</w:t>
+              <w:t xml:space="preserve">Documentos · Repositório documental · Ativos e ferramentas · Fornecedores · Biblioteca Legal › ISO</w:t>
             </w:r>
           </w:p>
         </w:tc>
@@ -10950,7 +12180,7 @@
               <w:rPr>
                 <w:rFonts w:ascii="Calibri" w:cs="Calibri" w:eastAsia="Calibri" w:hAnsi="Calibri"/>
               </w:rPr>
-              <w:t xml:space="preserve">☐ Repositório de ficheiros escolhido</w:t>
+              <w:t xml:space="preserve">☐ Repositório de ficheiros e localização escolhidos</w:t>
             </w:r>
           </w:p>
           <w:p>
@@ -11578,6 +12808,189 @@
           </w:p>
         </w:tc>
       </w:tr>
+      <w:tr>
+        <w:trPr>
+          <w:cantSplit/>
+        </w:trPr>
+        <w:tc>
+          <w:tcPr>
+            <w:tcW w:type="dxa" w:w="3044"/>
+            <w:tcBorders>
+              <w:top w:val="single" w:color="D9DEE7" w:sz="4"/>
+              <w:left w:val="single" w:color="D9DEE7" w:sz="4"/>
+              <w:bottom w:val="single" w:color="D9DEE7" w:sz="4"/>
+              <w:right w:val="single" w:color="D9DEE7" w:sz="4"/>
+            </w:tcBorders>
+            <w:tcMar>
+              <w:top w:type="dxa" w:w="80"/>
+              <w:left w:type="dxa" w:w="110"/>
+              <w:bottom w:type="dxa" w:w="80"/>
+              <w:right w:type="dxa" w:w="110"/>
+            </w:tcMar>
+          </w:tcPr>
+          <w:p>
+            <w:pPr>
+              <w:spacing w:after="40"/>
+            </w:pPr>
+            <w:r>
+              <w:rPr>
+                <w:rFonts w:ascii="Calibri" w:cs="Calibri" w:eastAsia="Calibri" w:hAnsi="Calibri"/>
+              </w:rPr>
+              <w:t xml:space="preserve">Declaração de Aplicabilidade</w:t>
+            </w:r>
+          </w:p>
+        </w:tc>
+        <w:tc>
+          <w:tcPr>
+            <w:tcW w:type="dxa" w:w="6594"/>
+            <w:tcBorders>
+              <w:top w:val="single" w:color="D9DEE7" w:sz="4"/>
+              <w:left w:val="single" w:color="D9DEE7" w:sz="4"/>
+              <w:bottom w:val="single" w:color="D9DEE7" w:sz="4"/>
+              <w:right w:val="single" w:color="D9DEE7" w:sz="4"/>
+            </w:tcBorders>
+            <w:tcMar>
+              <w:top w:type="dxa" w:w="80"/>
+              <w:left w:type="dxa" w:w="110"/>
+              <w:bottom w:type="dxa" w:w="80"/>
+              <w:right w:type="dxa" w:w="110"/>
+            </w:tcMar>
+          </w:tcPr>
+          <w:p>
+            <w:pPr>
+              <w:spacing w:after="40"/>
+            </w:pPr>
+            <w:r>
+              <w:rPr>
+                <w:rFonts w:ascii="Calibri" w:cs="Calibri" w:eastAsia="Calibri" w:hAnsi="Calibri"/>
+              </w:rPr>
+              <w:t xml:space="preserve">Lista dos controlos do Anexo A de uma norma ISO, com a decisão de aplicar ou não cada um e a justificação</w:t>
+            </w:r>
+          </w:p>
+        </w:tc>
+      </w:tr>
+      <w:tr>
+        <w:trPr>
+          <w:cantSplit/>
+        </w:trPr>
+        <w:tc>
+          <w:tcPr>
+            <w:tcW w:type="dxa" w:w="3044"/>
+            <w:tcBorders>
+              <w:top w:val="single" w:color="D9DEE7" w:sz="4"/>
+              <w:left w:val="single" w:color="D9DEE7" w:sz="4"/>
+              <w:bottom w:val="single" w:color="D9DEE7" w:sz="4"/>
+              <w:right w:val="single" w:color="D9DEE7" w:sz="4"/>
+            </w:tcBorders>
+            <w:tcMar>
+              <w:top w:type="dxa" w:w="80"/>
+              <w:left w:type="dxa" w:w="110"/>
+              <w:bottom w:type="dxa" w:w="80"/>
+              <w:right w:type="dxa" w:w="110"/>
+            </w:tcMar>
+          </w:tcPr>
+          <w:p>
+            <w:pPr>
+              <w:spacing w:after="40"/>
+            </w:pPr>
+            <w:r>
+              <w:rPr>
+                <w:rFonts w:ascii="Calibri" w:cs="Calibri" w:eastAsia="Calibri" w:hAnsi="Calibri"/>
+              </w:rPr>
+              <w:t xml:space="preserve">Análise de lacunas</w:t>
+            </w:r>
+          </w:p>
+        </w:tc>
+        <w:tc>
+          <w:tcPr>
+            <w:tcW w:type="dxa" w:w="6594"/>
+            <w:tcBorders>
+              <w:top w:val="single" w:color="D9DEE7" w:sz="4"/>
+              <w:left w:val="single" w:color="D9DEE7" w:sz="4"/>
+              <w:bottom w:val="single" w:color="D9DEE7" w:sz="4"/>
+              <w:right w:val="single" w:color="D9DEE7" w:sz="4"/>
+            </w:tcBorders>
+            <w:tcMar>
+              <w:top w:type="dxa" w:w="80"/>
+              <w:left w:type="dxa" w:w="110"/>
+              <w:bottom w:type="dxa" w:w="80"/>
+              <w:right w:type="dxa" w:w="110"/>
+            </w:tcMar>
+          </w:tcPr>
+          <w:p>
+            <w:pPr>
+              <w:spacing w:after="40"/>
+            </w:pPr>
+            <w:r>
+              <w:rPr>
+                <w:rFonts w:ascii="Calibri" w:cs="Calibri" w:eastAsia="Calibri" w:hAnsi="Calibri"/>
+              </w:rPr>
+              <w:t xml:space="preserve">Comparação entre o que a norma pede e o que já existe, requisito a requisito</w:t>
+            </w:r>
+          </w:p>
+        </w:tc>
+      </w:tr>
+      <w:tr>
+        <w:trPr>
+          <w:cantSplit/>
+        </w:trPr>
+        <w:tc>
+          <w:tcPr>
+            <w:tcW w:type="dxa" w:w="3044"/>
+            <w:tcBorders>
+              <w:top w:val="single" w:color="D9DEE7" w:sz="4"/>
+              <w:left w:val="single" w:color="D9DEE7" w:sz="4"/>
+              <w:bottom w:val="single" w:color="D9DEE7" w:sz="4"/>
+              <w:right w:val="single" w:color="D9DEE7" w:sz="4"/>
+            </w:tcBorders>
+            <w:tcMar>
+              <w:top w:type="dxa" w:w="80"/>
+              <w:left w:type="dxa" w:w="110"/>
+              <w:bottom w:type="dxa" w:w="80"/>
+              <w:right w:type="dxa" w:w="110"/>
+            </w:tcMar>
+          </w:tcPr>
+          <w:p>
+            <w:pPr>
+              <w:spacing w:after="40"/>
+            </w:pPr>
+            <w:r>
+              <w:rPr>
+                <w:rFonts w:ascii="Calibri" w:cs="Calibri" w:eastAsia="Calibri" w:hAnsi="Calibri"/>
+              </w:rPr>
+              <w:t xml:space="preserve">Avaliação de impacto de IA</w:t>
+            </w:r>
+          </w:p>
+        </w:tc>
+        <w:tc>
+          <w:tcPr>
+            <w:tcW w:type="dxa" w:w="6594"/>
+            <w:tcBorders>
+              <w:top w:val="single" w:color="D9DEE7" w:sz="4"/>
+              <w:left w:val="single" w:color="D9DEE7" w:sz="4"/>
+              <w:bottom w:val="single" w:color="D9DEE7" w:sz="4"/>
+              <w:right w:val="single" w:color="D9DEE7" w:sz="4"/>
+            </w:tcBorders>
+            <w:tcMar>
+              <w:top w:type="dxa" w:w="80"/>
+              <w:left w:type="dxa" w:w="110"/>
+              <w:bottom w:type="dxa" w:w="80"/>
+              <w:right w:type="dxa" w:w="110"/>
+            </w:tcMar>
+          </w:tcPr>
+          <w:p>
+            <w:pPr>
+              <w:spacing w:after="40"/>
+            </w:pPr>
+            <w:r>
+              <w:rPr>
+                <w:rFonts w:ascii="Calibri" w:cs="Calibri" w:eastAsia="Calibri" w:hAnsi="Calibri"/>
+              </w:rPr>
+              <w:t xml:space="preserve">Análise dos efeitos de um sistema de IA em pessoas e na sociedade (ISO/IEC 42001, 6.1.4)</w:t>
+            </w:r>
+          </w:p>
+        </w:tc>
+      </w:tr>
     </w:tbl>
     <w:p>
       <w:pPr>
@@ -11641,7 +13054,7 @@
           <w:sz w:val="18"/>
           <w:szCs w:val="18"/>
         </w:rPr>
-        <w:t xml:space="preserve">Este manual descreve a plataforma em outubro de 2026. As referências legais remetem para os textos publicados no Diário da República e no EUR-Lex, disponíveis na Biblioteca Legal da plataforma.</w:t>
+        <w:t xml:space="preserve">Este manual (versão 1.2) descreve a plataforma em outubro de 2026. As referências legais remetem para os textos publicados no Diário da República e no EUR-Lex, disponíveis na Biblioteca Legal da plataforma.</w:t>
       </w:r>
     </w:p>
     <w:sectPr>
@@ -11816,7 +13229,7 @@
         <w:sz w:val="16"/>
         <w:szCs w:val="16"/>
       </w:rPr>
-      <w:t xml:space="preserve">     Manual de onboarding · NIS2 e ISO/IEC 27001</w:t>
+      <w:t xml:space="preserve">     Manual de onboarding · NIS2, ISO/IEC 27001 e ISO/IEC 42001</w:t>
     </w:r>
   </w:p>
 </w:hdr>
@@ -11945,6 +13358,330 @@
     </w:lvl>
   </w:abstractNum>
   <w:abstractNum w:abstractNumId="5" w15:restartNumberingAfterBreak="0">
+    <w:multiLevelType w:val="hybridMultilevel"/>
+    <w:lvl w:ilvl="0" w:tentative="1">
+      <w:start w:val="1"/>
+      <w:numFmt w:val="decimal"/>
+      <w:lvlText w:val="%1."/>
+      <w:lvlJc w:val="left"/>
+      <w:pPr>
+        <w:ind w:left="540" w:hanging="300"/>
+      </w:pPr>
+    </w:lvl>
+  </w:abstractNum>
+  <w:abstractNum w:abstractNumId="6" w15:restartNumberingAfterBreak="0">
+    <w:multiLevelType w:val="hybridMultilevel"/>
+    <w:lvl w:ilvl="0" w:tentative="1">
+      <w:start w:val="1"/>
+      <w:numFmt w:val="decimal"/>
+      <w:lvlText w:val="%1."/>
+      <w:lvlJc w:val="left"/>
+      <w:pPr>
+        <w:ind w:left="540" w:hanging="300"/>
+      </w:pPr>
+    </w:lvl>
+  </w:abstractNum>
+  <w:abstractNum w:abstractNumId="7" w15:restartNumberingAfterBreak="0">
+    <w:multiLevelType w:val="hybridMultilevel"/>
+    <w:lvl w:ilvl="0" w:tentative="1">
+      <w:start w:val="1"/>
+      <w:numFmt w:val="decimal"/>
+      <w:lvlText w:val="%1."/>
+      <w:lvlJc w:val="left"/>
+      <w:pPr>
+        <w:ind w:left="540" w:hanging="300"/>
+      </w:pPr>
+    </w:lvl>
+  </w:abstractNum>
+  <w:abstractNum w:abstractNumId="8" w15:restartNumberingAfterBreak="0">
+    <w:multiLevelType w:val="hybridMultilevel"/>
+    <w:lvl w:ilvl="0" w:tentative="1">
+      <w:start w:val="1"/>
+      <w:numFmt w:val="decimal"/>
+      <w:lvlText w:val="%1."/>
+      <w:lvlJc w:val="left"/>
+      <w:pPr>
+        <w:ind w:left="540" w:hanging="300"/>
+      </w:pPr>
+    </w:lvl>
+  </w:abstractNum>
+  <w:abstractNum w:abstractNumId="9" w15:restartNumberingAfterBreak="0">
+    <w:multiLevelType w:val="hybridMultilevel"/>
+    <w:lvl w:ilvl="0" w:tentative="1">
+      <w:start w:val="1"/>
+      <w:numFmt w:val="decimal"/>
+      <w:lvlText w:val="%1."/>
+      <w:lvlJc w:val="left"/>
+      <w:pPr>
+        <w:ind w:left="540" w:hanging="300"/>
+      </w:pPr>
+    </w:lvl>
+  </w:abstractNum>
+  <w:abstractNum w:abstractNumId="10" w15:restartNumberingAfterBreak="0">
+    <w:multiLevelType w:val="hybridMultilevel"/>
+    <w:lvl w:ilvl="0" w:tentative="1">
+      <w:start w:val="1"/>
+      <w:numFmt w:val="decimal"/>
+      <w:lvlText w:val="%1."/>
+      <w:lvlJc w:val="left"/>
+      <w:pPr>
+        <w:ind w:left="540" w:hanging="300"/>
+      </w:pPr>
+    </w:lvl>
+  </w:abstractNum>
+  <w:abstractNum w:abstractNumId="11" w15:restartNumberingAfterBreak="0">
+    <w:multiLevelType w:val="hybridMultilevel"/>
+    <w:lvl w:ilvl="0" w:tentative="1">
+      <w:start w:val="1"/>
+      <w:numFmt w:val="decimal"/>
+      <w:lvlText w:val="%1."/>
+      <w:lvlJc w:val="left"/>
+      <w:pPr>
+        <w:ind w:left="540" w:hanging="300"/>
+      </w:pPr>
+    </w:lvl>
+  </w:abstractNum>
+  <w:abstractNum w:abstractNumId="12" w15:restartNumberingAfterBreak="0">
+    <w:multiLevelType w:val="hybridMultilevel"/>
+    <w:lvl w:ilvl="0" w:tentative="1">
+      <w:start w:val="1"/>
+      <w:numFmt w:val="decimal"/>
+      <w:lvlText w:val="%1."/>
+      <w:lvlJc w:val="left"/>
+      <w:pPr>
+        <w:ind w:left="540" w:hanging="300"/>
+      </w:pPr>
+    </w:lvl>
+  </w:abstractNum>
+  <w:abstractNum w:abstractNumId="13" w15:restartNumberingAfterBreak="0">
+    <w:multiLevelType w:val="hybridMultilevel"/>
+    <w:lvl w:ilvl="0" w:tentative="1">
+      <w:start w:val="1"/>
+      <w:numFmt w:val="decimal"/>
+      <w:lvlText w:val="%1."/>
+      <w:lvlJc w:val="left"/>
+      <w:pPr>
+        <w:ind w:left="540" w:hanging="300"/>
+      </w:pPr>
+    </w:lvl>
+  </w:abstractNum>
+  <w:abstractNum w:abstractNumId="14" w15:restartNumberingAfterBreak="0">
+    <w:multiLevelType w:val="hybridMultilevel"/>
+    <w:lvl w:ilvl="0" w:tentative="1">
+      <w:start w:val="1"/>
+      <w:numFmt w:val="decimal"/>
+      <w:lvlText w:val="%1."/>
+      <w:lvlJc w:val="left"/>
+      <w:pPr>
+        <w:ind w:left="540" w:hanging="300"/>
+      </w:pPr>
+    </w:lvl>
+  </w:abstractNum>
+  <w:abstractNum w:abstractNumId="15" w15:restartNumberingAfterBreak="0">
+    <w:multiLevelType w:val="hybridMultilevel"/>
+    <w:lvl w:ilvl="0" w:tentative="1">
+      <w:start w:val="1"/>
+      <w:numFmt w:val="decimal"/>
+      <w:lvlText w:val="%1."/>
+      <w:lvlJc w:val="left"/>
+      <w:pPr>
+        <w:ind w:left="540" w:hanging="300"/>
+      </w:pPr>
+    </w:lvl>
+  </w:abstractNum>
+  <w:abstractNum w:abstractNumId="16" w15:restartNumberingAfterBreak="0">
+    <w:multiLevelType w:val="hybridMultilevel"/>
+    <w:lvl w:ilvl="0" w:tentative="1">
+      <w:start w:val="1"/>
+      <w:numFmt w:val="decimal"/>
+      <w:lvlText w:val="%1."/>
+      <w:lvlJc w:val="left"/>
+      <w:pPr>
+        <w:ind w:left="540" w:hanging="300"/>
+      </w:pPr>
+    </w:lvl>
+  </w:abstractNum>
+  <w:abstractNum w:abstractNumId="17" w15:restartNumberingAfterBreak="0">
+    <w:multiLevelType w:val="hybridMultilevel"/>
+    <w:lvl w:ilvl="0" w:tentative="1">
+      <w:start w:val="1"/>
+      <w:numFmt w:val="decimal"/>
+      <w:lvlText w:val="%1."/>
+      <w:lvlJc w:val="left"/>
+      <w:pPr>
+        <w:ind w:left="540" w:hanging="300"/>
+      </w:pPr>
+    </w:lvl>
+  </w:abstractNum>
+  <w:abstractNum w:abstractNumId="18" w15:restartNumberingAfterBreak="0">
+    <w:multiLevelType w:val="hybridMultilevel"/>
+    <w:lvl w:ilvl="0" w:tentative="1">
+      <w:start w:val="1"/>
+      <w:numFmt w:val="decimal"/>
+      <w:lvlText w:val="%1."/>
+      <w:lvlJc w:val="left"/>
+      <w:pPr>
+        <w:ind w:left="540" w:hanging="300"/>
+      </w:pPr>
+    </w:lvl>
+  </w:abstractNum>
+  <w:abstractNum w:abstractNumId="19" w15:restartNumberingAfterBreak="0">
+    <w:multiLevelType w:val="hybridMultilevel"/>
+    <w:lvl w:ilvl="0" w:tentative="1">
+      <w:start w:val="1"/>
+      <w:numFmt w:val="decimal"/>
+      <w:lvlText w:val="%1."/>
+      <w:lvlJc w:val="left"/>
+      <w:pPr>
+        <w:ind w:left="540" w:hanging="300"/>
+      </w:pPr>
+    </w:lvl>
+  </w:abstractNum>
+  <w:abstractNum w:abstractNumId="20" w15:restartNumberingAfterBreak="0">
+    <w:multiLevelType w:val="hybridMultilevel"/>
+    <w:lvl w:ilvl="0" w:tentative="1">
+      <w:start w:val="1"/>
+      <w:numFmt w:val="decimal"/>
+      <w:lvlText w:val="%1."/>
+      <w:lvlJc w:val="left"/>
+      <w:pPr>
+        <w:ind w:left="540" w:hanging="300"/>
+      </w:pPr>
+    </w:lvl>
+  </w:abstractNum>
+  <w:abstractNum w:abstractNumId="21" w15:restartNumberingAfterBreak="0">
+    <w:multiLevelType w:val="hybridMultilevel"/>
+    <w:lvl w:ilvl="0" w:tentative="1">
+      <w:start w:val="1"/>
+      <w:numFmt w:val="decimal"/>
+      <w:lvlText w:val="%1."/>
+      <w:lvlJc w:val="left"/>
+      <w:pPr>
+        <w:ind w:left="540" w:hanging="300"/>
+      </w:pPr>
+    </w:lvl>
+  </w:abstractNum>
+  <w:abstractNum w:abstractNumId="22" w15:restartNumberingAfterBreak="0">
+    <w:multiLevelType w:val="hybridMultilevel"/>
+    <w:lvl w:ilvl="0" w:tentative="1">
+      <w:start w:val="1"/>
+      <w:numFmt w:val="decimal"/>
+      <w:lvlText w:val="%1."/>
+      <w:lvlJc w:val="left"/>
+      <w:pPr>
+        <w:ind w:left="540" w:hanging="300"/>
+      </w:pPr>
+    </w:lvl>
+  </w:abstractNum>
+  <w:abstractNum w:abstractNumId="23" w15:restartNumberingAfterBreak="0">
+    <w:multiLevelType w:val="hybridMultilevel"/>
+    <w:lvl w:ilvl="0" w:tentative="1">
+      <w:start w:val="1"/>
+      <w:numFmt w:val="decimal"/>
+      <w:lvlText w:val="%1."/>
+      <w:lvlJc w:val="left"/>
+      <w:pPr>
+        <w:ind w:left="540" w:hanging="300"/>
+      </w:pPr>
+    </w:lvl>
+  </w:abstractNum>
+  <w:abstractNum w:abstractNumId="24" w15:restartNumberingAfterBreak="0">
+    <w:multiLevelType w:val="hybridMultilevel"/>
+    <w:lvl w:ilvl="0" w:tentative="1">
+      <w:start w:val="1"/>
+      <w:numFmt w:val="decimal"/>
+      <w:lvlText w:val="%1."/>
+      <w:lvlJc w:val="left"/>
+      <w:pPr>
+        <w:ind w:left="540" w:hanging="300"/>
+      </w:pPr>
+    </w:lvl>
+  </w:abstractNum>
+  <w:abstractNum w:abstractNumId="25" w15:restartNumberingAfterBreak="0">
+    <w:multiLevelType w:val="hybridMultilevel"/>
+    <w:lvl w:ilvl="0" w:tentative="1">
+      <w:start w:val="1"/>
+      <w:numFmt w:val="decimal"/>
+      <w:lvlText w:val="%1."/>
+      <w:lvlJc w:val="left"/>
+      <w:pPr>
+        <w:ind w:left="540" w:hanging="300"/>
+      </w:pPr>
+    </w:lvl>
+  </w:abstractNum>
+  <w:abstractNum w:abstractNumId="26" w15:restartNumberingAfterBreak="0">
+    <w:multiLevelType w:val="hybridMultilevel"/>
+    <w:lvl w:ilvl="0" w:tentative="1">
+      <w:start w:val="1"/>
+      <w:numFmt w:val="decimal"/>
+      <w:lvlText w:val="%1."/>
+      <w:lvlJc w:val="left"/>
+      <w:pPr>
+        <w:ind w:left="540" w:hanging="300"/>
+      </w:pPr>
+    </w:lvl>
+  </w:abstractNum>
+  <w:abstractNum w:abstractNumId="27" w15:restartNumberingAfterBreak="0">
+    <w:multiLevelType w:val="hybridMultilevel"/>
+    <w:lvl w:ilvl="0" w:tentative="1">
+      <w:start w:val="1"/>
+      <w:numFmt w:val="decimal"/>
+      <w:lvlText w:val="%1."/>
+      <w:lvlJc w:val="left"/>
+      <w:pPr>
+        <w:ind w:left="540" w:hanging="300"/>
+      </w:pPr>
+    </w:lvl>
+  </w:abstractNum>
+  <w:abstractNum w:abstractNumId="28" w15:restartNumberingAfterBreak="0">
+    <w:multiLevelType w:val="hybridMultilevel"/>
+    <w:lvl w:ilvl="0" w:tentative="1">
+      <w:start w:val="1"/>
+      <w:numFmt w:val="decimal"/>
+      <w:lvlText w:val="%1."/>
+      <w:lvlJc w:val="left"/>
+      <w:pPr>
+        <w:ind w:left="540" w:hanging="300"/>
+      </w:pPr>
+    </w:lvl>
+  </w:abstractNum>
+  <w:abstractNum w:abstractNumId="29" w15:restartNumberingAfterBreak="0">
+    <w:multiLevelType w:val="hybridMultilevel"/>
+    <w:lvl w:ilvl="0" w:tentative="1">
+      <w:start w:val="1"/>
+      <w:numFmt w:val="decimal"/>
+      <w:lvlText w:val="%1."/>
+      <w:lvlJc w:val="left"/>
+      <w:pPr>
+        <w:ind w:left="540" w:hanging="300"/>
+      </w:pPr>
+    </w:lvl>
+  </w:abstractNum>
+  <w:abstractNum w:abstractNumId="30" w15:restartNumberingAfterBreak="0">
+    <w:multiLevelType w:val="hybridMultilevel"/>
+    <w:lvl w:ilvl="0" w:tentative="1">
+      <w:start w:val="1"/>
+      <w:numFmt w:val="decimal"/>
+      <w:lvlText w:val="%1."/>
+      <w:lvlJc w:val="left"/>
+      <w:pPr>
+        <w:ind w:left="540" w:hanging="300"/>
+      </w:pPr>
+    </w:lvl>
+  </w:abstractNum>
+  <w:abstractNum w:abstractNumId="31" w15:restartNumberingAfterBreak="0">
+    <w:multiLevelType w:val="hybridMultilevel"/>
+    <w:lvl w:ilvl="0" w:tentative="1">
+      <w:start w:val="1"/>
+      <w:numFmt w:val="decimal"/>
+      <w:lvlText w:val="%1."/>
+      <w:lvlJc w:val="left"/>
+      <w:pPr>
+        <w:ind w:left="540" w:hanging="300"/>
+      </w:pPr>
+    </w:lvl>
+  </w:abstractNum>
+  <w:abstractNum w:abstractNumId="32" w15:restartNumberingAfterBreak="0">
     <w:multiLevelType w:val="hybridMultilevel"/>
     <w:lvl w:ilvl="0" w:tentative="1">
       <w:start w:val="1"/>
@@ -11975,13 +13712,25 @@
     </w:lvlOverride>
   </w:num>
   <w:num w:numId="4">
+    <w:abstractNumId w:val="6"/>
+    <w:lvlOverride w:ilvl="0">
+      <w:startOverride w:val="1"/>
+    </w:lvlOverride>
+  </w:num>
+  <w:num w:numId="5">
     <w:abstractNumId w:val="4"/>
     <w:lvlOverride w:ilvl="0">
       <w:startOverride w:val="1"/>
     </w:lvlOverride>
   </w:num>
-  <w:num w:numId="5">
+  <w:num w:numId="6">
     <w:abstractNumId w:val="5"/>
+    <w:lvlOverride w:ilvl="0">
+      <w:startOverride w:val="1"/>
+    </w:lvlOverride>
+  </w:num>
+  <w:num w:numId="7">
+    <w:abstractNumId w:val="7"/>
     <w:lvlOverride w:ilvl="0">
       <w:startOverride w:val="1"/>
     </w:lvlOverride>

</xml_diff>

<commit_message>
Correções da verificação de factos: relatório anual (primeiro em janeiro de 2029), alterações do registo (3 meses no art. 35.º, n.º 4), autoidentificação (60 dias após a plataforma), aprovação da SoA pela gestão
Também na jornada da aplicação e no guia ISO/IEC 27001.

Co-Authored-By: Claude Opus 5.5 <noreply@anthropic.com>
Claude-Session: https://claude.ai/code/session_011qfYtmLnj2mXUr5QojdZqn
</commit_message>
<xml_diff>
--- a/docs/onboarding/AnkoraOne-Manual-Onboarding.docx
+++ b/docs/onboarding/AnkoraOne-Manual-Onboarding.docx
@@ -2249,7 +2249,7 @@
           <w:b/>
           <w:bCs/>
         </w:rPr>
-        <w:t xml:space="preserve">Tipo de entidade:</w:t>
+        <w:t xml:space="preserve">Estabelecimento:</w:t>
       </w:r>
       <w:r>
         <w:rPr>
@@ -8654,7 +8654,7 @@
               <w:rPr>
                 <w:rFonts w:ascii="Calibri" w:cs="Calibri" w:eastAsia="Calibri" w:hAnsi="Calibri"/>
               </w:rPr>
-              <w:t xml:space="preserve">30 dias úteis</w:t>
+              <w:t xml:space="preserve">30 dias úteis (3 meses para os prestadores digitais do art. 35.º, n.º 4)</w:t>
             </w:r>
           </w:p>
         </w:tc>
@@ -8682,7 +8682,7 @@
               <w:rPr>
                 <w:rFonts w:ascii="Calibri" w:cs="Calibri" w:eastAsia="Calibri" w:hAnsi="Calibri"/>
               </w:rPr>
-              <w:t xml:space="preserve">RJC, art. 35.º; Reg. 756/2026, art. 11.º</w:t>
+              <w:t xml:space="preserve">RJC, art. 35.º, n.os 3 e 4; Reg. 756/2026, art. 11.º</w:t>
             </w:r>
           </w:p>
         </w:tc>
@@ -9188,7 +9188,7 @@
               <w:rPr>
                 <w:rFonts w:ascii="Calibri" w:cs="Calibri" w:eastAsia="Calibri" w:hAnsi="Calibri"/>
               </w:rPr>
-              <w:t xml:space="preserve">Último dia útil de janeiro, a partir de 2028</w:t>
+              <w:t xml:space="preserve">Último dia útil de janeiro do ano seguinte; o primeiro em janeiro de 2029, relativo a 2028</w:t>
             </w:r>
           </w:p>
         </w:tc>

</xml_diff>

<commit_message>
Onboarding v1.2 e guias de implementação NIS2, ISO/IEC 27001 e ISO/IEC 42001 (#49)
* Onboarding v1.2: apresentação e manual revistos, ISO/IEC 42001 e guias NIS2, ISO 27001 e ISO 42001

Rascunho à espera da verificação de factos.

Co-Authored-By: Claude Opus 5.5 <noreply@anthropic.com>
Claude-Session: https://claude.ai/code/session_011qfYtmLnj2mXUr5QojdZqn

* Correções da verificação de factos: relatório anual (primeiro em janeiro de 2029), alterações do registo (3 meses no art. 35.º, n.º 4), autoidentificação (60 dias após a plataforma), aprovação da SoA pela gestão

Também na jornada da aplicação e no guia ISO/IEC 27001.

Co-Authored-By: Claude Opus 5.5 <noreply@anthropic.com>
Claude-Session: https://claude.ai/code/session_011qfYtmLnj2mXUr5QojdZqn

---------

Co-authored-by: Claude <noreply@anthropic.com>
</commit_message>
<xml_diff>
--- a/docs/onboarding/AnkoraOne-Manual-Onboarding.docx
+++ b/docs/onboarding/AnkoraOne-Manual-Onboarding.docx
@@ -103,7 +103,7 @@
           </w:p>
           <w:p>
             <w:pPr>
-              <w:spacing w:after="240" w:line="320"/>
+              <w:spacing w:after="240"/>
             </w:pPr>
             <w:r>
               <w:rPr>
@@ -128,7 +128,7 @@
                 <w:sz w:val="24"/>
                 <w:szCs w:val="24"/>
               </w:rPr>
-              <w:t xml:space="preserve">Para novos clientes que adotam o Regime Jurídico da Cibersegurança (NIS2) e a ISO/IEC 27001: criação da conta, navegação, uso diário e guia de cada referencial disponível na plataforma.</w:t>
+              <w:t xml:space="preserve">Para novos clientes que adotam o Regime Jurídico da Cibersegurança (NIS2), a ISO/IEC 27001 e a ISO/IEC 42001: criação da conta, navegação, uso diário e guia de cada referencial disponível na plataforma.</w:t>
             </w:r>
           </w:p>
           <w:p>
@@ -142,7 +142,7 @@
                 <w:sz w:val="20"/>
                 <w:szCs w:val="20"/>
               </w:rPr>
-              <w:t xml:space="preserve">Versão 1.1 · outubro de 2026</w:t>
+              <w:t xml:space="preserve">Versão 1.2 · outubro de 2026</w:t>
             </w:r>
           </w:p>
           <w:p>
@@ -366,7 +366,7 @@
         <w:rPr>
           <w:rFonts w:ascii="Calibri" w:cs="Calibri" w:eastAsia="Calibri" w:hAnsi="Calibri"/>
         </w:rPr>
-        <w:t xml:space="preserve">Guardar evidências e documentos de forma privada, com versões, validade e aprovação.</w:t>
+        <w:t xml:space="preserve">Guardar evidências e documentos de forma privada, com versões, validade e aprovação, no repositório que escolher.</w:t>
       </w:r>
     </w:p>
     <w:p>
@@ -382,7 +382,39 @@
         <w:rPr>
           <w:rFonts w:ascii="Calibri" w:cs="Calibri" w:eastAsia="Calibri" w:hAnsi="Calibri"/>
         </w:rPr>
-        <w:t xml:space="preserve">Medir a maturidade por referencial (NIS2, ISO/IEC 27001 e outros) e transformar as lacunas num plano de ação.</w:t>
+        <w:t xml:space="preserve">Carregar documentos que já tem e deixar a plataforma propor a que medida, tarefa ou controlo pertencem.</w:t>
+      </w:r>
+    </w:p>
+    <w:p>
+      <w:pPr>
+        <w:pStyle w:val="ListParagraph"/>
+        <w:numPr>
+          <w:ilvl w:val="0"/>
+          <w:numId w:val="2"/>
+        </w:numPr>
+        <w:spacing w:after="80" w:line="276"/>
+      </w:pPr>
+      <w:r>
+        <w:rPr>
+          <w:rFonts w:ascii="Calibri" w:cs="Calibri" w:eastAsia="Calibri" w:hAnsi="Calibri"/>
+        </w:rPr>
+        <w:t xml:space="preserve">Medir a maturidade por referencial (NIS2, ISO/IEC 27001, ISO/IEC 42001 e outros) e transformar as lacunas num plano de ação.</w:t>
+      </w:r>
+    </w:p>
+    <w:p>
+      <w:pPr>
+        <w:pStyle w:val="ListParagraph"/>
+        <w:numPr>
+          <w:ilvl w:val="0"/>
+          <w:numId w:val="2"/>
+        </w:numPr>
+        <w:spacing w:after="80" w:line="276"/>
+      </w:pPr>
+      <w:r>
+        <w:rPr>
+          <w:rFonts w:ascii="Calibri" w:cs="Calibri" w:eastAsia="Calibri" w:hAnsi="Calibri"/>
+        </w:rPr>
+        <w:t xml:space="preserve">Preparar a Declaração de Aplicabilidade e a análise de lacunas da ISO/IEC 27001 e da ISO/IEC 42001.</w:t>
       </w:r>
     </w:p>
     <w:p>
@@ -1432,7 +1464,7 @@
               <w:rPr>
                 <w:rFonts w:ascii="Calibri" w:cs="Calibri" w:eastAsia="Calibri" w:hAnsi="Calibri"/>
               </w:rPr>
-              <w:t xml:space="preserve">Referenciais a seguir (por exemplo NIS2 e ISO/IEC 27001)</w:t>
+              <w:t xml:space="preserve">Referenciais a seguir (por exemplo NIS2, ISO/IEC 27001 e, se a entidade desenvolve ou usa IA, ISO/IEC 42001)</w:t>
             </w:r>
           </w:p>
         </w:tc>
@@ -1461,6 +1493,67 @@
                 <w:rFonts w:ascii="Calibri" w:cs="Calibri" w:eastAsia="Calibri" w:hAnsi="Calibri"/>
               </w:rPr>
               <w:t xml:space="preserve">Referenciais permitidos e licença</w:t>
+            </w:r>
+          </w:p>
+        </w:tc>
+      </w:tr>
+      <w:tr>
+        <w:trPr>
+          <w:cantSplit/>
+        </w:trPr>
+        <w:tc>
+          <w:tcPr>
+            <w:tcW w:type="dxa" w:w="4565"/>
+            <w:tcBorders>
+              <w:top w:val="single" w:color="D9DEE7" w:sz="4"/>
+              <w:left w:val="single" w:color="D9DEE7" w:sz="4"/>
+              <w:bottom w:val="single" w:color="D9DEE7" w:sz="4"/>
+              <w:right w:val="single" w:color="D9DEE7" w:sz="4"/>
+            </w:tcBorders>
+            <w:tcMar>
+              <w:top w:type="dxa" w:w="80"/>
+              <w:left w:type="dxa" w:w="110"/>
+              <w:bottom w:type="dxa" w:w="80"/>
+              <w:right w:type="dxa" w:w="110"/>
+            </w:tcMar>
+          </w:tcPr>
+          <w:p>
+            <w:pPr>
+              <w:spacing w:after="40"/>
+            </w:pPr>
+            <w:r>
+              <w:rPr>
+                <w:rFonts w:ascii="Calibri" w:cs="Calibri" w:eastAsia="Calibri" w:hAnsi="Calibri"/>
+              </w:rPr>
+              <w:t xml:space="preserve">Se usa ou desenvolve sistemas de IA: lista dos sistemas e do papel da entidade em cada um (fornecedor, utilizador…)</w:t>
+            </w:r>
+          </w:p>
+        </w:tc>
+        <w:tc>
+          <w:tcPr>
+            <w:tcW w:type="dxa" w:w="5073"/>
+            <w:tcBorders>
+              <w:top w:val="single" w:color="D9DEE7" w:sz="4"/>
+              <w:left w:val="single" w:color="D9DEE7" w:sz="4"/>
+              <w:bottom w:val="single" w:color="D9DEE7" w:sz="4"/>
+              <w:right w:val="single" w:color="D9DEE7" w:sz="4"/>
+            </w:tcBorders>
+            <w:tcMar>
+              <w:top w:type="dxa" w:w="80"/>
+              <w:left w:type="dxa" w:w="110"/>
+              <w:bottom w:type="dxa" w:w="80"/>
+              <w:right w:type="dxa" w:w="110"/>
+            </w:tcMar>
+          </w:tcPr>
+          <w:p>
+            <w:pPr>
+              <w:spacing w:after="40"/>
+            </w:pPr>
+            <w:r>
+              <w:rPr>
+                <w:rFonts w:ascii="Calibri" w:cs="Calibri" w:eastAsia="Calibri" w:hAnsi="Calibri"/>
+              </w:rPr>
+              <w:t xml:space="preserve">Âmbito da ISO/IEC 42001</w:t>
             </w:r>
           </w:p>
         </w:tc>
@@ -2156,7 +2249,7 @@
           <w:b/>
           <w:bCs/>
         </w:rPr>
-        <w:t xml:space="preserve">Tipo de entidade:</w:t>
+        <w:t xml:space="preserve">Estabelecimento:</w:t>
       </w:r>
       <w:r>
         <w:rPr>
@@ -2734,7 +2827,7 @@
         <w:rPr>
           <w:rFonts w:ascii="Calibri" w:cs="Calibri" w:eastAsia="Calibri" w:hAnsi="Calibri"/>
         </w:rPr>
-        <w:t xml:space="preserve">A licença define os módulos disponíveis, os referenciais e o número de utilizadores (mínimo de 5).</w:t>
+        <w:t xml:space="preserve">A licença define os módulos disponíveis, os referenciais (NIS2, QNRCS, ISO/IEC 27001, ISO/IEC 42001, DORA e outros) e o número de utilizadores (mínimo de 5).</w:t>
       </w:r>
     </w:p>
     <w:tbl>
@@ -3381,6 +3474,31 @@
         </w:tc>
       </w:tr>
     </w:tbl>
+    <w:p>
+      <w:pPr>
+        <w:spacing w:after="120" w:line="288"/>
+      </w:pPr>
+      <w:r>
+        <w:rPr>
+          <w:rFonts w:ascii="Calibri" w:cs="Calibri" w:eastAsia="Calibri" w:hAnsi="Calibri"/>
+        </w:rPr>
+        <w:t xml:space="preserve">Na ficha do cliente escolhe-se também a </w:t>
+      </w:r>
+      <w:r>
+        <w:rPr>
+          <w:rFonts w:ascii="Calibri" w:cs="Calibri" w:eastAsia="Calibri" w:hAnsi="Calibri"/>
+          <w:b/>
+          <w:bCs/>
+        </w:rPr>
+        <w:t xml:space="preserve">localização</w:t>
+      </w:r>
+      <w:r>
+        <w:rPr>
+          <w:rFonts w:ascii="Calibri" w:cs="Calibri" w:eastAsia="Calibri" w:hAnsi="Calibri"/>
+        </w:rPr>
+        <w:t xml:space="preserve"> (por omissão, AnkoraOne/&lt;nome da entidade&gt;). Dentro dela, a plataforma usa sempre as mesmas 13 pastas, de «00 Por classificar» a «99 Outros», para que a estrutura seja igual em todos os clientes. Mudar de repositório ou de localização só afeta os ficheiros novos.</w:t>
+      </w:r>
+    </w:p>
     <w:p>
       <w:pPr>
         <w:pStyle w:val="Heading1"/>
@@ -3898,7 +4016,7 @@
               <w:rPr>
                 <w:rFonts w:ascii="Calibri" w:cs="Calibri" w:eastAsia="Calibri" w:hAnsi="Calibri"/>
               </w:rPr>
-              <w:t xml:space="preserve">Documentos · Auditoria de Documentos · Cadeia de Abastecimento · Fornecedores</w:t>
+              <w:t xml:space="preserve">Documentos · Repositório documental · Auditoria de Documentos · Cadeia de Abastecimento · Fornecedores</w:t>
             </w:r>
           </w:p>
         </w:tc>
@@ -3926,7 +4044,7 @@
               <w:rPr>
                 <w:rFonts w:ascii="Calibri" w:cs="Calibri" w:eastAsia="Calibri" w:hAnsi="Calibri"/>
               </w:rPr>
-              <w:t xml:space="preserve">Políticas aprovadas e relação com terceiros</w:t>
+              <w:t xml:space="preserve">Políticas aprovadas, todos os ficheiros num sítio e relação com terceiros</w:t>
             </w:r>
           </w:p>
         </w:tc>
@@ -5733,7 +5851,7 @@
         <w:rPr>
           <w:rFonts w:ascii="Calibri" w:cs="Calibri" w:eastAsia="Calibri" w:hAnsi="Calibri"/>
         </w:rPr>
-        <w:t xml:space="preserve">5.5 Avaliações de maturidade</w:t>
+        <w:t xml:space="preserve">5.5 Repositório documental e documentos por classificar</w:t>
       </w:r>
     </w:p>
     <w:p>
@@ -5743,8 +5861,264 @@
       <w:r>
         <w:rPr>
           <w:rFonts w:ascii="Calibri" w:cs="Calibri" w:eastAsia="Calibri" w:hAnsi="Calibri"/>
-        </w:rPr>
-        <w:t xml:space="preserve">O consultor cria a avaliação com os referenciais escolhidos (por exemplo NIS2 e ISO/IEC 27001). A equipa responde a cada pergunta com a escala:</w:t>
+          <w:b/>
+          <w:bCs/>
+        </w:rPr>
+        <w:t xml:space="preserve">Governar › Repositório documental</w:t>
+      </w:r>
+      <w:r>
+        <w:rPr>
+          <w:rFonts w:ascii="Calibri" w:cs="Calibri" w:eastAsia="Calibri" w:hAnsi="Calibri"/>
+        </w:rPr>
+        <w:t xml:space="preserve"> mostra todos os ficheiros do cliente (evidências, documentos, relatórios) arrumados pelas 13 pastas, abertos sempre pela plataforma e com registo de cada abertura.</w:t>
+      </w:r>
+    </w:p>
+    <w:p>
+      <w:pPr>
+        <w:spacing w:after="120" w:line="288"/>
+      </w:pPr>
+      <w:r>
+        <w:rPr>
+          <w:rFonts w:ascii="Calibri" w:cs="Calibri" w:eastAsia="Calibri" w:hAnsi="Calibri"/>
+        </w:rPr>
+        <w:t xml:space="preserve">Na área </w:t>
+      </w:r>
+      <w:r>
+        <w:rPr>
+          <w:rFonts w:ascii="Calibri" w:cs="Calibri" w:eastAsia="Calibri" w:hAnsi="Calibri"/>
+          <w:b/>
+          <w:bCs/>
+        </w:rPr>
+        <w:t xml:space="preserve">Por classificar</w:t>
+      </w:r>
+      <w:r>
+        <w:rPr>
+          <w:rFonts w:ascii="Calibri" w:cs="Calibri" w:eastAsia="Calibri" w:hAnsi="Calibri"/>
+        </w:rPr>
+        <w:t xml:space="preserve"> (administradores) pode carregar documentos que já existem na organização, ou pô-los diretamente na pasta «00 Por classificar» do Google Drive, OneDrive ou NAS e carregar em </w:t>
+      </w:r>
+      <w:r>
+        <w:rPr>
+          <w:rFonts w:ascii="Calibri" w:cs="Calibri" w:eastAsia="Calibri" w:hAnsi="Calibri"/>
+          <w:b/>
+          <w:bCs/>
+        </w:rPr>
+        <w:t xml:space="preserve">Procurar na pasta</w:t>
+      </w:r>
+      <w:r>
+        <w:rPr>
+          <w:rFonts w:ascii="Calibri" w:cs="Calibri" w:eastAsia="Calibri" w:hAnsi="Calibri"/>
+        </w:rPr>
+        <w:t xml:space="preserve">. Depois:</w:t>
+      </w:r>
+    </w:p>
+    <w:p>
+      <w:pPr>
+        <w:pStyle w:val="ListParagraph"/>
+        <w:numPr>
+          <w:ilvl w:val="0"/>
+          <w:numId w:val="4"/>
+        </w:numPr>
+        <w:spacing w:after="80" w:line="276"/>
+      </w:pPr>
+      <w:r>
+        <w:rPr>
+          <w:rFonts w:ascii="Calibri" w:cs="Calibri" w:eastAsia="Calibri" w:hAnsi="Calibri"/>
+        </w:rPr>
+        <w:t xml:space="preserve">A plataforma pré-seleciona, sem IA, as medidas, tarefas da jornada e controlos ISO com texto parecido.</w:t>
+      </w:r>
+    </w:p>
+    <w:p>
+      <w:pPr>
+        <w:pStyle w:val="ListParagraph"/>
+        <w:numPr>
+          <w:ilvl w:val="0"/>
+          <w:numId w:val="4"/>
+        </w:numPr>
+        <w:spacing w:after="80" w:line="276"/>
+      </w:pPr>
+      <w:r>
+        <w:rPr>
+          <w:rFonts w:ascii="Calibri" w:cs="Calibri" w:eastAsia="Calibri" w:hAnsi="Calibri"/>
+        </w:rPr>
+        <w:t xml:space="preserve">Com o assistente de IA, </w:t>
+      </w:r>
+      <w:r>
+        <w:rPr>
+          <w:rFonts w:ascii="Calibri" w:cs="Calibri" w:eastAsia="Calibri" w:hAnsi="Calibri"/>
+          <w:b/>
+          <w:bCs/>
+        </w:rPr>
+        <w:t xml:space="preserve">Classificar</w:t>
+      </w:r>
+      <w:r>
+        <w:rPr>
+          <w:rFonts w:ascii="Calibri" w:cs="Calibri" w:eastAsia="Calibri" w:hAnsi="Calibri"/>
+        </w:rPr>
+        <w:t xml:space="preserve"> (ou </w:t>
+      </w:r>
+      <w:r>
+        <w:rPr>
+          <w:rFonts w:ascii="Calibri" w:cs="Calibri" w:eastAsia="Calibri" w:hAnsi="Calibri"/>
+          <w:b/>
+          <w:bCs/>
+        </w:rPr>
+        <w:t xml:space="preserve">Classificar todos</w:t>
+      </w:r>
+      <w:r>
+        <w:rPr>
+          <w:rFonts w:ascii="Calibri" w:cs="Calibri" w:eastAsia="Calibri" w:hAnsi="Calibri"/>
+        </w:rPr>
+        <w:t xml:space="preserve">, até 25 de cada vez) propõe o tipo de documento e até 8 ligações, cada uma com um excerto do documento que a justifica e uma confiança.</w:t>
+      </w:r>
+    </w:p>
+    <w:p>
+      <w:pPr>
+        <w:pStyle w:val="ListParagraph"/>
+        <w:numPr>
+          <w:ilvl w:val="0"/>
+          <w:numId w:val="4"/>
+        </w:numPr>
+        <w:spacing w:after="80" w:line="276"/>
+      </w:pPr>
+      <w:r>
+        <w:rPr>
+          <w:rFonts w:ascii="Calibri" w:cs="Calibri" w:eastAsia="Calibri" w:hAnsi="Calibri"/>
+        </w:rPr>
+        <w:t xml:space="preserve">Uma pessoa revê, marca as ligações certas e indexa. O documento passa a evidência </w:t>
+      </w:r>
+      <w:r>
+        <w:rPr>
+          <w:rFonts w:ascii="Calibri" w:cs="Calibri" w:eastAsia="Calibri" w:hAnsi="Calibri"/>
+          <w:b/>
+          <w:bCs/>
+        </w:rPr>
+        <w:t xml:space="preserve">Por rever</w:t>
+      </w:r>
+      <w:r>
+        <w:rPr>
+          <w:rFonts w:ascii="Calibri" w:cs="Calibri" w:eastAsia="Calibri" w:hAnsi="Calibri"/>
+        </w:rPr>
+        <w:t xml:space="preserve">; nenhuma medida ou tarefa muda de estado sozinha.</w:t>
+      </w:r>
+    </w:p>
+    <w:p>
+      <w:pPr>
+        <w:spacing w:after="120" w:line="288"/>
+      </w:pPr>
+      <w:r>
+        <w:rPr>
+          <w:rFonts w:ascii="Calibri" w:cs="Calibri" w:eastAsia="Calibri" w:hAnsi="Calibri"/>
+        </w:rPr>
+        <w:t xml:space="preserve">O painel </w:t>
+      </w:r>
+      <w:r>
+        <w:rPr>
+          <w:rFonts w:ascii="Calibri" w:cs="Calibri" w:eastAsia="Calibri" w:hAnsi="Calibri"/>
+          <w:b/>
+          <w:bCs/>
+        </w:rPr>
+        <w:t xml:space="preserve">Qualidade das propostas</w:t>
+      </w:r>
+      <w:r>
+        <w:rPr>
+          <w:rFonts w:ascii="Calibri" w:cs="Calibri" w:eastAsia="Calibri" w:hAnsi="Calibri"/>
+        </w:rPr>
+        <w:t xml:space="preserve"> mostra quantas ligações propostas as pessoas mantêm, por nível de confiança, para saber até que ponto pode confiar nas propostas.</w:t>
+      </w:r>
+    </w:p>
+    <w:tbl>
+      <w:tblPr>
+        <w:tblW w:type="dxa" w:w="9638"/>
+        <w:tblBorders>
+          <w:top w:val="single" w:color="auto" w:sz="4"/>
+          <w:left w:val="single" w:color="auto" w:sz="4"/>
+          <w:bottom w:val="single" w:color="auto" w:sz="4"/>
+          <w:right w:val="single" w:color="auto" w:sz="4"/>
+          <w:insideH w:val="single" w:color="auto" w:sz="4"/>
+          <w:insideV w:val="single" w:color="auto" w:sz="4"/>
+        </w:tblBorders>
+      </w:tblPr>
+      <w:tblGrid>
+        <w:gridCol w:w="9638"/>
+      </w:tblGrid>
+      <w:tr>
+        <w:tc>
+          <w:tcPr>
+            <w:tcW w:type="dxa" w:w="9638"/>
+            <w:tcBorders>
+              <w:top w:val="single" w:color="F4F1EA" w:sz="4"/>
+              <w:left w:val="single" w:color="F4F1EA" w:sz="4"/>
+              <w:bottom w:val="single" w:color="F4F1EA" w:sz="4"/>
+              <w:right w:val="single" w:color="F4F1EA" w:sz="4"/>
+            </w:tcBorders>
+            <w:shd w:fill="F4F1EA" w:color="auto" w:val="clear"/>
+            <w:tcMar>
+              <w:top w:type="dxa" w:w="140"/>
+              <w:left w:type="dxa" w:w="200"/>
+              <w:bottom w:type="dxa" w:w="140"/>
+              <w:right w:type="dxa" w:w="200"/>
+            </w:tcMar>
+          </w:tcPr>
+          <w:p>
+            <w:pPr>
+              <w:spacing w:after="80"/>
+            </w:pPr>
+            <w:r>
+              <w:rPr>
+                <w:rFonts w:ascii="Calibri" w:cs="Calibri" w:eastAsia="Calibri" w:hAnsi="Calibri"/>
+                <w:b/>
+                <w:bCs/>
+                <w:color w:val="8A6620"/>
+              </w:rPr>
+              <w:t xml:space="preserve">Limites</w:t>
+            </w:r>
+          </w:p>
+          <w:p>
+            <w:pPr>
+              <w:spacing w:after="60" w:line="276"/>
+            </w:pPr>
+            <w:r>
+              <w:rPr>
+                <w:rFonts w:ascii="Calibri" w:cs="Calibri" w:eastAsia="Calibri" w:hAnsi="Calibri"/>
+              </w:rPr>
+              <w:t xml:space="preserve">PDF e imagens seguem para o modelo como ficheiro; DOCX, XLSX, PPTX e texto seguem como texto extraído. Formatos antigos (.doc, .xls, .ppt) não são lidos.</w:t>
+            </w:r>
+          </w:p>
+          <w:p>
+            <w:pPr>
+              <w:spacing w:after="60" w:line="276"/>
+            </w:pPr>
+            <w:r>
+              <w:rPr>
+                <w:rFonts w:ascii="Calibri" w:cs="Calibri" w:eastAsia="Calibri" w:hAnsi="Calibri"/>
+              </w:rPr>
+              <w:t xml:space="preserve">Documentos com endereços de ativos expostos à Internet (lista do art. 32.º) nunca seguem para a IA.</w:t>
+            </w:r>
+          </w:p>
+        </w:tc>
+      </w:tr>
+    </w:tbl>
+    <w:p>
+      <w:pPr>
+        <w:pStyle w:val="Heading2"/>
+      </w:pPr>
+      <w:r>
+        <w:rPr>
+          <w:rFonts w:ascii="Calibri" w:cs="Calibri" w:eastAsia="Calibri" w:hAnsi="Calibri"/>
+        </w:rPr>
+        <w:t xml:space="preserve">5.6 Avaliações de maturidade</w:t>
+      </w:r>
+    </w:p>
+    <w:p>
+      <w:pPr>
+        <w:spacing w:after="120" w:line="288"/>
+      </w:pPr>
+      <w:r>
+        <w:rPr>
+          <w:rFonts w:ascii="Calibri" w:cs="Calibri" w:eastAsia="Calibri" w:hAnsi="Calibri"/>
+        </w:rPr>
+        <w:t xml:space="preserve">O consultor cria a avaliação com os referenciais escolhidos (por exemplo NIS2, ISO/IEC 27001 e ISO/IEC 42001). A equipa responde a cada pergunta com a escala:</w:t>
       </w:r>
     </w:p>
     <w:tbl>
@@ -6236,7 +6610,7 @@
         <w:rPr>
           <w:rFonts w:ascii="Calibri" w:cs="Calibri" w:eastAsia="Calibri" w:hAnsi="Calibri"/>
         </w:rPr>
-        <w:t xml:space="preserve">5.6 Riscos, incidentes e vulnerabilidades</w:t>
+        <w:t xml:space="preserve">5.7 Riscos, incidentes e vulnerabilidades</w:t>
       </w:r>
     </w:p>
     <w:p>
@@ -6319,7 +6693,7 @@
         <w:rPr>
           <w:rFonts w:ascii="Calibri" w:cs="Calibri" w:eastAsia="Calibri" w:hAnsi="Calibri"/>
         </w:rPr>
-        <w:t xml:space="preserve">5.7 Fornecedores e cadeia de abastecimento</w:t>
+        <w:t xml:space="preserve">5.8 Fornecedores e cadeia de abastecimento</w:t>
       </w:r>
     </w:p>
     <w:p>
@@ -6341,7 +6715,7 @@
         <w:rPr>
           <w:rFonts w:ascii="Calibri" w:cs="Calibri" w:eastAsia="Calibri" w:hAnsi="Calibri"/>
         </w:rPr>
-        <w:t xml:space="preserve">5.8 Ativos e lista do art. 32.º</w:t>
+        <w:t xml:space="preserve">5.9 Ativos e lista do art. 32.º</w:t>
       </w:r>
     </w:p>
     <w:p>
@@ -6391,7 +6765,7 @@
         <w:rPr>
           <w:rFonts w:ascii="Calibri" w:cs="Calibri" w:eastAsia="Calibri" w:hAnsi="Calibri"/>
         </w:rPr>
-        <w:t xml:space="preserve">5.9 Relatórios</w:t>
+        <w:t xml:space="preserve">5.10 Relatórios</w:t>
       </w:r>
     </w:p>
     <w:p>
@@ -6427,7 +6801,7 @@
         <w:rPr>
           <w:rFonts w:ascii="Calibri" w:cs="Calibri" w:eastAsia="Calibri" w:hAnsi="Calibri"/>
         </w:rPr>
-        <w:t xml:space="preserve">5.10 Assistente de IA</w:t>
+        <w:t xml:space="preserve">5.11 Assistente de IA</w:t>
       </w:r>
     </w:p>
     <w:p>
@@ -6502,7 +6876,23 @@
         <w:rPr>
           <w:rFonts w:ascii="Calibri" w:cs="Calibri" w:eastAsia="Calibri" w:hAnsi="Calibri"/>
         </w:rPr>
-        <w:t xml:space="preserve">questionários a fornecedores, leitura de respostas por email e recomendações de melhoria.</w:t>
+        <w:t xml:space="preserve">questionários a fornecedores, leitura de respostas por email e recomendações de melhoria;</w:t>
+      </w:r>
+    </w:p>
+    <w:p>
+      <w:pPr>
+        <w:pStyle w:val="ListParagraph"/>
+        <w:numPr>
+          <w:ilvl w:val="0"/>
+          <w:numId w:val="2"/>
+        </w:numPr>
+        <w:spacing w:after="80" w:line="276"/>
+      </w:pPr>
+      <w:r>
+        <w:rPr>
+          <w:rFonts w:ascii="Calibri" w:cs="Calibri" w:eastAsia="Calibri" w:hAnsi="Calibri"/>
+        </w:rPr>
+        <w:t xml:space="preserve">classificação de documentos carregados em «Por classificar».</w:t>
       </w:r>
     </w:p>
     <w:tbl>
@@ -6607,7 +6997,7 @@
               <w:rPr>
                 <w:rFonts w:ascii="Calibri" w:cs="Calibri" w:eastAsia="Calibri" w:hAnsi="Calibri"/>
               </w:rPr>
-              <w:t xml:space="preserve">Cada pedido fica no registo de auditoria e conta para a quota mensal.</w:t>
+              <w:t xml:space="preserve">Cada pedido fica no registo de auditoria e conta para a quota mensal; há um limite de 30 pedidos por minuto por utilizador.</w:t>
             </w:r>
           </w:p>
         </w:tc>
@@ -6633,7 +7023,21 @@
         <w:rPr>
           <w:rFonts w:ascii="Calibri" w:cs="Calibri" w:eastAsia="Calibri" w:hAnsi="Calibri"/>
         </w:rPr>
-        <w:t xml:space="preserve">A plataforma inclui os referenciais abaixo. Cada cliente usa os que estiverem na sua licença. As correspondências entre referenciais permitem reaproveitar a mesma evidência em vários.</w:t>
+        <w:t xml:space="preserve">A plataforma inclui os referenciais abaixo. Cada cliente usa os que estiverem na sua licença. As correspondências entre referenciais permitem reaproveitar a mesma evidência em vários. Para a NIS2, a ISO/IEC 27001 e a ISO/IEC 42001 há também um </w:t>
+      </w:r>
+      <w:r>
+        <w:rPr>
+          <w:rFonts w:ascii="Calibri" w:cs="Calibri" w:eastAsia="Calibri" w:hAnsi="Calibri"/>
+          <w:b/>
+          <w:bCs/>
+        </w:rPr>
+        <w:t xml:space="preserve">guia de implementação próprio</w:t>
+      </w:r>
+      <w:r>
+        <w:rPr>
+          <w:rFonts w:ascii="Calibri" w:cs="Calibri" w:eastAsia="Calibri" w:hAnsi="Calibri"/>
+        </w:rPr>
+        <w:t xml:space="preserve">, entregue com este manual.</w:t>
       </w:r>
     </w:p>
     <w:tbl>
@@ -7111,7 +7515,7 @@
               <w:rPr>
                 <w:rFonts w:ascii="Calibri" w:cs="Calibri" w:eastAsia="Calibri" w:hAnsi="Calibri"/>
               </w:rPr>
-              <w:t xml:space="preserve">Guia com as cláusulas 4 a 10 e os 93 controlos do Anexo A, Declaração de Aplicabilidade e ligações ao QNRCS</w:t>
+              <w:t xml:space="preserve">Guia com as cláusulas 4 a 10 e os 93 controlos do Anexo A, Declaração de Aplicabilidade, análise de lacunas e ligações ao QNRCS</w:t>
             </w:r>
           </w:p>
         </w:tc>
@@ -7144,7 +7548,7 @@
               <w:rPr>
                 <w:rFonts w:ascii="Calibri" w:cs="Calibri" w:eastAsia="Calibri" w:hAnsi="Calibri"/>
               </w:rPr>
-              <w:t xml:space="preserve">DORA</w:t>
+              <w:t xml:space="preserve">ISO/IEC 42001:2023</w:t>
             </w:r>
           </w:p>
         </w:tc>
@@ -7172,7 +7576,7 @@
               <w:rPr>
                 <w:rFonts w:ascii="Calibri" w:cs="Calibri" w:eastAsia="Calibri" w:hAnsi="Calibri"/>
               </w:rPr>
-              <w:t xml:space="preserve">Reg. (UE) 2022/2554 e atos delegados</w:t>
+              <w:t xml:space="preserve">Norma ISO (não reproduzida)</w:t>
             </w:r>
           </w:p>
         </w:tc>
@@ -7200,7 +7604,7 @@
               <w:rPr>
                 <w:rFonts w:ascii="Calibri" w:cs="Calibri" w:eastAsia="Calibri" w:hAnsi="Calibri"/>
               </w:rPr>
-              <w:t xml:space="preserve">111 obrigações e prazos de incidentes</w:t>
+              <w:t xml:space="preserve">Guia do sistema de gestão da IA: cláusulas 4 a 10, 38 controlos do Anexo A, objetivos e fontes de risco, ligações à ISO/IEC 27001</w:t>
             </w:r>
           </w:p>
         </w:tc>
@@ -7233,7 +7637,7 @@
               <w:rPr>
                 <w:rFonts w:ascii="Calibri" w:cs="Calibri" w:eastAsia="Calibri" w:hAnsi="Calibri"/>
               </w:rPr>
-              <w:t xml:space="preserve">TISAX</w:t>
+              <w:t xml:space="preserve">DORA</w:t>
             </w:r>
           </w:p>
         </w:tc>
@@ -7261,7 +7665,7 @@
               <w:rPr>
                 <w:rFonts w:ascii="Calibri" w:cs="Calibri" w:eastAsia="Calibri" w:hAnsi="Calibri"/>
               </w:rPr>
-              <w:t xml:space="preserve">VDA ISA 6.0.3 e 2027.1</w:t>
+              <w:t xml:space="preserve">Reg. (UE) 2022/2554 e atos delegados</w:t>
             </w:r>
           </w:p>
         </w:tc>
@@ -7289,7 +7693,7 @@
               <w:rPr>
                 <w:rFonts w:ascii="Calibri" w:cs="Calibri" w:eastAsia="Calibri" w:hAnsi="Calibri"/>
               </w:rPr>
-              <w:t xml:space="preserve">80 e 78 controlos, maturidade 0 a 5</w:t>
+              <w:t xml:space="preserve">111 obrigações e prazos de incidentes</w:t>
             </w:r>
           </w:p>
         </w:tc>
@@ -7322,7 +7726,7 @@
               <w:rPr>
                 <w:rFonts w:ascii="Calibri" w:cs="Calibri" w:eastAsia="Calibri" w:hAnsi="Calibri"/>
               </w:rPr>
-              <w:t xml:space="preserve">CIS Controls v8.1</w:t>
+              <w:t xml:space="preserve">TISAX</w:t>
             </w:r>
           </w:p>
         </w:tc>
@@ -7350,7 +7754,7 @@
               <w:rPr>
                 <w:rFonts w:ascii="Calibri" w:cs="Calibri" w:eastAsia="Calibri" w:hAnsi="Calibri"/>
               </w:rPr>
-              <w:t xml:space="preserve">CIS</w:t>
+              <w:t xml:space="preserve">VDA ISA 6.0.3 e 2027.1</w:t>
             </w:r>
           </w:p>
         </w:tc>
@@ -7378,7 +7782,7 @@
               <w:rPr>
                 <w:rFonts w:ascii="Calibri" w:cs="Calibri" w:eastAsia="Calibri" w:hAnsi="Calibri"/>
               </w:rPr>
-              <w:t xml:space="preserve">Identificadores (18 controlos, 153 salvaguardas); o texto entra se a entidade importar o ficheiro oficial</w:t>
+              <w:t xml:space="preserve">80 e 78 controlos, maturidade 0 a 5</w:t>
             </w:r>
           </w:p>
         </w:tc>
@@ -7411,7 +7815,7 @@
               <w:rPr>
                 <w:rFonts w:ascii="Calibri" w:cs="Calibri" w:eastAsia="Calibri" w:hAnsi="Calibri"/>
               </w:rPr>
-              <w:t xml:space="preserve">NIST CSF 2.0</w:t>
+              <w:t xml:space="preserve">CIS Controls v8.1</w:t>
             </w:r>
           </w:p>
         </w:tc>
@@ -7439,7 +7843,7 @@
               <w:rPr>
                 <w:rFonts w:ascii="Calibri" w:cs="Calibri" w:eastAsia="Calibri" w:hAnsi="Calibri"/>
               </w:rPr>
-              <w:t xml:space="preserve">NIST</w:t>
+              <w:t xml:space="preserve">CIS</w:t>
             </w:r>
           </w:p>
         </w:tc>
@@ -7467,7 +7871,7 @@
               <w:rPr>
                 <w:rFonts w:ascii="Calibri" w:cs="Calibri" w:eastAsia="Calibri" w:hAnsi="Calibri"/>
               </w:rPr>
-              <w:t xml:space="preserve">Correspondências a partir das referências oficiais do QNRCS</w:t>
+              <w:t xml:space="preserve">Identificadores (18 controlos, 153 salvaguardas); o texto entra se a entidade importar o ficheiro oficial</w:t>
             </w:r>
           </w:p>
         </w:tc>
@@ -7500,6 +7904,95 @@
               <w:rPr>
                 <w:rFonts w:ascii="Calibri" w:cs="Calibri" w:eastAsia="Calibri" w:hAnsi="Calibri"/>
               </w:rPr>
+              <w:t xml:space="preserve">NIST CSF 2.0</w:t>
+            </w:r>
+          </w:p>
+        </w:tc>
+        <w:tc>
+          <w:tcPr>
+            <w:tcW w:type="dxa" w:w="2891"/>
+            <w:tcBorders>
+              <w:top w:val="single" w:color="D9DEE7" w:sz="4"/>
+              <w:left w:val="single" w:color="D9DEE7" w:sz="4"/>
+              <w:bottom w:val="single" w:color="D9DEE7" w:sz="4"/>
+              <w:right w:val="single" w:color="D9DEE7" w:sz="4"/>
+            </w:tcBorders>
+            <w:tcMar>
+              <w:top w:type="dxa" w:w="80"/>
+              <w:left w:type="dxa" w:w="110"/>
+              <w:bottom w:type="dxa" w:w="80"/>
+              <w:right w:type="dxa" w:w="110"/>
+            </w:tcMar>
+          </w:tcPr>
+          <w:p>
+            <w:pPr>
+              <w:spacing w:after="40"/>
+            </w:pPr>
+            <w:r>
+              <w:rPr>
+                <w:rFonts w:ascii="Calibri" w:cs="Calibri" w:eastAsia="Calibri" w:hAnsi="Calibri"/>
+              </w:rPr>
+              <w:t xml:space="preserve">NIST</w:t>
+            </w:r>
+          </w:p>
+        </w:tc>
+        <w:tc>
+          <w:tcPr>
+            <w:tcW w:type="dxa" w:w="4434"/>
+            <w:tcBorders>
+              <w:top w:val="single" w:color="D9DEE7" w:sz="4"/>
+              <w:left w:val="single" w:color="D9DEE7" w:sz="4"/>
+              <w:bottom w:val="single" w:color="D9DEE7" w:sz="4"/>
+              <w:right w:val="single" w:color="D9DEE7" w:sz="4"/>
+            </w:tcBorders>
+            <w:tcMar>
+              <w:top w:type="dxa" w:w="80"/>
+              <w:left w:type="dxa" w:w="110"/>
+              <w:bottom w:type="dxa" w:w="80"/>
+              <w:right w:type="dxa" w:w="110"/>
+            </w:tcMar>
+          </w:tcPr>
+          <w:p>
+            <w:pPr>
+              <w:spacing w:after="40"/>
+            </w:pPr>
+            <w:r>
+              <w:rPr>
+                <w:rFonts w:ascii="Calibri" w:cs="Calibri" w:eastAsia="Calibri" w:hAnsi="Calibri"/>
+              </w:rPr>
+              <w:t xml:space="preserve">Correspondências a partir das referências oficiais do QNRCS</w:t>
+            </w:r>
+          </w:p>
+        </w:tc>
+      </w:tr>
+      <w:tr>
+        <w:trPr>
+          <w:cantSplit/>
+        </w:trPr>
+        <w:tc>
+          <w:tcPr>
+            <w:tcW w:type="dxa" w:w="2313"/>
+            <w:tcBorders>
+              <w:top w:val="single" w:color="D9DEE7" w:sz="4"/>
+              <w:left w:val="single" w:color="D9DEE7" w:sz="4"/>
+              <w:bottom w:val="single" w:color="D9DEE7" w:sz="4"/>
+              <w:right w:val="single" w:color="D9DEE7" w:sz="4"/>
+            </w:tcBorders>
+            <w:tcMar>
+              <w:top w:type="dxa" w:w="80"/>
+              <w:left w:type="dxa" w:w="110"/>
+              <w:bottom w:type="dxa" w:w="80"/>
+              <w:right w:type="dxa" w:w="110"/>
+            </w:tcMar>
+          </w:tcPr>
+          <w:p>
+            <w:pPr>
+              <w:spacing w:after="40"/>
+            </w:pPr>
+            <w:r>
+              <w:rPr>
+                <w:rFonts w:ascii="Calibri" w:cs="Calibri" w:eastAsia="Calibri" w:hAnsi="Calibri"/>
+              </w:rPr>
               <w:t xml:space="preserve">RGPD</w:t>
             </w:r>
           </w:p>
@@ -7628,7 +8121,7 @@
         <w:pStyle w:val="ListParagraph"/>
         <w:numPr>
           <w:ilvl w:val="0"/>
-          <w:numId w:val="4"/>
+          <w:numId w:val="5"/>
         </w:numPr>
         <w:spacing w:after="80" w:line="276"/>
       </w:pPr>
@@ -7644,7 +8137,7 @@
         <w:pStyle w:val="ListParagraph"/>
         <w:numPr>
           <w:ilvl w:val="0"/>
-          <w:numId w:val="4"/>
+          <w:numId w:val="5"/>
         </w:numPr>
         <w:spacing w:after="80" w:line="276"/>
       </w:pPr>
@@ -7660,7 +8153,7 @@
         <w:pStyle w:val="ListParagraph"/>
         <w:numPr>
           <w:ilvl w:val="0"/>
-          <w:numId w:val="4"/>
+          <w:numId w:val="5"/>
         </w:numPr>
         <w:spacing w:after="80" w:line="276"/>
       </w:pPr>
@@ -7676,7 +8169,7 @@
         <w:pStyle w:val="ListParagraph"/>
         <w:numPr>
           <w:ilvl w:val="0"/>
-          <w:numId w:val="4"/>
+          <w:numId w:val="5"/>
         </w:numPr>
         <w:spacing w:after="80" w:line="276"/>
       </w:pPr>
@@ -7692,7 +8185,7 @@
         <w:pStyle w:val="ListParagraph"/>
         <w:numPr>
           <w:ilvl w:val="0"/>
-          <w:numId w:val="4"/>
+          <w:numId w:val="5"/>
         </w:numPr>
         <w:spacing w:after="80" w:line="276"/>
       </w:pPr>
@@ -8161,7 +8654,7 @@
               <w:rPr>
                 <w:rFonts w:ascii="Calibri" w:cs="Calibri" w:eastAsia="Calibri" w:hAnsi="Calibri"/>
               </w:rPr>
-              <w:t xml:space="preserve">30 dias úteis</w:t>
+              <w:t xml:space="preserve">30 dias úteis (3 meses para os prestadores digitais do art. 35.º, n.º 4)</w:t>
             </w:r>
           </w:p>
         </w:tc>
@@ -8189,7 +8682,7 @@
               <w:rPr>
                 <w:rFonts w:ascii="Calibri" w:cs="Calibri" w:eastAsia="Calibri" w:hAnsi="Calibri"/>
               </w:rPr>
-              <w:t xml:space="preserve">RJC, art. 35.º; Reg. 756/2026, art. 11.º</w:t>
+              <w:t xml:space="preserve">RJC, art. 35.º, n.os 3 e 4; Reg. 756/2026, art. 11.º</w:t>
             </w:r>
           </w:p>
         </w:tc>
@@ -8695,7 +9188,7 @@
               <w:rPr>
                 <w:rFonts w:ascii="Calibri" w:cs="Calibri" w:eastAsia="Calibri" w:hAnsi="Calibri"/>
               </w:rPr>
-              <w:t xml:space="preserve">Último dia útil de janeiro, a partir de 2028</w:t>
+              <w:t xml:space="preserve">Último dia útil de janeiro do ano seguinte; o primeiro em janeiro de 2029, relativo a 2028</w:t>
             </w:r>
           </w:p>
         </w:tc>
@@ -8923,7 +9416,7 @@
               <w:rPr>
                 <w:rFonts w:ascii="Calibri" w:cs="Calibri" w:eastAsia="Calibri" w:hAnsi="Calibri"/>
               </w:rPr>
-              <w:t xml:space="preserve">A plataforma organiza o trabalho e guarda as evidências; não substitui a norma nem a auditoria de certificação por uma entidade acreditada. A validação do guia com o texto oficial está em curso.</w:t>
+              <w:t xml:space="preserve">A estrutura (cláusulas 4 a 10 e os 93 controlos) foi conferida com o texto oficial em outubro de 2026. A plataforma organiza o trabalho e guarda as evidências; não substitui a norma, que a entidade deve adquirir, nem a auditoria de certificação por uma entidade acreditada.</w:t>
             </w:r>
           </w:p>
         </w:tc>
@@ -9256,7 +9749,7 @@
               <w:rPr>
                 <w:rFonts w:ascii="Calibri" w:cs="Calibri" w:eastAsia="Calibri" w:hAnsi="Calibri"/>
               </w:rPr>
-              <w:t xml:space="preserve">Aplicável ou não, justificação, estado, responsável e evidências. Estas escolhas formam a Declaração de Aplicabilidade.</w:t>
+              <w:t xml:space="preserve">Aplicável ou não, justificação, método de implementação, estado, responsável e evidências. Estas escolhas formam a Declaração de Aplicabilidade.</w:t>
             </w:r>
           </w:p>
         </w:tc>
@@ -9266,6 +9759,45 @@
       <w:pPr>
         <w:spacing w:after="60"/>
       </w:pPr>
+    </w:p>
+    <w:p>
+      <w:pPr>
+        <w:spacing w:after="120" w:line="288"/>
+      </w:pPr>
+      <w:r>
+        <w:rPr>
+          <w:rFonts w:ascii="Calibri" w:cs="Calibri" w:eastAsia="Calibri" w:hAnsi="Calibri"/>
+        </w:rPr>
+        <w:t xml:space="preserve">As cláusulas que exigem </w:t>
+      </w:r>
+      <w:r>
+        <w:rPr>
+          <w:rFonts w:ascii="Calibri" w:cs="Calibri" w:eastAsia="Calibri" w:hAnsi="Calibri"/>
+          <w:b/>
+          <w:bCs/>
+        </w:rPr>
+        <w:t xml:space="preserve">informação documentada</w:t>
+      </w:r>
+      <w:r>
+        <w:rPr>
+          <w:rFonts w:ascii="Calibri" w:cs="Calibri" w:eastAsia="Calibri" w:hAnsi="Calibri"/>
+        </w:rPr>
+        <w:t xml:space="preserve"> estão assinaladas e há um filtro para as ver todas. A </w:t>
+      </w:r>
+      <w:r>
+        <w:rPr>
+          <w:rFonts w:ascii="Calibri" w:cs="Calibri" w:eastAsia="Calibri" w:hAnsi="Calibri"/>
+          <w:b/>
+          <w:bCs/>
+        </w:rPr>
+        <w:t xml:space="preserve">análise de lacunas</w:t>
+      </w:r>
+      <w:r>
+        <w:rPr>
+          <w:rFonts w:ascii="Calibri" w:cs="Calibri" w:eastAsia="Calibri" w:hAnsi="Calibri"/>
+        </w:rPr>
+        <w:t xml:space="preserve"> mostra o sistema de gestão e os controlos em separado (conforme, parcialmente conforme, não conforme, não aplicável) e exporta-se em CSV.</w:t>
+      </w:r>
     </w:p>
     <w:p>
       <w:pPr>
@@ -9308,7 +9840,7 @@
         <w:pStyle w:val="ListParagraph"/>
         <w:numPr>
           <w:ilvl w:val="0"/>
-          <w:numId w:val="5"/>
+          <w:numId w:val="6"/>
         </w:numPr>
         <w:spacing w:after="80" w:line="276"/>
       </w:pPr>
@@ -9338,7 +9870,7 @@
         <w:pStyle w:val="ListParagraph"/>
         <w:numPr>
           <w:ilvl w:val="0"/>
-          <w:numId w:val="5"/>
+          <w:numId w:val="6"/>
         </w:numPr>
         <w:spacing w:after="80" w:line="276"/>
       </w:pPr>
@@ -9368,7 +9900,7 @@
         <w:pStyle w:val="ListParagraph"/>
         <w:numPr>
           <w:ilvl w:val="0"/>
-          <w:numId w:val="5"/>
+          <w:numId w:val="6"/>
         </w:numPr>
         <w:spacing w:after="80" w:line="276"/>
       </w:pPr>
@@ -9376,7 +9908,7 @@
         <w:rPr>
           <w:rFonts w:ascii="Calibri" w:cs="Calibri" w:eastAsia="Calibri" w:hAnsi="Calibri"/>
         </w:rPr>
-        <w:t xml:space="preserve">Percorra os 93 controlos do Anexo A: marque cada um como aplicável ou não aplicável e escreva a justificação.</w:t>
+        <w:t xml:space="preserve">Percorra os 93 controlos do Anexo A: marque cada um como aplicável ou não aplicável, escreva a justificação e, nos aplicáveis, o método de implementação.</w:t>
       </w:r>
     </w:p>
     <w:p>
@@ -9384,7 +9916,7 @@
         <w:pStyle w:val="ListParagraph"/>
         <w:numPr>
           <w:ilvl w:val="0"/>
-          <w:numId w:val="5"/>
+          <w:numId w:val="6"/>
         </w:numPr>
         <w:spacing w:after="80" w:line="276"/>
       </w:pPr>
@@ -9428,7 +9960,7 @@
         <w:pStyle w:val="ListParagraph"/>
         <w:numPr>
           <w:ilvl w:val="0"/>
-          <w:numId w:val="5"/>
+          <w:numId w:val="6"/>
         </w:numPr>
         <w:spacing w:after="80" w:line="276"/>
       </w:pPr>
@@ -9436,7 +9968,7 @@
         <w:rPr>
           <w:rFonts w:ascii="Calibri" w:cs="Calibri" w:eastAsia="Calibri" w:hAnsi="Calibri"/>
         </w:rPr>
-        <w:t xml:space="preserve">Ligue as evidências a cada controlo; as que já existem nos controlos QNRCS ligados aparecem indicadas.</w:t>
+        <w:t xml:space="preserve">Ligue as evidências a cada controlo; as que já existem nos controlos QNRCS ligados aparecem indicadas. Exporte a análise de lacunas para acompanhar o progresso.</w:t>
       </w:r>
     </w:p>
     <w:p>
@@ -9444,7 +9976,7 @@
         <w:pStyle w:val="ListParagraph"/>
         <w:numPr>
           <w:ilvl w:val="0"/>
-          <w:numId w:val="5"/>
+          <w:numId w:val="6"/>
         </w:numPr>
         <w:spacing w:after="80" w:line="276"/>
       </w:pPr>
@@ -9474,7 +10006,7 @@
         <w:pStyle w:val="ListParagraph"/>
         <w:numPr>
           <w:ilvl w:val="0"/>
-          <w:numId w:val="5"/>
+          <w:numId w:val="6"/>
         </w:numPr>
         <w:spacing w:after="80" w:line="276"/>
       </w:pPr>
@@ -10163,7 +10695,705 @@
         <w:rPr>
           <w:rFonts w:ascii="Calibri" w:cs="Calibri" w:eastAsia="Calibri" w:hAnsi="Calibri"/>
         </w:rPr>
-        <w:t xml:space="preserve">6.3 Outros referenciais disponíveis</w:t>
+        <w:t xml:space="preserve">6.3 ISO/IEC 42001:2023 — sistema de gestão da inteligência artificial</w:t>
+      </w:r>
+    </w:p>
+    <w:tbl>
+      <w:tblPr>
+        <w:tblW w:type="dxa" w:w="9638"/>
+        <w:tblBorders>
+          <w:top w:val="single" w:color="auto" w:sz="4"/>
+          <w:left w:val="single" w:color="auto" w:sz="4"/>
+          <w:bottom w:val="single" w:color="auto" w:sz="4"/>
+          <w:right w:val="single" w:color="auto" w:sz="4"/>
+          <w:insideH w:val="single" w:color="auto" w:sz="4"/>
+          <w:insideV w:val="single" w:color="auto" w:sz="4"/>
+        </w:tblBorders>
+      </w:tblPr>
+      <w:tblGrid>
+        <w:gridCol w:w="9638"/>
+      </w:tblGrid>
+      <w:tr>
+        <w:tc>
+          <w:tcPr>
+            <w:tcW w:type="dxa" w:w="9638"/>
+            <w:tcBorders>
+              <w:top w:val="single" w:color="F4F1EA" w:sz="4"/>
+              <w:left w:val="single" w:color="F4F1EA" w:sz="4"/>
+              <w:bottom w:val="single" w:color="F4F1EA" w:sz="4"/>
+              <w:right w:val="single" w:color="F4F1EA" w:sz="4"/>
+            </w:tcBorders>
+            <w:shd w:fill="F4F1EA" w:color="auto" w:val="clear"/>
+            <w:tcMar>
+              <w:top w:type="dxa" w:w="140"/>
+              <w:left w:type="dxa" w:w="200"/>
+              <w:bottom w:type="dxa" w:w="140"/>
+              <w:right w:type="dxa" w:w="200"/>
+            </w:tcMar>
+          </w:tcPr>
+          <w:p>
+            <w:pPr>
+              <w:spacing w:after="80"/>
+            </w:pPr>
+            <w:r>
+              <w:rPr>
+                <w:rFonts w:ascii="Calibri" w:cs="Calibri" w:eastAsia="Calibri" w:hAnsi="Calibri"/>
+                <w:b/>
+                <w:bCs/>
+                <w:color w:val="8A6620"/>
+              </w:rPr>
+              <w:t xml:space="preserve">Antes de começar</w:t>
+            </w:r>
+          </w:p>
+          <w:p>
+            <w:pPr>
+              <w:spacing w:after="60" w:line="276"/>
+            </w:pPr>
+            <w:r>
+              <w:rPr>
+                <w:rFonts w:ascii="Calibri" w:cs="Calibri" w:eastAsia="Calibri" w:hAnsi="Calibri"/>
+              </w:rPr>
+              <w:t xml:space="preserve">A ISO/IEC 42001 é a norma para gerir de forma responsável o desenvolvimento, o fornecimento ou a utilização de sistemas de IA. Tal como na 27001, a AnkoraOne inclui um </w:t>
+            </w:r>
+            <w:r>
+              <w:rPr>
+                <w:rFonts w:ascii="Calibri" w:cs="Calibri" w:eastAsia="Calibri" w:hAnsi="Calibri"/>
+                <w:b/>
+                <w:bCs/>
+              </w:rPr>
+              <w:t xml:space="preserve">guia de preparação</w:t>
+            </w:r>
+            <w:r>
+              <w:rPr>
+                <w:rFonts w:ascii="Calibri" w:cs="Calibri" w:eastAsia="Calibri" w:hAnsi="Calibri"/>
+              </w:rPr>
+              <w:t xml:space="preserve"> com textos próprios; a estrutura foi conferida com o texto oficial e a norma </w:t>
+            </w:r>
+            <w:r>
+              <w:rPr>
+                <w:rFonts w:ascii="Calibri" w:cs="Calibri" w:eastAsia="Calibri" w:hAnsi="Calibri"/>
+                <w:b/>
+                <w:bCs/>
+              </w:rPr>
+              <w:t xml:space="preserve">não está reproduzida</w:t>
+            </w:r>
+            <w:r>
+              <w:rPr>
+                <w:rFonts w:ascii="Calibri" w:cs="Calibri" w:eastAsia="Calibri" w:hAnsi="Calibri"/>
+              </w:rPr>
+              <w:t xml:space="preserve">.</w:t>
+            </w:r>
+          </w:p>
+          <w:p>
+            <w:pPr>
+              <w:spacing w:after="60" w:line="276"/>
+            </w:pPr>
+            <w:r>
+              <w:rPr>
+                <w:rFonts w:ascii="Calibri" w:cs="Calibri" w:eastAsia="Calibri" w:hAnsi="Calibri"/>
+              </w:rPr>
+              <w:t xml:space="preserve">Não substitui as obrigações do Regulamento (UE) 2024/1689 (Regulamento da IA), mas ajuda a organizá-las.</w:t>
+            </w:r>
+          </w:p>
+        </w:tc>
+      </w:tr>
+    </w:tbl>
+    <w:p>
+      <w:pPr>
+        <w:spacing w:after="60"/>
+      </w:pPr>
+    </w:p>
+    <w:p>
+      <w:pPr>
+        <w:spacing w:after="120" w:line="288"/>
+      </w:pPr>
+      <w:r>
+        <w:rPr>
+          <w:rFonts w:ascii="Calibri" w:cs="Calibri" w:eastAsia="Calibri" w:hAnsi="Calibri"/>
+        </w:rPr>
+        <w:t xml:space="preserve">O guia está em </w:t>
+      </w:r>
+      <w:r>
+        <w:rPr>
+          <w:rFonts w:ascii="Calibri" w:cs="Calibri" w:eastAsia="Calibri" w:hAnsi="Calibri"/>
+          <w:b/>
+          <w:bCs/>
+        </w:rPr>
+        <w:t xml:space="preserve">Biblioteca Legal › ISO/IEC 42001</w:t>
+      </w:r>
+      <w:r>
+        <w:rPr>
+          <w:rFonts w:ascii="Calibri" w:cs="Calibri" w:eastAsia="Calibri" w:hAnsi="Calibri"/>
+        </w:rPr>
+        <w:t xml:space="preserve">:</w:t>
+      </w:r>
+    </w:p>
+    <w:tbl>
+      <w:tblPr>
+        <w:tblW w:type="dxa" w:w="9638"/>
+        <w:tblBorders>
+          <w:top w:val="single" w:color="auto" w:sz="4"/>
+          <w:left w:val="single" w:color="auto" w:sz="4"/>
+          <w:bottom w:val="single" w:color="auto" w:sz="4"/>
+          <w:right w:val="single" w:color="auto" w:sz="4"/>
+          <w:insideH w:val="single" w:color="auto" w:sz="4"/>
+          <w:insideV w:val="single" w:color="auto" w:sz="4"/>
+        </w:tblBorders>
+      </w:tblPr>
+      <w:tblGrid>
+        <w:gridCol w:w="2313"/>
+        <w:gridCol w:w="4048"/>
+        <w:gridCol w:w="3277"/>
+      </w:tblGrid>
+      <w:tr>
+        <w:trPr>
+          <w:tblHeader/>
+        </w:trPr>
+        <w:tc>
+          <w:tcPr>
+            <w:tcW w:type="dxa" w:w="2313"/>
+            <w:tcBorders>
+              <w:top w:val="single" w:color="D9DEE7" w:sz="4"/>
+              <w:left w:val="single" w:color="D9DEE7" w:sz="4"/>
+              <w:bottom w:val="single" w:color="D9DEE7" w:sz="4"/>
+              <w:right w:val="single" w:color="D9DEE7" w:sz="4"/>
+            </w:tcBorders>
+            <w:shd w:fill="070A13" w:color="auto" w:val="clear"/>
+            <w:tcMar>
+              <w:top w:type="dxa" w:w="80"/>
+              <w:left w:type="dxa" w:w="110"/>
+              <w:bottom w:type="dxa" w:w="80"/>
+              <w:right w:type="dxa" w:w="110"/>
+            </w:tcMar>
+          </w:tcPr>
+          <w:p>
+            <w:pPr>
+              <w:spacing w:after="40"/>
+            </w:pPr>
+            <w:r>
+              <w:rPr>
+                <w:rFonts w:ascii="Calibri" w:cs="Calibri" w:eastAsia="Calibri" w:hAnsi="Calibri"/>
+                <w:b/>
+                <w:bCs/>
+                <w:color w:val="FFFFFF"/>
+                <w:sz w:val="19"/>
+                <w:szCs w:val="19"/>
+              </w:rPr>
+              <w:t xml:space="preserve">Parte</w:t>
+            </w:r>
+          </w:p>
+        </w:tc>
+        <w:tc>
+          <w:tcPr>
+            <w:tcW w:type="dxa" w:w="4048"/>
+            <w:tcBorders>
+              <w:top w:val="single" w:color="D9DEE7" w:sz="4"/>
+              <w:left w:val="single" w:color="D9DEE7" w:sz="4"/>
+              <w:bottom w:val="single" w:color="D9DEE7" w:sz="4"/>
+              <w:right w:val="single" w:color="D9DEE7" w:sz="4"/>
+            </w:tcBorders>
+            <w:shd w:fill="070A13" w:color="auto" w:val="clear"/>
+            <w:tcMar>
+              <w:top w:type="dxa" w:w="80"/>
+              <w:left w:type="dxa" w:w="110"/>
+              <w:bottom w:type="dxa" w:w="80"/>
+              <w:right w:type="dxa" w:w="110"/>
+            </w:tcMar>
+          </w:tcPr>
+          <w:p>
+            <w:pPr>
+              <w:spacing w:after="40"/>
+            </w:pPr>
+            <w:r>
+              <w:rPr>
+                <w:rFonts w:ascii="Calibri" w:cs="Calibri" w:eastAsia="Calibri" w:hAnsi="Calibri"/>
+                <w:b/>
+                <w:bCs/>
+                <w:color w:val="FFFFFF"/>
+                <w:sz w:val="19"/>
+                <w:szCs w:val="19"/>
+              </w:rPr>
+              <w:t xml:space="preserve">Conteúdo</w:t>
+            </w:r>
+          </w:p>
+        </w:tc>
+        <w:tc>
+          <w:tcPr>
+            <w:tcW w:type="dxa" w:w="3277"/>
+            <w:tcBorders>
+              <w:top w:val="single" w:color="D9DEE7" w:sz="4"/>
+              <w:left w:val="single" w:color="D9DEE7" w:sz="4"/>
+              <w:bottom w:val="single" w:color="D9DEE7" w:sz="4"/>
+              <w:right w:val="single" w:color="D9DEE7" w:sz="4"/>
+            </w:tcBorders>
+            <w:shd w:fill="070A13" w:color="auto" w:val="clear"/>
+            <w:tcMar>
+              <w:top w:type="dxa" w:w="80"/>
+              <w:left w:type="dxa" w:w="110"/>
+              <w:bottom w:type="dxa" w:w="80"/>
+              <w:right w:type="dxa" w:w="110"/>
+            </w:tcMar>
+          </w:tcPr>
+          <w:p>
+            <w:pPr>
+              <w:spacing w:after="40"/>
+            </w:pPr>
+            <w:r>
+              <w:rPr>
+                <w:rFonts w:ascii="Calibri" w:cs="Calibri" w:eastAsia="Calibri" w:hAnsi="Calibri"/>
+                <w:b/>
+                <w:bCs/>
+                <w:color w:val="FFFFFF"/>
+                <w:sz w:val="19"/>
+                <w:szCs w:val="19"/>
+              </w:rPr>
+              <w:t xml:space="preserve">Particularidade</w:t>
+            </w:r>
+          </w:p>
+        </w:tc>
+      </w:tr>
+      <w:tr>
+        <w:trPr>
+          <w:cantSplit/>
+        </w:trPr>
+        <w:tc>
+          <w:tcPr>
+            <w:tcW w:type="dxa" w:w="2313"/>
+            <w:tcBorders>
+              <w:top w:val="single" w:color="D9DEE7" w:sz="4"/>
+              <w:left w:val="single" w:color="D9DEE7" w:sz="4"/>
+              <w:bottom w:val="single" w:color="D9DEE7" w:sz="4"/>
+              <w:right w:val="single" w:color="D9DEE7" w:sz="4"/>
+            </w:tcBorders>
+            <w:tcMar>
+              <w:top w:type="dxa" w:w="80"/>
+              <w:left w:type="dxa" w:w="110"/>
+              <w:bottom w:type="dxa" w:w="80"/>
+              <w:right w:type="dxa" w:w="110"/>
+            </w:tcMar>
+          </w:tcPr>
+          <w:p>
+            <w:pPr>
+              <w:spacing w:after="40"/>
+            </w:pPr>
+            <w:r>
+              <w:rPr>
+                <w:rFonts w:ascii="Calibri" w:cs="Calibri" w:eastAsia="Calibri" w:hAnsi="Calibri"/>
+              </w:rPr>
+              <w:t xml:space="preserve">Requisitos do sistema de gestão</w:t>
+            </w:r>
+          </w:p>
+        </w:tc>
+        <w:tc>
+          <w:tcPr>
+            <w:tcW w:type="dxa" w:w="4048"/>
+            <w:tcBorders>
+              <w:top w:val="single" w:color="D9DEE7" w:sz="4"/>
+              <w:left w:val="single" w:color="D9DEE7" w:sz="4"/>
+              <w:bottom w:val="single" w:color="D9DEE7" w:sz="4"/>
+              <w:right w:val="single" w:color="D9DEE7" w:sz="4"/>
+            </w:tcBorders>
+            <w:tcMar>
+              <w:top w:type="dxa" w:w="80"/>
+              <w:left w:type="dxa" w:w="110"/>
+              <w:bottom w:type="dxa" w:w="80"/>
+              <w:right w:type="dxa" w:w="110"/>
+            </w:tcMar>
+          </w:tcPr>
+          <w:p>
+            <w:pPr>
+              <w:spacing w:after="40"/>
+            </w:pPr>
+            <w:r>
+              <w:rPr>
+                <w:rFonts w:ascii="Calibri" w:cs="Calibri" w:eastAsia="Calibri" w:hAnsi="Calibri"/>
+              </w:rPr>
+              <w:t xml:space="preserve">Cláusulas 4 a 10 (27 requisitos), com a mesma estrutura da 27001</w:t>
+            </w:r>
+          </w:p>
+        </w:tc>
+        <w:tc>
+          <w:tcPr>
+            <w:tcW w:type="dxa" w:w="3277"/>
+            <w:tcBorders>
+              <w:top w:val="single" w:color="D9DEE7" w:sz="4"/>
+              <w:left w:val="single" w:color="D9DEE7" w:sz="4"/>
+              <w:bottom w:val="single" w:color="D9DEE7" w:sz="4"/>
+              <w:right w:val="single" w:color="D9DEE7" w:sz="4"/>
+            </w:tcBorders>
+            <w:tcMar>
+              <w:top w:type="dxa" w:w="80"/>
+              <w:left w:type="dxa" w:w="110"/>
+              <w:bottom w:type="dxa" w:w="80"/>
+              <w:right w:type="dxa" w:w="110"/>
+            </w:tcMar>
+          </w:tcPr>
+          <w:p>
+            <w:pPr>
+              <w:spacing w:after="40"/>
+            </w:pPr>
+            <w:r>
+              <w:rPr>
+                <w:rFonts w:ascii="Calibri" w:cs="Calibri" w:eastAsia="Calibri" w:hAnsi="Calibri"/>
+              </w:rPr>
+              <w:t xml:space="preserve">Acrescenta a </w:t>
+            </w:r>
+            <w:r>
+              <w:rPr>
+                <w:rFonts w:ascii="Calibri" w:cs="Calibri" w:eastAsia="Calibri" w:hAnsi="Calibri"/>
+                <w:b/>
+                <w:bCs/>
+              </w:rPr>
+              <w:t xml:space="preserve">avaliação de impacto dos sistemas de IA</w:t>
+            </w:r>
+            <w:r>
+              <w:rPr>
+                <w:rFonts w:ascii="Calibri" w:cs="Calibri" w:eastAsia="Calibri" w:hAnsi="Calibri"/>
+              </w:rPr>
+              <w:t xml:space="preserve"> (6.1.4 e 8.4), sem equivalente na 27001</w:t>
+            </w:r>
+          </w:p>
+        </w:tc>
+      </w:tr>
+      <w:tr>
+        <w:trPr>
+          <w:cantSplit/>
+        </w:trPr>
+        <w:tc>
+          <w:tcPr>
+            <w:tcW w:type="dxa" w:w="2313"/>
+            <w:tcBorders>
+              <w:top w:val="single" w:color="D9DEE7" w:sz="4"/>
+              <w:left w:val="single" w:color="D9DEE7" w:sz="4"/>
+              <w:bottom w:val="single" w:color="D9DEE7" w:sz="4"/>
+              <w:right w:val="single" w:color="D9DEE7" w:sz="4"/>
+            </w:tcBorders>
+            <w:tcMar>
+              <w:top w:type="dxa" w:w="80"/>
+              <w:left w:type="dxa" w:w="110"/>
+              <w:bottom w:type="dxa" w:w="80"/>
+              <w:right w:type="dxa" w:w="110"/>
+            </w:tcMar>
+          </w:tcPr>
+          <w:p>
+            <w:pPr>
+              <w:spacing w:after="40"/>
+            </w:pPr>
+            <w:r>
+              <w:rPr>
+                <w:rFonts w:ascii="Calibri" w:cs="Calibri" w:eastAsia="Calibri" w:hAnsi="Calibri"/>
+              </w:rPr>
+              <w:t xml:space="preserve">Controlos do Anexo A</w:t>
+            </w:r>
+          </w:p>
+        </w:tc>
+        <w:tc>
+          <w:tcPr>
+            <w:tcW w:type="dxa" w:w="4048"/>
+            <w:tcBorders>
+              <w:top w:val="single" w:color="D9DEE7" w:sz="4"/>
+              <w:left w:val="single" w:color="D9DEE7" w:sz="4"/>
+              <w:bottom w:val="single" w:color="D9DEE7" w:sz="4"/>
+              <w:right w:val="single" w:color="D9DEE7" w:sz="4"/>
+            </w:tcBorders>
+            <w:tcMar>
+              <w:top w:type="dxa" w:w="80"/>
+              <w:left w:type="dxa" w:w="110"/>
+              <w:bottom w:type="dxa" w:w="80"/>
+              <w:right w:type="dxa" w:w="110"/>
+            </w:tcMar>
+          </w:tcPr>
+          <w:p>
+            <w:pPr>
+              <w:spacing w:after="40"/>
+            </w:pPr>
+            <w:r>
+              <w:rPr>
+                <w:rFonts w:ascii="Calibri" w:cs="Calibri" w:eastAsia="Calibri" w:hAnsi="Calibri"/>
+              </w:rPr>
+              <w:t xml:space="preserve">38 controlos em 9 domínios: políticas, organização, recursos, avaliação de impactos, ciclo de vida, dados, informação a partes interessadas, utilização e terceiros</w:t>
+            </w:r>
+          </w:p>
+        </w:tc>
+        <w:tc>
+          <w:tcPr>
+            <w:tcW w:type="dxa" w:w="3277"/>
+            <w:tcBorders>
+              <w:top w:val="single" w:color="D9DEE7" w:sz="4"/>
+              <w:left w:val="single" w:color="D9DEE7" w:sz="4"/>
+              <w:bottom w:val="single" w:color="D9DEE7" w:sz="4"/>
+              <w:right w:val="single" w:color="D9DEE7" w:sz="4"/>
+            </w:tcBorders>
+            <w:tcMar>
+              <w:top w:type="dxa" w:w="80"/>
+              <w:left w:type="dxa" w:w="110"/>
+              <w:bottom w:type="dxa" w:w="80"/>
+              <w:right w:type="dxa" w:w="110"/>
+            </w:tcMar>
+          </w:tcPr>
+          <w:p>
+            <w:pPr>
+              <w:spacing w:after="40"/>
+            </w:pPr>
+            <w:r>
+              <w:rPr>
+                <w:rFonts w:ascii="Calibri" w:cs="Calibri" w:eastAsia="Calibri" w:hAnsi="Calibri"/>
+              </w:rPr>
+              <w:t xml:space="preserve">33 apoiam-se em requisitos da 27001; 5 são próprios da IA</w:t>
+            </w:r>
+          </w:p>
+        </w:tc>
+      </w:tr>
+      <w:tr>
+        <w:trPr>
+          <w:cantSplit/>
+        </w:trPr>
+        <w:tc>
+          <w:tcPr>
+            <w:tcW w:type="dxa" w:w="2313"/>
+            <w:tcBorders>
+              <w:top w:val="single" w:color="D9DEE7" w:sz="4"/>
+              <w:left w:val="single" w:color="D9DEE7" w:sz="4"/>
+              <w:bottom w:val="single" w:color="D9DEE7" w:sz="4"/>
+              <w:right w:val="single" w:color="D9DEE7" w:sz="4"/>
+            </w:tcBorders>
+            <w:tcMar>
+              <w:top w:type="dxa" w:w="80"/>
+              <w:left w:type="dxa" w:w="110"/>
+              <w:bottom w:type="dxa" w:w="80"/>
+              <w:right w:type="dxa" w:w="110"/>
+            </w:tcMar>
+          </w:tcPr>
+          <w:p>
+            <w:pPr>
+              <w:spacing w:after="40"/>
+            </w:pPr>
+            <w:r>
+              <w:rPr>
+                <w:rFonts w:ascii="Calibri" w:cs="Calibri" w:eastAsia="Calibri" w:hAnsi="Calibri"/>
+              </w:rPr>
+              <w:t xml:space="preserve">Anexo C</w:t>
+            </w:r>
+          </w:p>
+        </w:tc>
+        <w:tc>
+          <w:tcPr>
+            <w:tcW w:type="dxa" w:w="4048"/>
+            <w:tcBorders>
+              <w:top w:val="single" w:color="D9DEE7" w:sz="4"/>
+              <w:left w:val="single" w:color="D9DEE7" w:sz="4"/>
+              <w:bottom w:val="single" w:color="D9DEE7" w:sz="4"/>
+              <w:right w:val="single" w:color="D9DEE7" w:sz="4"/>
+            </w:tcBorders>
+            <w:tcMar>
+              <w:top w:type="dxa" w:w="80"/>
+              <w:left w:type="dxa" w:w="110"/>
+              <w:bottom w:type="dxa" w:w="80"/>
+              <w:right w:type="dxa" w:w="110"/>
+            </w:tcMar>
+          </w:tcPr>
+          <w:p>
+            <w:pPr>
+              <w:spacing w:after="40"/>
+            </w:pPr>
+            <w:r>
+              <w:rPr>
+                <w:rFonts w:ascii="Calibri" w:cs="Calibri" w:eastAsia="Calibri" w:hAnsi="Calibri"/>
+              </w:rPr>
+              <w:t xml:space="preserve">11 objetivos e 7 fontes de risco de referência</w:t>
+            </w:r>
+          </w:p>
+        </w:tc>
+        <w:tc>
+          <w:tcPr>
+            <w:tcW w:type="dxa" w:w="3277"/>
+            <w:tcBorders>
+              <w:top w:val="single" w:color="D9DEE7" w:sz="4"/>
+              <w:left w:val="single" w:color="D9DEE7" w:sz="4"/>
+              <w:bottom w:val="single" w:color="D9DEE7" w:sz="4"/>
+              <w:right w:val="single" w:color="D9DEE7" w:sz="4"/>
+            </w:tcBorders>
+            <w:tcMar>
+              <w:top w:type="dxa" w:w="80"/>
+              <w:left w:type="dxa" w:w="110"/>
+              <w:bottom w:type="dxa" w:w="80"/>
+              <w:right w:type="dxa" w:w="110"/>
+            </w:tcMar>
+          </w:tcPr>
+          <w:p>
+            <w:pPr>
+              <w:spacing w:after="40"/>
+            </w:pPr>
+            <w:r>
+              <w:rPr>
+                <w:rFonts w:ascii="Calibri" w:cs="Calibri" w:eastAsia="Calibri" w:hAnsi="Calibri"/>
+              </w:rPr>
+              <w:t xml:space="preserve">Ajudam a definir objetivos (6.2) e a avaliar riscos (6.1.2)</w:t>
+            </w:r>
+          </w:p>
+        </w:tc>
+      </w:tr>
+    </w:tbl>
+    <w:p>
+      <w:pPr>
+        <w:spacing w:after="60"/>
+      </w:pPr>
+    </w:p>
+    <w:p>
+      <w:pPr>
+        <w:spacing w:after="120" w:line="288"/>
+      </w:pPr>
+      <w:r>
+        <w:rPr>
+          <w:rFonts w:ascii="Calibri" w:cs="Calibri" w:eastAsia="Calibri" w:hAnsi="Calibri"/>
+        </w:rPr>
+        <w:t xml:space="preserve">Se a entidade já segue a ISO/IEC 27001, trabalhe as duas como </w:t>
+      </w:r>
+      <w:r>
+        <w:rPr>
+          <w:rFonts w:ascii="Calibri" w:cs="Calibri" w:eastAsia="Calibri" w:hAnsi="Calibri"/>
+          <w:b/>
+          <w:bCs/>
+        </w:rPr>
+        <w:t xml:space="preserve">um só sistema de gestão</w:t>
+      </w:r>
+      <w:r>
+        <w:rPr>
+          <w:rFonts w:ascii="Calibri" w:cs="Calibri" w:eastAsia="Calibri" w:hAnsi="Calibri"/>
+        </w:rPr>
+        <w:t xml:space="preserve">: a mesma análise de contexto, o mesmo controlo documental, uma auditoria interna e uma revisão pela gestão. Cada controlo da 42001 mostra os requisitos da 27001 em que se apoia e conta as evidências que já lá estão. A </w:t>
+      </w:r>
+      <w:r>
+        <w:rPr>
+          <w:rFonts w:ascii="Calibri" w:cs="Calibri" w:eastAsia="Calibri" w:hAnsi="Calibri"/>
+          <w:b/>
+          <w:bCs/>
+        </w:rPr>
+        <w:t xml:space="preserve">Declaração de Aplicabilidade é separada</w:t>
+      </w:r>
+      <w:r>
+        <w:rPr>
+          <w:rFonts w:ascii="Calibri" w:cs="Calibri" w:eastAsia="Calibri" w:hAnsi="Calibri"/>
+        </w:rPr>
+        <w:t xml:space="preserve"> para cada norma.</w:t>
+      </w:r>
+    </w:p>
+    <w:p>
+      <w:pPr>
+        <w:pStyle w:val="Heading3"/>
+      </w:pPr>
+      <w:r>
+        <w:rPr>
+          <w:rFonts w:ascii="Calibri" w:cs="Calibri" w:eastAsia="Calibri" w:hAnsi="Calibri"/>
+        </w:rPr>
+        <w:t xml:space="preserve">Como trabalhar este referencial na AnkoraOne</w:t>
+      </w:r>
+    </w:p>
+    <w:p>
+      <w:pPr>
+        <w:pStyle w:val="ListParagraph"/>
+        <w:numPr>
+          <w:ilvl w:val="0"/>
+          <w:numId w:val="7"/>
+        </w:numPr>
+        <w:spacing w:after="80" w:line="276"/>
+      </w:pPr>
+      <w:r>
+        <w:rPr>
+          <w:rFonts w:ascii="Calibri" w:cs="Calibri" w:eastAsia="Calibri" w:hAnsi="Calibri"/>
+        </w:rPr>
+        <w:t xml:space="preserve">Faça o inventário dos sistemas de IA e defina o papel da entidade em cada um (cláusula 4).</w:t>
+      </w:r>
+    </w:p>
+    <w:p>
+      <w:pPr>
+        <w:pStyle w:val="ListParagraph"/>
+        <w:numPr>
+          <w:ilvl w:val="0"/>
+          <w:numId w:val="7"/>
+        </w:numPr>
+        <w:spacing w:after="80" w:line="276"/>
+      </w:pPr>
+      <w:r>
+        <w:rPr>
+          <w:rFonts w:ascii="Calibri" w:cs="Calibri" w:eastAsia="Calibri" w:hAnsi="Calibri"/>
+        </w:rPr>
+        <w:t xml:space="preserve">Aprove a política de IA e as responsabilidades (5.2 e 5.3).</w:t>
+      </w:r>
+    </w:p>
+    <w:p>
+      <w:pPr>
+        <w:pStyle w:val="ListParagraph"/>
+        <w:numPr>
+          <w:ilvl w:val="0"/>
+          <w:numId w:val="7"/>
+        </w:numPr>
+        <w:spacing w:after="80" w:line="276"/>
+      </w:pPr>
+      <w:r>
+        <w:rPr>
+          <w:rFonts w:ascii="Calibri" w:cs="Calibri" w:eastAsia="Calibri" w:hAnsi="Calibri"/>
+        </w:rPr>
+        <w:t xml:space="preserve">Avalie os riscos de IA e, para cada sistema, o impacto em pessoas e na sociedade (6.1.2 e 6.1.4).</w:t>
+      </w:r>
+    </w:p>
+    <w:p>
+      <w:pPr>
+        <w:pStyle w:val="ListParagraph"/>
+        <w:numPr>
+          <w:ilvl w:val="0"/>
+          <w:numId w:val="7"/>
+        </w:numPr>
+        <w:spacing w:after="80" w:line="276"/>
+      </w:pPr>
+      <w:r>
+        <w:rPr>
+          <w:rFonts w:ascii="Calibri" w:cs="Calibri" w:eastAsia="Calibri" w:hAnsi="Calibri"/>
+        </w:rPr>
+        <w:t xml:space="preserve">Percorra os 38 controlos: aplicabilidade, justificação e método de implementação; exporte a Declaração de Aplicabilidade.</w:t>
+      </w:r>
+    </w:p>
+    <w:p>
+      <w:pPr>
+        <w:pStyle w:val="ListParagraph"/>
+        <w:numPr>
+          <w:ilvl w:val="0"/>
+          <w:numId w:val="7"/>
+        </w:numPr>
+        <w:spacing w:after="80" w:line="276"/>
+      </w:pPr>
+      <w:r>
+        <w:rPr>
+          <w:rFonts w:ascii="Calibri" w:cs="Calibri" w:eastAsia="Calibri" w:hAnsi="Calibri"/>
+        </w:rPr>
+        <w:t xml:space="preserve">Ligue as evidências; nos controlos com base na 27001, reaproveite o que já existe e acrescente o que é próprio da IA.</w:t>
+      </w:r>
+    </w:p>
+    <w:p>
+      <w:pPr>
+        <w:pStyle w:val="ListParagraph"/>
+        <w:numPr>
+          <w:ilvl w:val="0"/>
+          <w:numId w:val="7"/>
+        </w:numPr>
+        <w:spacing w:after="80" w:line="276"/>
+      </w:pPr>
+      <w:r>
+        <w:rPr>
+          <w:rFonts w:ascii="Calibri" w:cs="Calibri" w:eastAsia="Calibri" w:hAnsi="Calibri"/>
+        </w:rPr>
+        <w:t xml:space="preserve">Inclua a IA na auditoria interna e na revisão pela gestão (9.2 e 9.3).</w:t>
+      </w:r>
+    </w:p>
+    <w:p>
+      <w:pPr>
+        <w:pStyle w:val="Heading2"/>
+      </w:pPr>
+      <w:r>
+        <w:rPr>
+          <w:rFonts w:ascii="Calibri" w:cs="Calibri" w:eastAsia="Calibri" w:hAnsi="Calibri"/>
+        </w:rPr>
+        <w:t xml:space="preserve">6.4 Outros referenciais disponíveis</w:t>
       </w:r>
     </w:p>
     <w:p>
@@ -10656,7 +11886,7 @@
               <w:rPr>
                 <w:rFonts w:ascii="Calibri" w:cs="Calibri" w:eastAsia="Calibri" w:hAnsi="Calibri"/>
               </w:rPr>
-              <w:t xml:space="preserve">Políticas base aprovadas; inventário de ativos; fornecedores críticos identificados; Declaração de Aplicabilidade ISO em rascunho</w:t>
+              <w:t xml:space="preserve">Políticas base aprovadas; inventário de ativos (e de sistemas de IA, se aplicável); fornecedores críticos identificados; Declarações de Aplicabilidade ISO em rascunho; documentos existentes carregados em Por classificar</w:t>
             </w:r>
           </w:p>
         </w:tc>
@@ -10684,7 +11914,7 @@
               <w:rPr>
                 <w:rFonts w:ascii="Calibri" w:cs="Calibri" w:eastAsia="Calibri" w:hAnsi="Calibri"/>
               </w:rPr>
-              <w:t xml:space="preserve">Documentos · Ativos e ferramentas · Fornecedores · Biblioteca Legal › ISO/IEC 27001</w:t>
+              <w:t xml:space="preserve">Documentos · Repositório documental · Ativos e ferramentas · Fornecedores · Biblioteca Legal › ISO</w:t>
             </w:r>
           </w:p>
         </w:tc>
@@ -10950,7 +12180,7 @@
               <w:rPr>
                 <w:rFonts w:ascii="Calibri" w:cs="Calibri" w:eastAsia="Calibri" w:hAnsi="Calibri"/>
               </w:rPr>
-              <w:t xml:space="preserve">☐ Repositório de ficheiros escolhido</w:t>
+              <w:t xml:space="preserve">☐ Repositório de ficheiros e localização escolhidos</w:t>
             </w:r>
           </w:p>
           <w:p>
@@ -11578,6 +12808,189 @@
           </w:p>
         </w:tc>
       </w:tr>
+      <w:tr>
+        <w:trPr>
+          <w:cantSplit/>
+        </w:trPr>
+        <w:tc>
+          <w:tcPr>
+            <w:tcW w:type="dxa" w:w="3044"/>
+            <w:tcBorders>
+              <w:top w:val="single" w:color="D9DEE7" w:sz="4"/>
+              <w:left w:val="single" w:color="D9DEE7" w:sz="4"/>
+              <w:bottom w:val="single" w:color="D9DEE7" w:sz="4"/>
+              <w:right w:val="single" w:color="D9DEE7" w:sz="4"/>
+            </w:tcBorders>
+            <w:tcMar>
+              <w:top w:type="dxa" w:w="80"/>
+              <w:left w:type="dxa" w:w="110"/>
+              <w:bottom w:type="dxa" w:w="80"/>
+              <w:right w:type="dxa" w:w="110"/>
+            </w:tcMar>
+          </w:tcPr>
+          <w:p>
+            <w:pPr>
+              <w:spacing w:after="40"/>
+            </w:pPr>
+            <w:r>
+              <w:rPr>
+                <w:rFonts w:ascii="Calibri" w:cs="Calibri" w:eastAsia="Calibri" w:hAnsi="Calibri"/>
+              </w:rPr>
+              <w:t xml:space="preserve">Declaração de Aplicabilidade</w:t>
+            </w:r>
+          </w:p>
+        </w:tc>
+        <w:tc>
+          <w:tcPr>
+            <w:tcW w:type="dxa" w:w="6594"/>
+            <w:tcBorders>
+              <w:top w:val="single" w:color="D9DEE7" w:sz="4"/>
+              <w:left w:val="single" w:color="D9DEE7" w:sz="4"/>
+              <w:bottom w:val="single" w:color="D9DEE7" w:sz="4"/>
+              <w:right w:val="single" w:color="D9DEE7" w:sz="4"/>
+            </w:tcBorders>
+            <w:tcMar>
+              <w:top w:type="dxa" w:w="80"/>
+              <w:left w:type="dxa" w:w="110"/>
+              <w:bottom w:type="dxa" w:w="80"/>
+              <w:right w:type="dxa" w:w="110"/>
+            </w:tcMar>
+          </w:tcPr>
+          <w:p>
+            <w:pPr>
+              <w:spacing w:after="40"/>
+            </w:pPr>
+            <w:r>
+              <w:rPr>
+                <w:rFonts w:ascii="Calibri" w:cs="Calibri" w:eastAsia="Calibri" w:hAnsi="Calibri"/>
+              </w:rPr>
+              <w:t xml:space="preserve">Lista dos controlos do Anexo A de uma norma ISO, com a decisão de aplicar ou não cada um e a justificação</w:t>
+            </w:r>
+          </w:p>
+        </w:tc>
+      </w:tr>
+      <w:tr>
+        <w:trPr>
+          <w:cantSplit/>
+        </w:trPr>
+        <w:tc>
+          <w:tcPr>
+            <w:tcW w:type="dxa" w:w="3044"/>
+            <w:tcBorders>
+              <w:top w:val="single" w:color="D9DEE7" w:sz="4"/>
+              <w:left w:val="single" w:color="D9DEE7" w:sz="4"/>
+              <w:bottom w:val="single" w:color="D9DEE7" w:sz="4"/>
+              <w:right w:val="single" w:color="D9DEE7" w:sz="4"/>
+            </w:tcBorders>
+            <w:tcMar>
+              <w:top w:type="dxa" w:w="80"/>
+              <w:left w:type="dxa" w:w="110"/>
+              <w:bottom w:type="dxa" w:w="80"/>
+              <w:right w:type="dxa" w:w="110"/>
+            </w:tcMar>
+          </w:tcPr>
+          <w:p>
+            <w:pPr>
+              <w:spacing w:after="40"/>
+            </w:pPr>
+            <w:r>
+              <w:rPr>
+                <w:rFonts w:ascii="Calibri" w:cs="Calibri" w:eastAsia="Calibri" w:hAnsi="Calibri"/>
+              </w:rPr>
+              <w:t xml:space="preserve">Análise de lacunas</w:t>
+            </w:r>
+          </w:p>
+        </w:tc>
+        <w:tc>
+          <w:tcPr>
+            <w:tcW w:type="dxa" w:w="6594"/>
+            <w:tcBorders>
+              <w:top w:val="single" w:color="D9DEE7" w:sz="4"/>
+              <w:left w:val="single" w:color="D9DEE7" w:sz="4"/>
+              <w:bottom w:val="single" w:color="D9DEE7" w:sz="4"/>
+              <w:right w:val="single" w:color="D9DEE7" w:sz="4"/>
+            </w:tcBorders>
+            <w:tcMar>
+              <w:top w:type="dxa" w:w="80"/>
+              <w:left w:type="dxa" w:w="110"/>
+              <w:bottom w:type="dxa" w:w="80"/>
+              <w:right w:type="dxa" w:w="110"/>
+            </w:tcMar>
+          </w:tcPr>
+          <w:p>
+            <w:pPr>
+              <w:spacing w:after="40"/>
+            </w:pPr>
+            <w:r>
+              <w:rPr>
+                <w:rFonts w:ascii="Calibri" w:cs="Calibri" w:eastAsia="Calibri" w:hAnsi="Calibri"/>
+              </w:rPr>
+              <w:t xml:space="preserve">Comparação entre o que a norma pede e o que já existe, requisito a requisito</w:t>
+            </w:r>
+          </w:p>
+        </w:tc>
+      </w:tr>
+      <w:tr>
+        <w:trPr>
+          <w:cantSplit/>
+        </w:trPr>
+        <w:tc>
+          <w:tcPr>
+            <w:tcW w:type="dxa" w:w="3044"/>
+            <w:tcBorders>
+              <w:top w:val="single" w:color="D9DEE7" w:sz="4"/>
+              <w:left w:val="single" w:color="D9DEE7" w:sz="4"/>
+              <w:bottom w:val="single" w:color="D9DEE7" w:sz="4"/>
+              <w:right w:val="single" w:color="D9DEE7" w:sz="4"/>
+            </w:tcBorders>
+            <w:tcMar>
+              <w:top w:type="dxa" w:w="80"/>
+              <w:left w:type="dxa" w:w="110"/>
+              <w:bottom w:type="dxa" w:w="80"/>
+              <w:right w:type="dxa" w:w="110"/>
+            </w:tcMar>
+          </w:tcPr>
+          <w:p>
+            <w:pPr>
+              <w:spacing w:after="40"/>
+            </w:pPr>
+            <w:r>
+              <w:rPr>
+                <w:rFonts w:ascii="Calibri" w:cs="Calibri" w:eastAsia="Calibri" w:hAnsi="Calibri"/>
+              </w:rPr>
+              <w:t xml:space="preserve">Avaliação de impacto de IA</w:t>
+            </w:r>
+          </w:p>
+        </w:tc>
+        <w:tc>
+          <w:tcPr>
+            <w:tcW w:type="dxa" w:w="6594"/>
+            <w:tcBorders>
+              <w:top w:val="single" w:color="D9DEE7" w:sz="4"/>
+              <w:left w:val="single" w:color="D9DEE7" w:sz="4"/>
+              <w:bottom w:val="single" w:color="D9DEE7" w:sz="4"/>
+              <w:right w:val="single" w:color="D9DEE7" w:sz="4"/>
+            </w:tcBorders>
+            <w:tcMar>
+              <w:top w:type="dxa" w:w="80"/>
+              <w:left w:type="dxa" w:w="110"/>
+              <w:bottom w:type="dxa" w:w="80"/>
+              <w:right w:type="dxa" w:w="110"/>
+            </w:tcMar>
+          </w:tcPr>
+          <w:p>
+            <w:pPr>
+              <w:spacing w:after="40"/>
+            </w:pPr>
+            <w:r>
+              <w:rPr>
+                <w:rFonts w:ascii="Calibri" w:cs="Calibri" w:eastAsia="Calibri" w:hAnsi="Calibri"/>
+              </w:rPr>
+              <w:t xml:space="preserve">Análise dos efeitos de um sistema de IA em pessoas e na sociedade (ISO/IEC 42001, 6.1.4)</w:t>
+            </w:r>
+          </w:p>
+        </w:tc>
+      </w:tr>
     </w:tbl>
     <w:p>
       <w:pPr>
@@ -11641,7 +13054,7 @@
           <w:sz w:val="18"/>
           <w:szCs w:val="18"/>
         </w:rPr>
-        <w:t xml:space="preserve">Este manual descreve a plataforma em outubro de 2026. As referências legais remetem para os textos publicados no Diário da República e no EUR-Lex, disponíveis na Biblioteca Legal da plataforma.</w:t>
+        <w:t xml:space="preserve">Este manual (versão 1.2) descreve a plataforma em outubro de 2026. As referências legais remetem para os textos publicados no Diário da República e no EUR-Lex, disponíveis na Biblioteca Legal da plataforma.</w:t>
       </w:r>
     </w:p>
     <w:sectPr>
@@ -11816,7 +13229,7 @@
         <w:sz w:val="16"/>
         <w:szCs w:val="16"/>
       </w:rPr>
-      <w:t xml:space="preserve">     Manual de onboarding · NIS2 e ISO/IEC 27001</w:t>
+      <w:t xml:space="preserve">     Manual de onboarding · NIS2, ISO/IEC 27001 e ISO/IEC 42001</w:t>
     </w:r>
   </w:p>
 </w:hdr>
@@ -11945,6 +13358,330 @@
     </w:lvl>
   </w:abstractNum>
   <w:abstractNum w:abstractNumId="5" w15:restartNumberingAfterBreak="0">
+    <w:multiLevelType w:val="hybridMultilevel"/>
+    <w:lvl w:ilvl="0" w:tentative="1">
+      <w:start w:val="1"/>
+      <w:numFmt w:val="decimal"/>
+      <w:lvlText w:val="%1."/>
+      <w:lvlJc w:val="left"/>
+      <w:pPr>
+        <w:ind w:left="540" w:hanging="300"/>
+      </w:pPr>
+    </w:lvl>
+  </w:abstractNum>
+  <w:abstractNum w:abstractNumId="6" w15:restartNumberingAfterBreak="0">
+    <w:multiLevelType w:val="hybridMultilevel"/>
+    <w:lvl w:ilvl="0" w:tentative="1">
+      <w:start w:val="1"/>
+      <w:numFmt w:val="decimal"/>
+      <w:lvlText w:val="%1."/>
+      <w:lvlJc w:val="left"/>
+      <w:pPr>
+        <w:ind w:left="540" w:hanging="300"/>
+      </w:pPr>
+    </w:lvl>
+  </w:abstractNum>
+  <w:abstractNum w:abstractNumId="7" w15:restartNumberingAfterBreak="0">
+    <w:multiLevelType w:val="hybridMultilevel"/>
+    <w:lvl w:ilvl="0" w:tentative="1">
+      <w:start w:val="1"/>
+      <w:numFmt w:val="decimal"/>
+      <w:lvlText w:val="%1."/>
+      <w:lvlJc w:val="left"/>
+      <w:pPr>
+        <w:ind w:left="540" w:hanging="300"/>
+      </w:pPr>
+    </w:lvl>
+  </w:abstractNum>
+  <w:abstractNum w:abstractNumId="8" w15:restartNumberingAfterBreak="0">
+    <w:multiLevelType w:val="hybridMultilevel"/>
+    <w:lvl w:ilvl="0" w:tentative="1">
+      <w:start w:val="1"/>
+      <w:numFmt w:val="decimal"/>
+      <w:lvlText w:val="%1."/>
+      <w:lvlJc w:val="left"/>
+      <w:pPr>
+        <w:ind w:left="540" w:hanging="300"/>
+      </w:pPr>
+    </w:lvl>
+  </w:abstractNum>
+  <w:abstractNum w:abstractNumId="9" w15:restartNumberingAfterBreak="0">
+    <w:multiLevelType w:val="hybridMultilevel"/>
+    <w:lvl w:ilvl="0" w:tentative="1">
+      <w:start w:val="1"/>
+      <w:numFmt w:val="decimal"/>
+      <w:lvlText w:val="%1."/>
+      <w:lvlJc w:val="left"/>
+      <w:pPr>
+        <w:ind w:left="540" w:hanging="300"/>
+      </w:pPr>
+    </w:lvl>
+  </w:abstractNum>
+  <w:abstractNum w:abstractNumId="10" w15:restartNumberingAfterBreak="0">
+    <w:multiLevelType w:val="hybridMultilevel"/>
+    <w:lvl w:ilvl="0" w:tentative="1">
+      <w:start w:val="1"/>
+      <w:numFmt w:val="decimal"/>
+      <w:lvlText w:val="%1."/>
+      <w:lvlJc w:val="left"/>
+      <w:pPr>
+        <w:ind w:left="540" w:hanging="300"/>
+      </w:pPr>
+    </w:lvl>
+  </w:abstractNum>
+  <w:abstractNum w:abstractNumId="11" w15:restartNumberingAfterBreak="0">
+    <w:multiLevelType w:val="hybridMultilevel"/>
+    <w:lvl w:ilvl="0" w:tentative="1">
+      <w:start w:val="1"/>
+      <w:numFmt w:val="decimal"/>
+      <w:lvlText w:val="%1."/>
+      <w:lvlJc w:val="left"/>
+      <w:pPr>
+        <w:ind w:left="540" w:hanging="300"/>
+      </w:pPr>
+    </w:lvl>
+  </w:abstractNum>
+  <w:abstractNum w:abstractNumId="12" w15:restartNumberingAfterBreak="0">
+    <w:multiLevelType w:val="hybridMultilevel"/>
+    <w:lvl w:ilvl="0" w:tentative="1">
+      <w:start w:val="1"/>
+      <w:numFmt w:val="decimal"/>
+      <w:lvlText w:val="%1."/>
+      <w:lvlJc w:val="left"/>
+      <w:pPr>
+        <w:ind w:left="540" w:hanging="300"/>
+      </w:pPr>
+    </w:lvl>
+  </w:abstractNum>
+  <w:abstractNum w:abstractNumId="13" w15:restartNumberingAfterBreak="0">
+    <w:multiLevelType w:val="hybridMultilevel"/>
+    <w:lvl w:ilvl="0" w:tentative="1">
+      <w:start w:val="1"/>
+      <w:numFmt w:val="decimal"/>
+      <w:lvlText w:val="%1."/>
+      <w:lvlJc w:val="left"/>
+      <w:pPr>
+        <w:ind w:left="540" w:hanging="300"/>
+      </w:pPr>
+    </w:lvl>
+  </w:abstractNum>
+  <w:abstractNum w:abstractNumId="14" w15:restartNumberingAfterBreak="0">
+    <w:multiLevelType w:val="hybridMultilevel"/>
+    <w:lvl w:ilvl="0" w:tentative="1">
+      <w:start w:val="1"/>
+      <w:numFmt w:val="decimal"/>
+      <w:lvlText w:val="%1."/>
+      <w:lvlJc w:val="left"/>
+      <w:pPr>
+        <w:ind w:left="540" w:hanging="300"/>
+      </w:pPr>
+    </w:lvl>
+  </w:abstractNum>
+  <w:abstractNum w:abstractNumId="15" w15:restartNumberingAfterBreak="0">
+    <w:multiLevelType w:val="hybridMultilevel"/>
+    <w:lvl w:ilvl="0" w:tentative="1">
+      <w:start w:val="1"/>
+      <w:numFmt w:val="decimal"/>
+      <w:lvlText w:val="%1."/>
+      <w:lvlJc w:val="left"/>
+      <w:pPr>
+        <w:ind w:left="540" w:hanging="300"/>
+      </w:pPr>
+    </w:lvl>
+  </w:abstractNum>
+  <w:abstractNum w:abstractNumId="16" w15:restartNumberingAfterBreak="0">
+    <w:multiLevelType w:val="hybridMultilevel"/>
+    <w:lvl w:ilvl="0" w:tentative="1">
+      <w:start w:val="1"/>
+      <w:numFmt w:val="decimal"/>
+      <w:lvlText w:val="%1."/>
+      <w:lvlJc w:val="left"/>
+      <w:pPr>
+        <w:ind w:left="540" w:hanging="300"/>
+      </w:pPr>
+    </w:lvl>
+  </w:abstractNum>
+  <w:abstractNum w:abstractNumId="17" w15:restartNumberingAfterBreak="0">
+    <w:multiLevelType w:val="hybridMultilevel"/>
+    <w:lvl w:ilvl="0" w:tentative="1">
+      <w:start w:val="1"/>
+      <w:numFmt w:val="decimal"/>
+      <w:lvlText w:val="%1."/>
+      <w:lvlJc w:val="left"/>
+      <w:pPr>
+        <w:ind w:left="540" w:hanging="300"/>
+      </w:pPr>
+    </w:lvl>
+  </w:abstractNum>
+  <w:abstractNum w:abstractNumId="18" w15:restartNumberingAfterBreak="0">
+    <w:multiLevelType w:val="hybridMultilevel"/>
+    <w:lvl w:ilvl="0" w:tentative="1">
+      <w:start w:val="1"/>
+      <w:numFmt w:val="decimal"/>
+      <w:lvlText w:val="%1."/>
+      <w:lvlJc w:val="left"/>
+      <w:pPr>
+        <w:ind w:left="540" w:hanging="300"/>
+      </w:pPr>
+    </w:lvl>
+  </w:abstractNum>
+  <w:abstractNum w:abstractNumId="19" w15:restartNumberingAfterBreak="0">
+    <w:multiLevelType w:val="hybridMultilevel"/>
+    <w:lvl w:ilvl="0" w:tentative="1">
+      <w:start w:val="1"/>
+      <w:numFmt w:val="decimal"/>
+      <w:lvlText w:val="%1."/>
+      <w:lvlJc w:val="left"/>
+      <w:pPr>
+        <w:ind w:left="540" w:hanging="300"/>
+      </w:pPr>
+    </w:lvl>
+  </w:abstractNum>
+  <w:abstractNum w:abstractNumId="20" w15:restartNumberingAfterBreak="0">
+    <w:multiLevelType w:val="hybridMultilevel"/>
+    <w:lvl w:ilvl="0" w:tentative="1">
+      <w:start w:val="1"/>
+      <w:numFmt w:val="decimal"/>
+      <w:lvlText w:val="%1."/>
+      <w:lvlJc w:val="left"/>
+      <w:pPr>
+        <w:ind w:left="540" w:hanging="300"/>
+      </w:pPr>
+    </w:lvl>
+  </w:abstractNum>
+  <w:abstractNum w:abstractNumId="21" w15:restartNumberingAfterBreak="0">
+    <w:multiLevelType w:val="hybridMultilevel"/>
+    <w:lvl w:ilvl="0" w:tentative="1">
+      <w:start w:val="1"/>
+      <w:numFmt w:val="decimal"/>
+      <w:lvlText w:val="%1."/>
+      <w:lvlJc w:val="left"/>
+      <w:pPr>
+        <w:ind w:left="540" w:hanging="300"/>
+      </w:pPr>
+    </w:lvl>
+  </w:abstractNum>
+  <w:abstractNum w:abstractNumId="22" w15:restartNumberingAfterBreak="0">
+    <w:multiLevelType w:val="hybridMultilevel"/>
+    <w:lvl w:ilvl="0" w:tentative="1">
+      <w:start w:val="1"/>
+      <w:numFmt w:val="decimal"/>
+      <w:lvlText w:val="%1."/>
+      <w:lvlJc w:val="left"/>
+      <w:pPr>
+        <w:ind w:left="540" w:hanging="300"/>
+      </w:pPr>
+    </w:lvl>
+  </w:abstractNum>
+  <w:abstractNum w:abstractNumId="23" w15:restartNumberingAfterBreak="0">
+    <w:multiLevelType w:val="hybridMultilevel"/>
+    <w:lvl w:ilvl="0" w:tentative="1">
+      <w:start w:val="1"/>
+      <w:numFmt w:val="decimal"/>
+      <w:lvlText w:val="%1."/>
+      <w:lvlJc w:val="left"/>
+      <w:pPr>
+        <w:ind w:left="540" w:hanging="300"/>
+      </w:pPr>
+    </w:lvl>
+  </w:abstractNum>
+  <w:abstractNum w:abstractNumId="24" w15:restartNumberingAfterBreak="0">
+    <w:multiLevelType w:val="hybridMultilevel"/>
+    <w:lvl w:ilvl="0" w:tentative="1">
+      <w:start w:val="1"/>
+      <w:numFmt w:val="decimal"/>
+      <w:lvlText w:val="%1."/>
+      <w:lvlJc w:val="left"/>
+      <w:pPr>
+        <w:ind w:left="540" w:hanging="300"/>
+      </w:pPr>
+    </w:lvl>
+  </w:abstractNum>
+  <w:abstractNum w:abstractNumId="25" w15:restartNumberingAfterBreak="0">
+    <w:multiLevelType w:val="hybridMultilevel"/>
+    <w:lvl w:ilvl="0" w:tentative="1">
+      <w:start w:val="1"/>
+      <w:numFmt w:val="decimal"/>
+      <w:lvlText w:val="%1."/>
+      <w:lvlJc w:val="left"/>
+      <w:pPr>
+        <w:ind w:left="540" w:hanging="300"/>
+      </w:pPr>
+    </w:lvl>
+  </w:abstractNum>
+  <w:abstractNum w:abstractNumId="26" w15:restartNumberingAfterBreak="0">
+    <w:multiLevelType w:val="hybridMultilevel"/>
+    <w:lvl w:ilvl="0" w:tentative="1">
+      <w:start w:val="1"/>
+      <w:numFmt w:val="decimal"/>
+      <w:lvlText w:val="%1."/>
+      <w:lvlJc w:val="left"/>
+      <w:pPr>
+        <w:ind w:left="540" w:hanging="300"/>
+      </w:pPr>
+    </w:lvl>
+  </w:abstractNum>
+  <w:abstractNum w:abstractNumId="27" w15:restartNumberingAfterBreak="0">
+    <w:multiLevelType w:val="hybridMultilevel"/>
+    <w:lvl w:ilvl="0" w:tentative="1">
+      <w:start w:val="1"/>
+      <w:numFmt w:val="decimal"/>
+      <w:lvlText w:val="%1."/>
+      <w:lvlJc w:val="left"/>
+      <w:pPr>
+        <w:ind w:left="540" w:hanging="300"/>
+      </w:pPr>
+    </w:lvl>
+  </w:abstractNum>
+  <w:abstractNum w:abstractNumId="28" w15:restartNumberingAfterBreak="0">
+    <w:multiLevelType w:val="hybridMultilevel"/>
+    <w:lvl w:ilvl="0" w:tentative="1">
+      <w:start w:val="1"/>
+      <w:numFmt w:val="decimal"/>
+      <w:lvlText w:val="%1."/>
+      <w:lvlJc w:val="left"/>
+      <w:pPr>
+        <w:ind w:left="540" w:hanging="300"/>
+      </w:pPr>
+    </w:lvl>
+  </w:abstractNum>
+  <w:abstractNum w:abstractNumId="29" w15:restartNumberingAfterBreak="0">
+    <w:multiLevelType w:val="hybridMultilevel"/>
+    <w:lvl w:ilvl="0" w:tentative="1">
+      <w:start w:val="1"/>
+      <w:numFmt w:val="decimal"/>
+      <w:lvlText w:val="%1."/>
+      <w:lvlJc w:val="left"/>
+      <w:pPr>
+        <w:ind w:left="540" w:hanging="300"/>
+      </w:pPr>
+    </w:lvl>
+  </w:abstractNum>
+  <w:abstractNum w:abstractNumId="30" w15:restartNumberingAfterBreak="0">
+    <w:multiLevelType w:val="hybridMultilevel"/>
+    <w:lvl w:ilvl="0" w:tentative="1">
+      <w:start w:val="1"/>
+      <w:numFmt w:val="decimal"/>
+      <w:lvlText w:val="%1."/>
+      <w:lvlJc w:val="left"/>
+      <w:pPr>
+        <w:ind w:left="540" w:hanging="300"/>
+      </w:pPr>
+    </w:lvl>
+  </w:abstractNum>
+  <w:abstractNum w:abstractNumId="31" w15:restartNumberingAfterBreak="0">
+    <w:multiLevelType w:val="hybridMultilevel"/>
+    <w:lvl w:ilvl="0" w:tentative="1">
+      <w:start w:val="1"/>
+      <w:numFmt w:val="decimal"/>
+      <w:lvlText w:val="%1."/>
+      <w:lvlJc w:val="left"/>
+      <w:pPr>
+        <w:ind w:left="540" w:hanging="300"/>
+      </w:pPr>
+    </w:lvl>
+  </w:abstractNum>
+  <w:abstractNum w:abstractNumId="32" w15:restartNumberingAfterBreak="0">
     <w:multiLevelType w:val="hybridMultilevel"/>
     <w:lvl w:ilvl="0" w:tentative="1">
       <w:start w:val="1"/>
@@ -11975,13 +13712,25 @@
     </w:lvlOverride>
   </w:num>
   <w:num w:numId="4">
+    <w:abstractNumId w:val="6"/>
+    <w:lvlOverride w:ilvl="0">
+      <w:startOverride w:val="1"/>
+    </w:lvlOverride>
+  </w:num>
+  <w:num w:numId="5">
     <w:abstractNumId w:val="4"/>
     <w:lvlOverride w:ilvl="0">
       <w:startOverride w:val="1"/>
     </w:lvlOverride>
   </w:num>
-  <w:num w:numId="5">
+  <w:num w:numId="6">
     <w:abstractNumId w:val="5"/>
+    <w:lvlOverride w:ilvl="0">
+      <w:startOverride w:val="1"/>
+    </w:lvlOverride>
+  </w:num>
+  <w:num w:numId="7">
+    <w:abstractNumId w:val="7"/>
     <w:lvlOverride w:ilvl="0">
       <w:startOverride w:val="1"/>
     </w:lvlOverride>

</xml_diff>